<commit_message>
Step 1: DynamoDB ve Kinesis Altyapısı Kuruldu - Mimari Tasarım Tamamlandı
</commit_message>
<xml_diff>
--- a/PROJE-2/23291207.docx
+++ b/PROJE-2/23291207.docx
@@ -32,7 +32,7 @@
     <w:p/>
     <w:p/>
     <w:p>
-      <w:hyperlink r:id="rId4" w:history="1">
+      <w:hyperlink r:id="rId5" w:history="1">
         <w:r>
           <w:rPr>
             <w:rStyle w:val="Kpr"/>
@@ -42,7 +42,7 @@
       </w:hyperlink>
     </w:p>
     <w:p>
-      <w:hyperlink r:id="rId5" w:history="1">
+      <w:hyperlink r:id="rId6" w:history="1">
         <w:r>
           <w:rPr>
             <w:rStyle w:val="Kpr"/>
@@ -52,50 +52,683 @@
       </w:hyperlink>
     </w:p>
     <w:p>
-      <w:proofErr w:type="gramStart"/>
-      <w:r>
-        <w:t>proje</w:t>
-      </w:r>
-      <w:proofErr w:type="gramEnd"/>
-      <w:r>
-        <w:t xml:space="preserve"> dosyalarının </w:t>
-      </w:r>
-      <w:proofErr w:type="spellStart"/>
-      <w:r>
-        <w:t>github</w:t>
-      </w:r>
-      <w:proofErr w:type="spellEnd"/>
-      <w:r>
-        <w:t xml:space="preserve"> ve </w:t>
-      </w:r>
-      <w:proofErr w:type="spellStart"/>
-      <w:r>
-        <w:t>drive</w:t>
-      </w:r>
-      <w:proofErr w:type="spellEnd"/>
-      <w:r>
-        <w:t xml:space="preserve"> linkleri</w:t>
-      </w:r>
-    </w:p>
-    <w:p/>
-    <w:p/>
-    <w:p/>
-    <w:p/>
-    <w:p/>
-    <w:p/>
-    <w:p/>
-    <w:p/>
-    <w:p/>
-    <w:p/>
-    <w:p/>
-    <w:p/>
-    <w:p/>
-    <w:p/>
-    <w:p/>
-    <w:p/>
-    <w:p/>
-    <w:p/>
-    <w:p/>
+      <w:r>
+        <w:t>proje dosyalarının github ve drive linkleri</w:t>
+      </w:r>
+    </w:p>
+    <w:p/>
+    <w:p/>
+    <w:p/>
+    <w:p/>
+    <w:p/>
+    <w:p/>
+    <w:p/>
+    <w:p/>
+    <w:p/>
+    <w:p/>
+    <w:p/>
+    <w:p/>
+    <w:p/>
+    <w:p/>
+    <w:p/>
+    <w:p/>
+    <w:p/>
+    <w:p/>
+    <w:p/>
+    <w:p>
+      <w:pPr>
+        <w:rPr>
+          <w:b/>
+          <w:bCs/>
+          <w:lang w:val="en-US"/>
+        </w:rPr>
+      </w:pPr>
+      <w:r>
+        <w:rPr>
+          <w:b/>
+          <w:bCs/>
+          <w:lang w:val="en-US"/>
+        </w:rPr>
+        <w:lastRenderedPageBreak/>
+        <w:t>Proje 2: Teknik Günlük - 1. Gün</w:t>
+      </w:r>
+    </w:p>
+    <w:p>
+      <w:pPr>
+        <w:rPr>
+          <w:b/>
+          <w:bCs/>
+          <w:lang w:val="en-US"/>
+        </w:rPr>
+      </w:pPr>
+      <w:r>
+        <w:rPr>
+          <w:b/>
+          <w:bCs/>
+          <w:lang w:val="en-US"/>
+        </w:rPr>
+        <w:t>1. AWS DynamoDB Tablo Tasarımı ve Anahtar Seçimi</w:t>
+      </w:r>
+    </w:p>
+    <w:p>
+      <w:pPr>
+        <w:rPr>
+          <w:lang w:val="en-US"/>
+        </w:rPr>
+      </w:pPr>
+      <w:r>
+        <w:rPr>
+          <w:lang w:val="en-US"/>
+        </w:rPr>
+        <w:t xml:space="preserve">Gerçek zamanlı veri akışı projesinde , verilerin kalıcı olarak depolanması ve analiz edilmesi amacıyla AWS DynamoDB servisi üzerinde </w:t>
+      </w:r>
+      <w:r>
+        <w:rPr>
+          <w:b/>
+          <w:bCs/>
+          <w:lang w:val="en-US"/>
+        </w:rPr>
+        <w:t>"HavaKalitesiVerileri"</w:t>
+      </w:r>
+      <w:r>
+        <w:rPr>
+          <w:lang w:val="en-US"/>
+        </w:rPr>
+        <w:t xml:space="preserve"> tablosu oluşturulmuştur. Tablo yapısı belirlenirken NoSQL prensipleri doğrultusunda şu anahtarlar seçilmiştir:</w:t>
+      </w:r>
+    </w:p>
+    <w:p>
+      <w:pPr>
+        <w:numPr>
+          <w:ilvl w:val="0"/>
+          <w:numId w:val="1"/>
+        </w:numPr>
+        <w:rPr>
+          <w:lang w:val="en-US"/>
+        </w:rPr>
+      </w:pPr>
+      <w:r>
+        <w:rPr>
+          <w:b/>
+          <w:bCs/>
+          <w:lang w:val="en-US"/>
+        </w:rPr>
+        <w:t>Partition Key (Bölüm Anahtarı) - sensor_id:</w:t>
+      </w:r>
+      <w:r>
+        <w:rPr>
+          <w:lang w:val="en-US"/>
+        </w:rPr>
+        <w:t xml:space="preserve"> Simüle edilen her bir IoT cihazının benzersiz bir kimliği olacağı için sensor_id bölüm anahtarı olarak belirlenmiştir. Bu sayede veritabanı, farklı sensörlerden gelen verileri farklı bölümlere dağıtarak yüksek performanslı erişim sağlar.</w:t>
+      </w:r>
+    </w:p>
+    <w:p>
+      <w:pPr>
+        <w:numPr>
+          <w:ilvl w:val="0"/>
+          <w:numId w:val="1"/>
+        </w:numPr>
+        <w:rPr>
+          <w:lang w:val="en-US"/>
+        </w:rPr>
+      </w:pPr>
+      <w:r>
+        <w:rPr>
+          <w:b/>
+          <w:bCs/>
+          <w:lang w:val="en-US"/>
+        </w:rPr>
+        <w:t>Sort Key (Sıralama Anahtarı) - timestamp:</w:t>
+      </w:r>
+      <w:r>
+        <w:rPr>
+          <w:lang w:val="en-US"/>
+        </w:rPr>
+        <w:t xml:space="preserve"> Gerçek zamanlı veri akışı zaman serisi (time-series) niteliği taşıdığından, verilerin kronolojik olarak sıralanması kritik önemdedir. timestamp anahtarı, belirli bir sensöre ait verilerin zaman bazlı analiz edilmesini ve sorgulanmasını (Örn: "Son 1 saatteki sıcaklık değişimi") mümkün kılar.</w:t>
+      </w:r>
+    </w:p>
+    <w:p>
+      <w:pPr>
+        <w:rPr>
+          <w:b/>
+          <w:bCs/>
+          <w:lang w:val="en-US"/>
+        </w:rPr>
+      </w:pPr>
+      <w:r>
+        <w:rPr>
+          <w:b/>
+          <w:bCs/>
+          <w:lang w:val="en-US"/>
+        </w:rPr>
+        <w:t>2. AWS Kinesis'in Sistemdeki Rolü: Veri Taşıyıcı ve Akış Yönetimi</w:t>
+      </w:r>
+    </w:p>
+    <w:p>
+      <w:pPr>
+        <w:rPr>
+          <w:lang w:val="en-US"/>
+        </w:rPr>
+      </w:pPr>
+      <w:r>
+        <w:rPr>
+          <w:lang w:val="en-US"/>
+        </w:rPr>
+        <w:t xml:space="preserve">Projenin "Gerçek Zamanlı Veri Akışı Yönetimi" katmanında </w:t>
+      </w:r>
+      <w:r>
+        <w:rPr>
+          <w:b/>
+          <w:bCs/>
+          <w:lang w:val="en-US"/>
+        </w:rPr>
+        <w:t>AWS Kinesis Data Streams</w:t>
+      </w:r>
+      <w:r>
+        <w:rPr>
+          <w:lang w:val="en-US"/>
+        </w:rPr>
+        <w:t xml:space="preserve"> tercih edilmiştir. Kinesis'in sistemdeki temel rolleri şunlardır:</w:t>
+      </w:r>
+    </w:p>
+    <w:p>
+      <w:pPr>
+        <w:numPr>
+          <w:ilvl w:val="0"/>
+          <w:numId w:val="2"/>
+        </w:numPr>
+        <w:rPr>
+          <w:lang w:val="en-US"/>
+        </w:rPr>
+      </w:pPr>
+      <w:r>
+        <w:rPr>
+          <w:b/>
+          <w:bCs/>
+          <w:lang w:val="en-US"/>
+        </w:rPr>
+        <w:t>Veri Toplama (Ingestion):</w:t>
+      </w:r>
+      <w:r>
+        <w:rPr>
+          <w:lang w:val="en-US"/>
+        </w:rPr>
+        <w:t xml:space="preserve"> IoT cihazlarından veya simülatörden gelen çok sayıdaki veriyi anlık olarak kabul eden bir "veri borusu" görevi görür.</w:t>
+      </w:r>
+    </w:p>
+    <w:p>
+      <w:pPr>
+        <w:numPr>
+          <w:ilvl w:val="0"/>
+          <w:numId w:val="2"/>
+        </w:numPr>
+        <w:rPr>
+          <w:lang w:val="en-US"/>
+        </w:rPr>
+      </w:pPr>
+      <w:r>
+        <w:rPr>
+          <w:b/>
+          <w:bCs/>
+          <w:lang w:val="en-US"/>
+        </w:rPr>
+        <w:t>Tamponlama ve Ölçeklenebilirlik:</w:t>
+      </w:r>
+      <w:r>
+        <w:rPr>
+          <w:lang w:val="en-US"/>
+        </w:rPr>
+        <w:t xml:space="preserve"> Veri üreten kaynak (Python simülatörü) ile veriyi işleyen kaynak (AWS Lambda) arasındaki hız farkını dengeler. Gelen verileri kaybetmeden Lambda'ya iletmek üzere sıraya koyar.</w:t>
+      </w:r>
+    </w:p>
+    <w:p>
+      <w:pPr>
+        <w:numPr>
+          <w:ilvl w:val="0"/>
+          <w:numId w:val="2"/>
+        </w:numPr>
+        <w:rPr>
+          <w:lang w:val="en-US"/>
+        </w:rPr>
+      </w:pPr>
+      <w:r>
+        <w:rPr>
+          <w:b/>
+          <w:bCs/>
+          <w:lang w:val="en-US"/>
+        </w:rPr>
+        <w:t>Kesintisiz Akış:</w:t>
+      </w:r>
+      <w:r>
+        <w:rPr>
+          <w:lang w:val="en-US"/>
+        </w:rPr>
+        <w:t xml:space="preserve"> Verilerin kaynaktan hedefe (veritabanına) ulaşana kadar akış halinde kalmasını sağlayarak gerçek zamanlı analizlerin önünü açar.</w:t>
+      </w:r>
+    </w:p>
+    <w:p>
+      <w:pPr>
+        <w:rPr>
+          <w:b/>
+          <w:bCs/>
+          <w:lang w:val="en-US"/>
+        </w:rPr>
+      </w:pPr>
+      <w:r>
+        <w:rPr>
+          <w:b/>
+          <w:bCs/>
+          <w:lang w:val="en-US"/>
+        </w:rPr>
+        <w:t>3. Gerçekleştirilen Kurulumlar</w:t>
+      </w:r>
+    </w:p>
+    <w:p>
+      <w:pPr>
+        <w:rPr>
+          <w:lang w:val="en-US"/>
+        </w:rPr>
+      </w:pPr>
+      <w:r>
+        <w:rPr>
+          <w:lang w:val="en-US"/>
+        </w:rPr>
+        <w:t>Bu aşamada AWS Yönetim Konsolu üzerinden aşağıdaki altyapılar kurulmuştur:</w:t>
+      </w:r>
+    </w:p>
+    <w:p>
+      <w:pPr>
+        <w:numPr>
+          <w:ilvl w:val="0"/>
+          <w:numId w:val="3"/>
+        </w:numPr>
+        <w:rPr>
+          <w:lang w:val="en-US"/>
+        </w:rPr>
+      </w:pPr>
+      <w:r>
+        <w:rPr>
+          <w:b/>
+          <w:bCs/>
+          <w:lang w:val="en-US"/>
+        </w:rPr>
+        <w:t>HavaKalitesiVerileri</w:t>
+      </w:r>
+      <w:r>
+        <w:rPr>
+          <w:lang w:val="en-US"/>
+        </w:rPr>
+        <w:t xml:space="preserve"> isimli DynamoDB tablosu sensor_id ve timestamp anahtarlarıyla hazır hale getirilmiştir.</w:t>
+      </w:r>
+    </w:p>
+    <w:p>
+      <w:pPr>
+        <w:numPr>
+          <w:ilvl w:val="0"/>
+          <w:numId w:val="3"/>
+        </w:numPr>
+        <w:rPr>
+          <w:lang w:val="en-US"/>
+        </w:rPr>
+      </w:pPr>
+      <w:r>
+        <w:rPr>
+          <w:b/>
+          <w:bCs/>
+          <w:lang w:val="en-US"/>
+        </w:rPr>
+        <w:t>HavaKalitesiAkisi</w:t>
+      </w:r>
+      <w:r>
+        <w:rPr>
+          <w:lang w:val="en-US"/>
+        </w:rPr>
+        <w:t xml:space="preserve"> isimli Kinesis Data Stream kanalı, isteğe bağlı (on-demand) kapasite moduyla oluşturulmuştur.</w:t>
+      </w:r>
+    </w:p>
+    <w:p>
+      <w:pPr>
+        <w:numPr>
+          <w:ilvl w:val="0"/>
+          <w:numId w:val="3"/>
+        </w:numPr>
+        <w:rPr>
+          <w:lang w:val="en-US"/>
+        </w:rPr>
+      </w:pPr>
+      <w:r>
+        <w:rPr>
+          <w:lang w:val="en-US"/>
+        </w:rPr>
+        <w:t xml:space="preserve">Sistemin birbirine bağlanabilmesi için gerekli olan </w:t>
+      </w:r>
+      <w:r>
+        <w:rPr>
+          <w:b/>
+          <w:bCs/>
+          <w:lang w:val="en-US"/>
+        </w:rPr>
+        <w:t>IAM Rolleri</w:t>
+      </w:r>
+      <w:r>
+        <w:rPr>
+          <w:lang w:val="en-US"/>
+        </w:rPr>
+        <w:t xml:space="preserve"> tanımlanmıştır.</w:t>
+      </w:r>
+    </w:p>
+    <w:p/>
+    <w:p/>
+    <w:p/>
+    <w:p/>
+    <w:p/>
+    <w:p/>
+    <w:p/>
+    <w:p/>
+    <w:p/>
+    <w:p/>
+    <w:p/>
+    <w:p/>
+    <w:p/>
+    <w:p/>
+    <w:p/>
+    <w:p/>
+    <w:p/>
+    <w:p/>
+    <w:p/>
+    <w:p/>
+    <w:p/>
+    <w:p/>
+    <w:p/>
+    <w:p/>
+    <w:p/>
+    <w:p/>
+    <w:p/>
+    <w:p/>
+    <w:p/>
+    <w:p/>
+    <w:p/>
+    <w:p>
+      <w:r>
+        <w:t>Resimler:</w:t>
+      </w:r>
+    </w:p>
+    <w:p>
+      <w:r>
+        <w:lastRenderedPageBreak/>
+        <w:drawing>
+          <wp:inline distT="0" distB="0" distL="0" distR="0" wp14:anchorId="12753D02" wp14:editId="166DF29F">
+            <wp:extent cx="5760720" cy="2893695"/>
+            <wp:effectExtent l="0" t="0" r="0" b="1905"/>
+            <wp:docPr id="319069268" name="Resim 1" descr="metin, ekran görüntüsü, yazılım, bilgisayar simgesi içeren bir resim&#10;&#10;Yapay zeka tarafından oluşturulmuş içerik yanlış olabilir."/>
+            <wp:cNvGraphicFramePr>
+              <a:graphicFrameLocks xmlns:a="http://schemas.openxmlformats.org/drawingml/2006/main" noChangeAspect="1"/>
+            </wp:cNvGraphicFramePr>
+            <a:graphic xmlns:a="http://schemas.openxmlformats.org/drawingml/2006/main">
+              <a:graphicData uri="http://schemas.openxmlformats.org/drawingml/2006/picture">
+                <pic:pic xmlns:pic="http://schemas.openxmlformats.org/drawingml/2006/picture">
+                  <pic:nvPicPr>
+                    <pic:cNvPr id="319069268" name="Resim 1" descr="metin, ekran görüntüsü, yazılım, bilgisayar simgesi içeren bir resim&#10;&#10;Yapay zeka tarafından oluşturulmuş içerik yanlış olabilir."/>
+                    <pic:cNvPicPr/>
+                  </pic:nvPicPr>
+                  <pic:blipFill>
+                    <a:blip r:embed="rId7"/>
+                    <a:stretch>
+                      <a:fillRect/>
+                    </a:stretch>
+                  </pic:blipFill>
+                  <pic:spPr>
+                    <a:xfrm>
+                      <a:off x="0" y="0"/>
+                      <a:ext cx="5760720" cy="2893695"/>
+                    </a:xfrm>
+                    <a:prstGeom prst="rect">
+                      <a:avLst/>
+                    </a:prstGeom>
+                  </pic:spPr>
+                </pic:pic>
+              </a:graphicData>
+            </a:graphic>
+          </wp:inline>
+        </w:drawing>
+      </w:r>
+    </w:p>
+    <w:p>
+      <w:r>
+        <w:drawing>
+          <wp:inline distT="0" distB="0" distL="0" distR="0" wp14:anchorId="796FA435" wp14:editId="1618304D">
+            <wp:extent cx="5760720" cy="1777365"/>
+            <wp:effectExtent l="0" t="0" r="0" b="0"/>
+            <wp:docPr id="81671239" name="Resim 1" descr="ekran görüntüsü, metin, yazılım, bilgisayar simgesi içeren bir resim&#10;&#10;Yapay zeka tarafından oluşturulmuş içerik yanlış olabilir."/>
+            <wp:cNvGraphicFramePr>
+              <a:graphicFrameLocks xmlns:a="http://schemas.openxmlformats.org/drawingml/2006/main" noChangeAspect="1"/>
+            </wp:cNvGraphicFramePr>
+            <a:graphic xmlns:a="http://schemas.openxmlformats.org/drawingml/2006/main">
+              <a:graphicData uri="http://schemas.openxmlformats.org/drawingml/2006/picture">
+                <pic:pic xmlns:pic="http://schemas.openxmlformats.org/drawingml/2006/picture">
+                  <pic:nvPicPr>
+                    <pic:cNvPr id="81671239" name="Resim 1" descr="ekran görüntüsü, metin, yazılım, bilgisayar simgesi içeren bir resim&#10;&#10;Yapay zeka tarafından oluşturulmuş içerik yanlış olabilir."/>
+                    <pic:cNvPicPr/>
+                  </pic:nvPicPr>
+                  <pic:blipFill>
+                    <a:blip r:embed="rId8"/>
+                    <a:stretch>
+                      <a:fillRect/>
+                    </a:stretch>
+                  </pic:blipFill>
+                  <pic:spPr>
+                    <a:xfrm>
+                      <a:off x="0" y="0"/>
+                      <a:ext cx="5760720" cy="1777365"/>
+                    </a:xfrm>
+                    <a:prstGeom prst="rect">
+                      <a:avLst/>
+                    </a:prstGeom>
+                  </pic:spPr>
+                </pic:pic>
+              </a:graphicData>
+            </a:graphic>
+          </wp:inline>
+        </w:drawing>
+      </w:r>
+    </w:p>
+    <w:p>
+      <w:r>
+        <w:drawing>
+          <wp:inline distT="0" distB="0" distL="0" distR="0" wp14:anchorId="2AECDCE2" wp14:editId="6E709E95">
+            <wp:extent cx="5760720" cy="2773680"/>
+            <wp:effectExtent l="0" t="0" r="0" b="7620"/>
+            <wp:docPr id="466706068" name="Resim 1" descr="metin, ekran görüntüsü, yazılım, bilgisayar simgesi içeren bir resim&#10;&#10;Yapay zeka tarafından oluşturulmuş içerik yanlış olabilir."/>
+            <wp:cNvGraphicFramePr>
+              <a:graphicFrameLocks xmlns:a="http://schemas.openxmlformats.org/drawingml/2006/main" noChangeAspect="1"/>
+            </wp:cNvGraphicFramePr>
+            <a:graphic xmlns:a="http://schemas.openxmlformats.org/drawingml/2006/main">
+              <a:graphicData uri="http://schemas.openxmlformats.org/drawingml/2006/picture">
+                <pic:pic xmlns:pic="http://schemas.openxmlformats.org/drawingml/2006/picture">
+                  <pic:nvPicPr>
+                    <pic:cNvPr id="466706068" name="Resim 1" descr="metin, ekran görüntüsü, yazılım, bilgisayar simgesi içeren bir resim&#10;&#10;Yapay zeka tarafından oluşturulmuş içerik yanlış olabilir."/>
+                    <pic:cNvPicPr/>
+                  </pic:nvPicPr>
+                  <pic:blipFill>
+                    <a:blip r:embed="rId9"/>
+                    <a:stretch>
+                      <a:fillRect/>
+                    </a:stretch>
+                  </pic:blipFill>
+                  <pic:spPr>
+                    <a:xfrm>
+                      <a:off x="0" y="0"/>
+                      <a:ext cx="5760720" cy="2773680"/>
+                    </a:xfrm>
+                    <a:prstGeom prst="rect">
+                      <a:avLst/>
+                    </a:prstGeom>
+                  </pic:spPr>
+                </pic:pic>
+              </a:graphicData>
+            </a:graphic>
+          </wp:inline>
+        </w:drawing>
+      </w:r>
+    </w:p>
+    <w:p>
+      <w:r>
+        <w:lastRenderedPageBreak/>
+        <w:drawing>
+          <wp:inline distT="0" distB="0" distL="0" distR="0" wp14:anchorId="713792BC" wp14:editId="609EA225">
+            <wp:extent cx="5760720" cy="2776855"/>
+            <wp:effectExtent l="0" t="0" r="0" b="4445"/>
+            <wp:docPr id="1716677395" name="Resim 1" descr="metin, ekran görüntüsü, yazılım, bilgisayar simgesi içeren bir resim&#10;&#10;Yapay zeka tarafından oluşturulmuş içerik yanlış olabilir."/>
+            <wp:cNvGraphicFramePr>
+              <a:graphicFrameLocks xmlns:a="http://schemas.openxmlformats.org/drawingml/2006/main" noChangeAspect="1"/>
+            </wp:cNvGraphicFramePr>
+            <a:graphic xmlns:a="http://schemas.openxmlformats.org/drawingml/2006/main">
+              <a:graphicData uri="http://schemas.openxmlformats.org/drawingml/2006/picture">
+                <pic:pic xmlns:pic="http://schemas.openxmlformats.org/drawingml/2006/picture">
+                  <pic:nvPicPr>
+                    <pic:cNvPr id="1716677395" name="Resim 1" descr="metin, ekran görüntüsü, yazılım, bilgisayar simgesi içeren bir resim&#10;&#10;Yapay zeka tarafından oluşturulmuş içerik yanlış olabilir."/>
+                    <pic:cNvPicPr/>
+                  </pic:nvPicPr>
+                  <pic:blipFill>
+                    <a:blip r:embed="rId10"/>
+                    <a:stretch>
+                      <a:fillRect/>
+                    </a:stretch>
+                  </pic:blipFill>
+                  <pic:spPr>
+                    <a:xfrm>
+                      <a:off x="0" y="0"/>
+                      <a:ext cx="5760720" cy="2776855"/>
+                    </a:xfrm>
+                    <a:prstGeom prst="rect">
+                      <a:avLst/>
+                    </a:prstGeom>
+                  </pic:spPr>
+                </pic:pic>
+              </a:graphicData>
+            </a:graphic>
+          </wp:inline>
+        </w:drawing>
+      </w:r>
+    </w:p>
+    <w:p>
+      <w:r>
+        <w:drawing>
+          <wp:inline distT="0" distB="0" distL="0" distR="0" wp14:anchorId="2DAA0CEE" wp14:editId="7D6C8BDB">
+            <wp:extent cx="5760720" cy="2821940"/>
+            <wp:effectExtent l="0" t="0" r="0" b="0"/>
+            <wp:docPr id="1246200892" name="Resim 1" descr="metin, ekran görüntüsü, yazılım, bilgisayar simgesi içeren bir resim&#10;&#10;Yapay zeka tarafından oluşturulmuş içerik yanlış olabilir."/>
+            <wp:cNvGraphicFramePr>
+              <a:graphicFrameLocks xmlns:a="http://schemas.openxmlformats.org/drawingml/2006/main" noChangeAspect="1"/>
+            </wp:cNvGraphicFramePr>
+            <a:graphic xmlns:a="http://schemas.openxmlformats.org/drawingml/2006/main">
+              <a:graphicData uri="http://schemas.openxmlformats.org/drawingml/2006/picture">
+                <pic:pic xmlns:pic="http://schemas.openxmlformats.org/drawingml/2006/picture">
+                  <pic:nvPicPr>
+                    <pic:cNvPr id="1246200892" name="Resim 1" descr="metin, ekran görüntüsü, yazılım, bilgisayar simgesi içeren bir resim&#10;&#10;Yapay zeka tarafından oluşturulmuş içerik yanlış olabilir."/>
+                    <pic:cNvPicPr/>
+                  </pic:nvPicPr>
+                  <pic:blipFill>
+                    <a:blip r:embed="rId11"/>
+                    <a:stretch>
+                      <a:fillRect/>
+                    </a:stretch>
+                  </pic:blipFill>
+                  <pic:spPr>
+                    <a:xfrm>
+                      <a:off x="0" y="0"/>
+                      <a:ext cx="5760720" cy="2821940"/>
+                    </a:xfrm>
+                    <a:prstGeom prst="rect">
+                      <a:avLst/>
+                    </a:prstGeom>
+                  </pic:spPr>
+                </pic:pic>
+              </a:graphicData>
+            </a:graphic>
+          </wp:inline>
+        </w:drawing>
+      </w:r>
+    </w:p>
+    <w:p>
+      <w:r>
+        <w:drawing>
+          <wp:inline distT="0" distB="0" distL="0" distR="0" wp14:anchorId="5A98FEA6" wp14:editId="1DF2D6C1">
+            <wp:extent cx="5760720" cy="2788920"/>
+            <wp:effectExtent l="0" t="0" r="0" b="0"/>
+            <wp:docPr id="1499189444" name="Resim 1" descr="metin, yazılım, bilgisayar simgesi, işletim sistemi içeren bir resim&#10;&#10;Yapay zeka tarafından oluşturulmuş içerik yanlış olabilir."/>
+            <wp:cNvGraphicFramePr>
+              <a:graphicFrameLocks xmlns:a="http://schemas.openxmlformats.org/drawingml/2006/main" noChangeAspect="1"/>
+            </wp:cNvGraphicFramePr>
+            <a:graphic xmlns:a="http://schemas.openxmlformats.org/drawingml/2006/main">
+              <a:graphicData uri="http://schemas.openxmlformats.org/drawingml/2006/picture">
+                <pic:pic xmlns:pic="http://schemas.openxmlformats.org/drawingml/2006/picture">
+                  <pic:nvPicPr>
+                    <pic:cNvPr id="1499189444" name="Resim 1" descr="metin, yazılım, bilgisayar simgesi, işletim sistemi içeren bir resim&#10;&#10;Yapay zeka tarafından oluşturulmuş içerik yanlış olabilir."/>
+                    <pic:cNvPicPr/>
+                  </pic:nvPicPr>
+                  <pic:blipFill>
+                    <a:blip r:embed="rId12"/>
+                    <a:stretch>
+                      <a:fillRect/>
+                    </a:stretch>
+                  </pic:blipFill>
+                  <pic:spPr>
+                    <a:xfrm>
+                      <a:off x="0" y="0"/>
+                      <a:ext cx="5760720" cy="2788920"/>
+                    </a:xfrm>
+                    <a:prstGeom prst="rect">
+                      <a:avLst/>
+                    </a:prstGeom>
+                  </pic:spPr>
+                </pic:pic>
+              </a:graphicData>
+            </a:graphic>
+          </wp:inline>
+        </w:drawing>
+      </w:r>
+    </w:p>
+    <w:p>
+      <w:r>
+        <w:lastRenderedPageBreak/>
+        <w:drawing>
+          <wp:inline distT="0" distB="0" distL="0" distR="0" wp14:anchorId="419B497D" wp14:editId="2E18CE1F">
+            <wp:extent cx="5760720" cy="2626360"/>
+            <wp:effectExtent l="0" t="0" r="0" b="2540"/>
+            <wp:docPr id="1236784790" name="Resim 1" descr="metin, ekran görüntüsü, yazılım, bilgisayar simgesi içeren bir resim&#10;&#10;Yapay zeka tarafından oluşturulmuş içerik yanlış olabilir."/>
+            <wp:cNvGraphicFramePr>
+              <a:graphicFrameLocks xmlns:a="http://schemas.openxmlformats.org/drawingml/2006/main" noChangeAspect="1"/>
+            </wp:cNvGraphicFramePr>
+            <a:graphic xmlns:a="http://schemas.openxmlformats.org/drawingml/2006/main">
+              <a:graphicData uri="http://schemas.openxmlformats.org/drawingml/2006/picture">
+                <pic:pic xmlns:pic="http://schemas.openxmlformats.org/drawingml/2006/picture">
+                  <pic:nvPicPr>
+                    <pic:cNvPr id="1236784790" name="Resim 1" descr="metin, ekran görüntüsü, yazılım, bilgisayar simgesi içeren bir resim&#10;&#10;Yapay zeka tarafından oluşturulmuş içerik yanlış olabilir."/>
+                    <pic:cNvPicPr/>
+                  </pic:nvPicPr>
+                  <pic:blipFill>
+                    <a:blip r:embed="rId13"/>
+                    <a:stretch>
+                      <a:fillRect/>
+                    </a:stretch>
+                  </pic:blipFill>
+                  <pic:spPr>
+                    <a:xfrm>
+                      <a:off x="0" y="0"/>
+                      <a:ext cx="5760720" cy="2626360"/>
+                    </a:xfrm>
+                    <a:prstGeom prst="rect">
+                      <a:avLst/>
+                    </a:prstGeom>
+                  </pic:spPr>
+                </pic:pic>
+              </a:graphicData>
+            </a:graphic>
+          </wp:inline>
+        </w:drawing>
+      </w:r>
+    </w:p>
     <w:p/>
     <w:sectPr>
       <w:pgSz w:w="11906" w:h="16838"/>
@@ -105,6 +738,431 @@
     </w:sectPr>
   </w:body>
 </w:document>
+</file>
+
+<file path=word/numbering.xml><?xml version="1.0" encoding="utf-8"?>
+<w:numbering xmlns:wpc="http://schemas.microsoft.com/office/word/2010/wordprocessingCanvas" xmlns:cx="http://schemas.microsoft.com/office/drawing/2014/chartex" xmlns:cx1="http://schemas.microsoft.com/office/drawing/2015/9/8/chartex" xmlns:cx2="http://schemas.microsoft.com/office/drawing/2015/10/21/chartex" xmlns:cx3="http://schemas.microsoft.com/office/drawing/2016/5/9/chartex" xmlns:cx4="http://schemas.microsoft.com/office/drawing/2016/5/10/chartex" xmlns:cx5="http://schemas.microsoft.com/office/drawing/2016/5/11/chartex" xmlns:cx6="http://schemas.microsoft.com/office/drawing/2016/5/12/chartex" xmlns:cx7="http://schemas.microsoft.com/office/drawing/2016/5/13/chartex" xmlns:cx8="http://schemas.microsoft.com/office/drawing/2016/5/14/chartex" xmlns:mc="http://schemas.openxmlformats.org/markup-compatibility/2006" xmlns:aink="http://schemas.microsoft.com/office/drawing/2016/ink" xmlns:am3d="http://schemas.microsoft.com/office/drawing/2017/model3d" xmlns:o="urn:schemas-microsoft-com:office:office" xmlns:oel="http://schemas.microsoft.com/office/2019/extlst" xmlns:r="http://schemas.openxmlformats.org/officeDocument/2006/relationships" xmlns:m="http://schemas.openxmlformats.org/officeDocument/2006/math" xmlns:v="urn:schemas-microsoft-com:vml" xmlns:wp14="http://schemas.microsoft.com/office/word/2010/wordprocessingDrawing" xmlns:wp="http://schemas.openxmlformats.org/drawingml/2006/wordprocessingDrawing" xmlns:w10="urn:schemas-microsoft-com:office:word" xmlns:w="http://schemas.openxmlformats.org/wordprocessingml/2006/main" xmlns:w14="http://schemas.microsoft.com/office/word/2010/wordml" xmlns:w15="http://schemas.microsoft.com/office/word/2012/wordml" xmlns:w16cex="http://schemas.microsoft.com/office/word/2018/wordml/cex" xmlns:w16cid="http://schemas.microsoft.com/office/word/2016/wordml/cid" xmlns:w16="http://schemas.microsoft.com/office/word/2018/wordml" xmlns:w16du="http://schemas.microsoft.com/office/word/2023/wordml/word16du" xmlns:w16sdtdh="http://schemas.microsoft.com/office/word/2020/wordml/sdtdatahash" xmlns:w16sdtfl="http://schemas.microsoft.com/office/word/2024/wordml/sdtformatlock" xmlns:w16se="http://schemas.microsoft.com/office/word/2015/wordml/symex" xmlns:wpg="http://schemas.microsoft.com/office/word/2010/wordprocessingGroup" xmlns:wpi="http://schemas.microsoft.com/office/word/2010/wordprocessingInk" xmlns:wne="http://schemas.microsoft.com/office/word/2006/wordml" xmlns:wps="http://schemas.microsoft.com/office/word/2010/wordprocessingShape" mc:Ignorable="w14 w15 w16se w16cid w16 w16cex w16sdtdh w16sdtfl w16du wp14">
+  <w:abstractNum w:abstractNumId="0" w15:restartNumberingAfterBreak="0">
+    <w:nsid w:val="46FE52E8"/>
+    <w:multiLevelType w:val="multilevel"/>
+    <w:tmpl w:val="C04486B8"/>
+    <w:lvl w:ilvl="0">
+      <w:start w:val="1"/>
+      <w:numFmt w:val="bullet"/>
+      <w:lvlText w:val=""/>
+      <w:lvlJc w:val="left"/>
+      <w:pPr>
+        <w:tabs>
+          <w:tab w:val="num" w:pos="720"/>
+        </w:tabs>
+        <w:ind w:left="720" w:hanging="360"/>
+      </w:pPr>
+      <w:rPr>
+        <w:rFonts w:ascii="Symbol" w:hAnsi="Symbol" w:hint="default"/>
+        <w:sz w:val="20"/>
+      </w:rPr>
+    </w:lvl>
+    <w:lvl w:ilvl="1" w:tentative="1">
+      <w:start w:val="1"/>
+      <w:numFmt w:val="bullet"/>
+      <w:lvlText w:val="o"/>
+      <w:lvlJc w:val="left"/>
+      <w:pPr>
+        <w:tabs>
+          <w:tab w:val="num" w:pos="1440"/>
+        </w:tabs>
+        <w:ind w:left="1440" w:hanging="360"/>
+      </w:pPr>
+      <w:rPr>
+        <w:rFonts w:ascii="Courier New" w:hAnsi="Courier New" w:hint="default"/>
+        <w:sz w:val="20"/>
+      </w:rPr>
+    </w:lvl>
+    <w:lvl w:ilvl="2" w:tentative="1">
+      <w:start w:val="1"/>
+      <w:numFmt w:val="bullet"/>
+      <w:lvlText w:val=""/>
+      <w:lvlJc w:val="left"/>
+      <w:pPr>
+        <w:tabs>
+          <w:tab w:val="num" w:pos="2160"/>
+        </w:tabs>
+        <w:ind w:left="2160" w:hanging="360"/>
+      </w:pPr>
+      <w:rPr>
+        <w:rFonts w:ascii="Wingdings" w:hAnsi="Wingdings" w:hint="default"/>
+        <w:sz w:val="20"/>
+      </w:rPr>
+    </w:lvl>
+    <w:lvl w:ilvl="3" w:tentative="1">
+      <w:start w:val="1"/>
+      <w:numFmt w:val="bullet"/>
+      <w:lvlText w:val=""/>
+      <w:lvlJc w:val="left"/>
+      <w:pPr>
+        <w:tabs>
+          <w:tab w:val="num" w:pos="2880"/>
+        </w:tabs>
+        <w:ind w:left="2880" w:hanging="360"/>
+      </w:pPr>
+      <w:rPr>
+        <w:rFonts w:ascii="Wingdings" w:hAnsi="Wingdings" w:hint="default"/>
+        <w:sz w:val="20"/>
+      </w:rPr>
+    </w:lvl>
+    <w:lvl w:ilvl="4" w:tentative="1">
+      <w:start w:val="1"/>
+      <w:numFmt w:val="bullet"/>
+      <w:lvlText w:val=""/>
+      <w:lvlJc w:val="left"/>
+      <w:pPr>
+        <w:tabs>
+          <w:tab w:val="num" w:pos="3600"/>
+        </w:tabs>
+        <w:ind w:left="3600" w:hanging="360"/>
+      </w:pPr>
+      <w:rPr>
+        <w:rFonts w:ascii="Wingdings" w:hAnsi="Wingdings" w:hint="default"/>
+        <w:sz w:val="20"/>
+      </w:rPr>
+    </w:lvl>
+    <w:lvl w:ilvl="5" w:tentative="1">
+      <w:start w:val="1"/>
+      <w:numFmt w:val="bullet"/>
+      <w:lvlText w:val=""/>
+      <w:lvlJc w:val="left"/>
+      <w:pPr>
+        <w:tabs>
+          <w:tab w:val="num" w:pos="4320"/>
+        </w:tabs>
+        <w:ind w:left="4320" w:hanging="360"/>
+      </w:pPr>
+      <w:rPr>
+        <w:rFonts w:ascii="Wingdings" w:hAnsi="Wingdings" w:hint="default"/>
+        <w:sz w:val="20"/>
+      </w:rPr>
+    </w:lvl>
+    <w:lvl w:ilvl="6" w:tentative="1">
+      <w:start w:val="1"/>
+      <w:numFmt w:val="bullet"/>
+      <w:lvlText w:val=""/>
+      <w:lvlJc w:val="left"/>
+      <w:pPr>
+        <w:tabs>
+          <w:tab w:val="num" w:pos="5040"/>
+        </w:tabs>
+        <w:ind w:left="5040" w:hanging="360"/>
+      </w:pPr>
+      <w:rPr>
+        <w:rFonts w:ascii="Wingdings" w:hAnsi="Wingdings" w:hint="default"/>
+        <w:sz w:val="20"/>
+      </w:rPr>
+    </w:lvl>
+    <w:lvl w:ilvl="7" w:tentative="1">
+      <w:start w:val="1"/>
+      <w:numFmt w:val="bullet"/>
+      <w:lvlText w:val=""/>
+      <w:lvlJc w:val="left"/>
+      <w:pPr>
+        <w:tabs>
+          <w:tab w:val="num" w:pos="5760"/>
+        </w:tabs>
+        <w:ind w:left="5760" w:hanging="360"/>
+      </w:pPr>
+      <w:rPr>
+        <w:rFonts w:ascii="Wingdings" w:hAnsi="Wingdings" w:hint="default"/>
+        <w:sz w:val="20"/>
+      </w:rPr>
+    </w:lvl>
+    <w:lvl w:ilvl="8" w:tentative="1">
+      <w:start w:val="1"/>
+      <w:numFmt w:val="bullet"/>
+      <w:lvlText w:val=""/>
+      <w:lvlJc w:val="left"/>
+      <w:pPr>
+        <w:tabs>
+          <w:tab w:val="num" w:pos="6480"/>
+        </w:tabs>
+        <w:ind w:left="6480" w:hanging="360"/>
+      </w:pPr>
+      <w:rPr>
+        <w:rFonts w:ascii="Wingdings" w:hAnsi="Wingdings" w:hint="default"/>
+        <w:sz w:val="20"/>
+      </w:rPr>
+    </w:lvl>
+  </w:abstractNum>
+  <w:abstractNum w:abstractNumId="1" w15:restartNumberingAfterBreak="0">
+    <w:nsid w:val="4A9F0AF8"/>
+    <w:multiLevelType w:val="multilevel"/>
+    <w:tmpl w:val="04A0C2B2"/>
+    <w:lvl w:ilvl="0">
+      <w:start w:val="1"/>
+      <w:numFmt w:val="decimal"/>
+      <w:lvlText w:val="%1."/>
+      <w:lvlJc w:val="left"/>
+      <w:pPr>
+        <w:tabs>
+          <w:tab w:val="num" w:pos="720"/>
+        </w:tabs>
+        <w:ind w:left="720" w:hanging="360"/>
+      </w:pPr>
+    </w:lvl>
+    <w:lvl w:ilvl="1" w:tentative="1">
+      <w:start w:val="1"/>
+      <w:numFmt w:val="decimal"/>
+      <w:lvlText w:val="%2."/>
+      <w:lvlJc w:val="left"/>
+      <w:pPr>
+        <w:tabs>
+          <w:tab w:val="num" w:pos="1440"/>
+        </w:tabs>
+        <w:ind w:left="1440" w:hanging="360"/>
+      </w:pPr>
+    </w:lvl>
+    <w:lvl w:ilvl="2" w:tentative="1">
+      <w:start w:val="1"/>
+      <w:numFmt w:val="decimal"/>
+      <w:lvlText w:val="%3."/>
+      <w:lvlJc w:val="left"/>
+      <w:pPr>
+        <w:tabs>
+          <w:tab w:val="num" w:pos="2160"/>
+        </w:tabs>
+        <w:ind w:left="2160" w:hanging="360"/>
+      </w:pPr>
+    </w:lvl>
+    <w:lvl w:ilvl="3" w:tentative="1">
+      <w:start w:val="1"/>
+      <w:numFmt w:val="decimal"/>
+      <w:lvlText w:val="%4."/>
+      <w:lvlJc w:val="left"/>
+      <w:pPr>
+        <w:tabs>
+          <w:tab w:val="num" w:pos="2880"/>
+        </w:tabs>
+        <w:ind w:left="2880" w:hanging="360"/>
+      </w:pPr>
+    </w:lvl>
+    <w:lvl w:ilvl="4" w:tentative="1">
+      <w:start w:val="1"/>
+      <w:numFmt w:val="decimal"/>
+      <w:lvlText w:val="%5."/>
+      <w:lvlJc w:val="left"/>
+      <w:pPr>
+        <w:tabs>
+          <w:tab w:val="num" w:pos="3600"/>
+        </w:tabs>
+        <w:ind w:left="3600" w:hanging="360"/>
+      </w:pPr>
+    </w:lvl>
+    <w:lvl w:ilvl="5" w:tentative="1">
+      <w:start w:val="1"/>
+      <w:numFmt w:val="decimal"/>
+      <w:lvlText w:val="%6."/>
+      <w:lvlJc w:val="left"/>
+      <w:pPr>
+        <w:tabs>
+          <w:tab w:val="num" w:pos="4320"/>
+        </w:tabs>
+        <w:ind w:left="4320" w:hanging="360"/>
+      </w:pPr>
+    </w:lvl>
+    <w:lvl w:ilvl="6" w:tentative="1">
+      <w:start w:val="1"/>
+      <w:numFmt w:val="decimal"/>
+      <w:lvlText w:val="%7."/>
+      <w:lvlJc w:val="left"/>
+      <w:pPr>
+        <w:tabs>
+          <w:tab w:val="num" w:pos="5040"/>
+        </w:tabs>
+        <w:ind w:left="5040" w:hanging="360"/>
+      </w:pPr>
+    </w:lvl>
+    <w:lvl w:ilvl="7" w:tentative="1">
+      <w:start w:val="1"/>
+      <w:numFmt w:val="decimal"/>
+      <w:lvlText w:val="%8."/>
+      <w:lvlJc w:val="left"/>
+      <w:pPr>
+        <w:tabs>
+          <w:tab w:val="num" w:pos="5760"/>
+        </w:tabs>
+        <w:ind w:left="5760" w:hanging="360"/>
+      </w:pPr>
+    </w:lvl>
+    <w:lvl w:ilvl="8" w:tentative="1">
+      <w:start w:val="1"/>
+      <w:numFmt w:val="decimal"/>
+      <w:lvlText w:val="%9."/>
+      <w:lvlJc w:val="left"/>
+      <w:pPr>
+        <w:tabs>
+          <w:tab w:val="num" w:pos="6480"/>
+        </w:tabs>
+        <w:ind w:left="6480" w:hanging="360"/>
+      </w:pPr>
+    </w:lvl>
+  </w:abstractNum>
+  <w:abstractNum w:abstractNumId="2" w15:restartNumberingAfterBreak="0">
+    <w:nsid w:val="55043113"/>
+    <w:multiLevelType w:val="multilevel"/>
+    <w:tmpl w:val="E7E25EA0"/>
+    <w:lvl w:ilvl="0">
+      <w:start w:val="1"/>
+      <w:numFmt w:val="bullet"/>
+      <w:lvlText w:val=""/>
+      <w:lvlJc w:val="left"/>
+      <w:pPr>
+        <w:tabs>
+          <w:tab w:val="num" w:pos="720"/>
+        </w:tabs>
+        <w:ind w:left="720" w:hanging="360"/>
+      </w:pPr>
+      <w:rPr>
+        <w:rFonts w:ascii="Symbol" w:hAnsi="Symbol" w:hint="default"/>
+        <w:sz w:val="20"/>
+      </w:rPr>
+    </w:lvl>
+    <w:lvl w:ilvl="1" w:tentative="1">
+      <w:start w:val="1"/>
+      <w:numFmt w:val="bullet"/>
+      <w:lvlText w:val="o"/>
+      <w:lvlJc w:val="left"/>
+      <w:pPr>
+        <w:tabs>
+          <w:tab w:val="num" w:pos="1440"/>
+        </w:tabs>
+        <w:ind w:left="1440" w:hanging="360"/>
+      </w:pPr>
+      <w:rPr>
+        <w:rFonts w:ascii="Courier New" w:hAnsi="Courier New" w:hint="default"/>
+        <w:sz w:val="20"/>
+      </w:rPr>
+    </w:lvl>
+    <w:lvl w:ilvl="2" w:tentative="1">
+      <w:start w:val="1"/>
+      <w:numFmt w:val="bullet"/>
+      <w:lvlText w:val=""/>
+      <w:lvlJc w:val="left"/>
+      <w:pPr>
+        <w:tabs>
+          <w:tab w:val="num" w:pos="2160"/>
+        </w:tabs>
+        <w:ind w:left="2160" w:hanging="360"/>
+      </w:pPr>
+      <w:rPr>
+        <w:rFonts w:ascii="Wingdings" w:hAnsi="Wingdings" w:hint="default"/>
+        <w:sz w:val="20"/>
+      </w:rPr>
+    </w:lvl>
+    <w:lvl w:ilvl="3" w:tentative="1">
+      <w:start w:val="1"/>
+      <w:numFmt w:val="bullet"/>
+      <w:lvlText w:val=""/>
+      <w:lvlJc w:val="left"/>
+      <w:pPr>
+        <w:tabs>
+          <w:tab w:val="num" w:pos="2880"/>
+        </w:tabs>
+        <w:ind w:left="2880" w:hanging="360"/>
+      </w:pPr>
+      <w:rPr>
+        <w:rFonts w:ascii="Wingdings" w:hAnsi="Wingdings" w:hint="default"/>
+        <w:sz w:val="20"/>
+      </w:rPr>
+    </w:lvl>
+    <w:lvl w:ilvl="4" w:tentative="1">
+      <w:start w:val="1"/>
+      <w:numFmt w:val="bullet"/>
+      <w:lvlText w:val=""/>
+      <w:lvlJc w:val="left"/>
+      <w:pPr>
+        <w:tabs>
+          <w:tab w:val="num" w:pos="3600"/>
+        </w:tabs>
+        <w:ind w:left="3600" w:hanging="360"/>
+      </w:pPr>
+      <w:rPr>
+        <w:rFonts w:ascii="Wingdings" w:hAnsi="Wingdings" w:hint="default"/>
+        <w:sz w:val="20"/>
+      </w:rPr>
+    </w:lvl>
+    <w:lvl w:ilvl="5" w:tentative="1">
+      <w:start w:val="1"/>
+      <w:numFmt w:val="bullet"/>
+      <w:lvlText w:val=""/>
+      <w:lvlJc w:val="left"/>
+      <w:pPr>
+        <w:tabs>
+          <w:tab w:val="num" w:pos="4320"/>
+        </w:tabs>
+        <w:ind w:left="4320" w:hanging="360"/>
+      </w:pPr>
+      <w:rPr>
+        <w:rFonts w:ascii="Wingdings" w:hAnsi="Wingdings" w:hint="default"/>
+        <w:sz w:val="20"/>
+      </w:rPr>
+    </w:lvl>
+    <w:lvl w:ilvl="6" w:tentative="1">
+      <w:start w:val="1"/>
+      <w:numFmt w:val="bullet"/>
+      <w:lvlText w:val=""/>
+      <w:lvlJc w:val="left"/>
+      <w:pPr>
+        <w:tabs>
+          <w:tab w:val="num" w:pos="5040"/>
+        </w:tabs>
+        <w:ind w:left="5040" w:hanging="360"/>
+      </w:pPr>
+      <w:rPr>
+        <w:rFonts w:ascii="Wingdings" w:hAnsi="Wingdings" w:hint="default"/>
+        <w:sz w:val="20"/>
+      </w:rPr>
+    </w:lvl>
+    <w:lvl w:ilvl="7" w:tentative="1">
+      <w:start w:val="1"/>
+      <w:numFmt w:val="bullet"/>
+      <w:lvlText w:val=""/>
+      <w:lvlJc w:val="left"/>
+      <w:pPr>
+        <w:tabs>
+          <w:tab w:val="num" w:pos="5760"/>
+        </w:tabs>
+        <w:ind w:left="5760" w:hanging="360"/>
+      </w:pPr>
+      <w:rPr>
+        <w:rFonts w:ascii="Wingdings" w:hAnsi="Wingdings" w:hint="default"/>
+        <w:sz w:val="20"/>
+      </w:rPr>
+    </w:lvl>
+    <w:lvl w:ilvl="8" w:tentative="1">
+      <w:start w:val="1"/>
+      <w:numFmt w:val="bullet"/>
+      <w:lvlText w:val=""/>
+      <w:lvlJc w:val="left"/>
+      <w:pPr>
+        <w:tabs>
+          <w:tab w:val="num" w:pos="6480"/>
+        </w:tabs>
+        <w:ind w:left="6480" w:hanging="360"/>
+      </w:pPr>
+      <w:rPr>
+        <w:rFonts w:ascii="Wingdings" w:hAnsi="Wingdings" w:hint="default"/>
+        <w:sz w:val="20"/>
+      </w:rPr>
+    </w:lvl>
+  </w:abstractNum>
+  <w:num w:numId="1" w16cid:durableId="1700429761">
+    <w:abstractNumId w:val="0"/>
+  </w:num>
+  <w:num w:numId="2" w16cid:durableId="1157303928">
+    <w:abstractNumId w:val="2"/>
+  </w:num>
+  <w:num w:numId="3" w16cid:durableId="1666203159">
+    <w:abstractNumId w:val="1"/>
+  </w:num>
+</w:numbering>
 </file>
 
 <file path=word/styles.xml><?xml version="1.0" encoding="utf-8"?>

</xml_diff>

<commit_message>
Step 2: AWS Lambda Fonksiyonu ve Kinesis Tetikleyicisi Yapılandırıldı
</commit_message>
<xml_diff>
--- a/PROJE-2/23291207.docx
+++ b/PROJE-2/23291207.docx
@@ -90,7 +90,15 @@
           <w:lang w:val="en-US"/>
         </w:rPr>
         <w:lastRenderedPageBreak/>
-        <w:t>Proje 2: Teknik Günlük - 1. Gün</w:t>
+        <w:t xml:space="preserve">Proje 2: Teknik Günlük - </w:t>
+      </w:r>
+      <w:r>
+        <w:rPr>
+          <w:b/>
+          <w:bCs/>
+          <w:lang w:val="en-US"/>
+        </w:rPr>
+        <w:t>Aşama</w:t>
       </w:r>
     </w:p>
     <w:p>
@@ -424,40 +432,16 @@
     <w:p/>
     <w:p/>
     <w:p/>
-    <w:p/>
-    <w:p/>
-    <w:p/>
-    <w:p/>
-    <w:p/>
-    <w:p/>
-    <w:p/>
-    <w:p/>
-    <w:p/>
-    <w:p/>
-    <w:p/>
-    <w:p/>
-    <w:p/>
-    <w:p/>
-    <w:p/>
-    <w:p/>
-    <w:p/>
-    <w:p/>
-    <w:p/>
-    <w:p/>
-    <w:p/>
-    <w:p/>
-    <w:p/>
-    <w:p/>
-    <w:p>
-      <w:r>
+    <w:p>
+      <w:r>
+        <w:lastRenderedPageBreak/>
         <w:t>Resimler:</w:t>
       </w:r>
     </w:p>
     <w:p>
       <w:r>
-        <w:lastRenderedPageBreak/>
         <w:drawing>
-          <wp:inline distT="0" distB="0" distL="0" distR="0" wp14:anchorId="12753D02" wp14:editId="166DF29F">
+          <wp:inline distT="0" distB="0" distL="0" distR="0" wp14:anchorId="1FCB99E2" wp14:editId="60DB33EA">
             <wp:extent cx="5760720" cy="2893695"/>
             <wp:effectExtent l="0" t="0" r="0" b="1905"/>
             <wp:docPr id="319069268" name="Resim 1" descr="metin, ekran görüntüsü, yazılım, bilgisayar simgesi içeren bir resim&#10;&#10;Yapay zeka tarafından oluşturulmuş içerik yanlış olabilir."/>
@@ -493,10 +477,11 @@
         </w:drawing>
       </w:r>
     </w:p>
+    <w:p/>
     <w:p>
       <w:r>
         <w:drawing>
-          <wp:inline distT="0" distB="0" distL="0" distR="0" wp14:anchorId="796FA435" wp14:editId="1618304D">
+          <wp:inline distT="0" distB="0" distL="0" distR="0" wp14:anchorId="5463766B" wp14:editId="06C2BB9E">
             <wp:extent cx="5760720" cy="1777365"/>
             <wp:effectExtent l="0" t="0" r="0" b="0"/>
             <wp:docPr id="81671239" name="Resim 1" descr="ekran görüntüsü, metin, yazılım, bilgisayar simgesi içeren bir resim&#10;&#10;Yapay zeka tarafından oluşturulmuş içerik yanlış olabilir."/>
@@ -535,7 +520,7 @@
     <w:p>
       <w:r>
         <w:drawing>
-          <wp:inline distT="0" distB="0" distL="0" distR="0" wp14:anchorId="2AECDCE2" wp14:editId="6E709E95">
+          <wp:inline distT="0" distB="0" distL="0" distR="0" wp14:anchorId="77A46095" wp14:editId="781A1934">
             <wp:extent cx="5760720" cy="2773680"/>
             <wp:effectExtent l="0" t="0" r="0" b="7620"/>
             <wp:docPr id="466706068" name="Resim 1" descr="metin, ekran görüntüsü, yazılım, bilgisayar simgesi içeren bir resim&#10;&#10;Yapay zeka tarafından oluşturulmuş içerik yanlış olabilir."/>
@@ -575,7 +560,7 @@
       <w:r>
         <w:lastRenderedPageBreak/>
         <w:drawing>
-          <wp:inline distT="0" distB="0" distL="0" distR="0" wp14:anchorId="713792BC" wp14:editId="609EA225">
+          <wp:inline distT="0" distB="0" distL="0" distR="0" wp14:anchorId="1C45E172" wp14:editId="3FE68823">
             <wp:extent cx="5760720" cy="2776855"/>
             <wp:effectExtent l="0" t="0" r="0" b="4445"/>
             <wp:docPr id="1716677395" name="Resim 1" descr="metin, ekran görüntüsü, yazılım, bilgisayar simgesi içeren bir resim&#10;&#10;Yapay zeka tarafından oluşturulmuş içerik yanlış olabilir."/>
@@ -614,7 +599,7 @@
     <w:p>
       <w:r>
         <w:drawing>
-          <wp:inline distT="0" distB="0" distL="0" distR="0" wp14:anchorId="2DAA0CEE" wp14:editId="7D6C8BDB">
+          <wp:inline distT="0" distB="0" distL="0" distR="0" wp14:anchorId="0A0189A0" wp14:editId="7809699B">
             <wp:extent cx="5760720" cy="2821940"/>
             <wp:effectExtent l="0" t="0" r="0" b="0"/>
             <wp:docPr id="1246200892" name="Resim 1" descr="metin, ekran görüntüsü, yazılım, bilgisayar simgesi içeren bir resim&#10;&#10;Yapay zeka tarafından oluşturulmuş içerik yanlış olabilir."/>
@@ -653,7 +638,7 @@
     <w:p>
       <w:r>
         <w:drawing>
-          <wp:inline distT="0" distB="0" distL="0" distR="0" wp14:anchorId="5A98FEA6" wp14:editId="1DF2D6C1">
+          <wp:inline distT="0" distB="0" distL="0" distR="0" wp14:anchorId="1C255F24" wp14:editId="60BF970E">
             <wp:extent cx="5760720" cy="2788920"/>
             <wp:effectExtent l="0" t="0" r="0" b="0"/>
             <wp:docPr id="1499189444" name="Resim 1" descr="metin, yazılım, bilgisayar simgesi, işletim sistemi içeren bir resim&#10;&#10;Yapay zeka tarafından oluşturulmuş içerik yanlış olabilir."/>
@@ -693,7 +678,7 @@
       <w:r>
         <w:lastRenderedPageBreak/>
         <w:drawing>
-          <wp:inline distT="0" distB="0" distL="0" distR="0" wp14:anchorId="419B497D" wp14:editId="2E18CE1F">
+          <wp:inline distT="0" distB="0" distL="0" distR="0" wp14:anchorId="3112F005" wp14:editId="3E8EB3ED">
             <wp:extent cx="5760720" cy="2626360"/>
             <wp:effectExtent l="0" t="0" r="0" b="2540"/>
             <wp:docPr id="1236784790" name="Resim 1" descr="metin, ekran görüntüsü, yazılım, bilgisayar simgesi içeren bir resim&#10;&#10;Yapay zeka tarafından oluşturulmuş içerik yanlış olabilir."/>
@@ -730,6 +715,419 @@
       </w:r>
     </w:p>
     <w:p/>
+    <w:p/>
+    <w:p/>
+    <w:p/>
+    <w:p/>
+    <w:p/>
+    <w:p/>
+    <w:p/>
+    <w:p/>
+    <w:p/>
+    <w:p/>
+    <w:p/>
+    <w:p/>
+    <w:p/>
+    <w:p/>
+    <w:p/>
+    <w:p/>
+    <w:p/>
+    <w:p/>
+    <w:p/>
+    <w:p/>
+    <w:p>
+      <w:pPr>
+        <w:rPr>
+          <w:b/>
+          <w:bCs/>
+          <w:lang w:val="en-US"/>
+        </w:rPr>
+      </w:pPr>
+      <w:r>
+        <w:rPr>
+          <w:b/>
+          <w:bCs/>
+          <w:lang w:val="en-US"/>
+        </w:rPr>
+        <w:lastRenderedPageBreak/>
+        <w:t xml:space="preserve">Proje 2: Teknik Günlük - 2. </w:t>
+      </w:r>
+      <w:r>
+        <w:rPr>
+          <w:b/>
+          <w:bCs/>
+          <w:lang w:val="en-US"/>
+        </w:rPr>
+        <w:t>Aşama</w:t>
+      </w:r>
+    </w:p>
+    <w:p>
+      <w:pPr>
+        <w:rPr>
+          <w:b/>
+          <w:bCs/>
+          <w:lang w:val="en-US"/>
+        </w:rPr>
+      </w:pPr>
+      <w:r>
+        <w:rPr>
+          <w:b/>
+          <w:bCs/>
+          <w:lang w:val="en-US"/>
+        </w:rPr>
+        <w:t>AWS Lambda: Sunucusuz İşlem Katmanı (Serverless Processing)</w:t>
+      </w:r>
+    </w:p>
+    <w:p>
+      <w:pPr>
+        <w:rPr>
+          <w:lang w:val="en-US"/>
+        </w:rPr>
+      </w:pPr>
+      <w:r>
+        <w:rPr>
+          <w:lang w:val="en-US"/>
+        </w:rPr>
+        <w:t>Sistemin "beyni" olarak görev yapan AWS Lambda fonksiyonu yapılandırılmıştır. Bu aşamada yapılan teknik işlemler şunlardır:</w:t>
+      </w:r>
+    </w:p>
+    <w:p>
+      <w:pPr>
+        <w:numPr>
+          <w:ilvl w:val="0"/>
+          <w:numId w:val="4"/>
+        </w:numPr>
+        <w:rPr>
+          <w:lang w:val="en-US"/>
+        </w:rPr>
+      </w:pPr>
+      <w:r>
+        <w:rPr>
+          <w:b/>
+          <w:bCs/>
+          <w:lang w:val="en-US"/>
+        </w:rPr>
+        <w:t>Event-Driven (Olay Güdümlü) Mimari:</w:t>
+      </w:r>
+      <w:r>
+        <w:rPr>
+          <w:lang w:val="en-US"/>
+        </w:rPr>
+        <w:t xml:space="preserve"> Lambda fonksiyonu, Kinesis veri akışına bir tetikleyici (trigger) ile bağlanmıştır. Bu sayede veri akışı olduğu sürece sistem otomatik olarak ölçeklenmekte ve sadece işlem yapıldığında maliyet oluşmaktadır.</w:t>
+      </w:r>
+    </w:p>
+    <w:p>
+      <w:pPr>
+        <w:numPr>
+          <w:ilvl w:val="0"/>
+          <w:numId w:val="4"/>
+        </w:numPr>
+        <w:rPr>
+          <w:lang w:val="en-US"/>
+        </w:rPr>
+      </w:pPr>
+      <w:r>
+        <w:rPr>
+          <w:b/>
+          <w:bCs/>
+          <w:lang w:val="en-US"/>
+        </w:rPr>
+        <w:t>Veri Dönüştürme:</w:t>
+      </w:r>
+      <w:r>
+        <w:rPr>
+          <w:lang w:val="en-US"/>
+        </w:rPr>
+        <w:t xml:space="preserve"> Kinesis üzerinden gelen veriler varsayılan olarak Base64 formatında iletilmektedir. Hazırlanan Python kodu, bu ham veriyi çözerek (decode) JSON formatına dönüştürmekte ve işlenebilir hale getirmektedir.</w:t>
+      </w:r>
+    </w:p>
+    <w:p>
+      <w:pPr>
+        <w:numPr>
+          <w:ilvl w:val="0"/>
+          <w:numId w:val="4"/>
+        </w:numPr>
+        <w:rPr>
+          <w:lang w:val="en-US"/>
+        </w:rPr>
+      </w:pPr>
+      <w:r>
+        <w:rPr>
+          <w:b/>
+          <w:bCs/>
+          <w:lang w:val="en-US"/>
+        </w:rPr>
+        <w:t>Entegrasyon:</w:t>
+      </w:r>
+      <w:r>
+        <w:rPr>
+          <w:lang w:val="en-US"/>
+        </w:rPr>
+        <w:t xml:space="preserve"> boto3 kütüphanesi kullanılarak işlenen verilerin anlık olarak DynamoDB tablosuna yazılması sağlanmıştır.</w:t>
+      </w:r>
+    </w:p>
+    <w:p>
+      <w:pPr>
+        <w:rPr>
+          <w:b/>
+          <w:bCs/>
+          <w:lang w:val="en-US"/>
+        </w:rPr>
+      </w:pPr>
+      <w:r>
+        <w:rPr>
+          <w:b/>
+          <w:bCs/>
+          <w:lang w:val="en-US"/>
+        </w:rPr>
+        <w:t>IAM ve Güvenlik</w:t>
+      </w:r>
+    </w:p>
+    <w:p>
+      <w:pPr>
+        <w:rPr>
+          <w:lang w:val="en-US"/>
+        </w:rPr>
+      </w:pPr>
+      <w:r>
+        <w:rPr>
+          <w:lang w:val="en-US"/>
+        </w:rPr>
+        <w:t>Lambda fonksiyonunun Kinesis'i dinleyebilmesi ve DynamoDB'ye yazabilmesi için gerekli olan en az ayrıcalık (Least Privilege) prensibine uygun IAM izinleri kontrol edilmiştir.</w:t>
+      </w:r>
+    </w:p>
+    <w:p/>
+    <w:p/>
+    <w:p/>
+    <w:p/>
+    <w:p/>
+    <w:p/>
+    <w:p/>
+    <w:p/>
+    <w:p/>
+    <w:p/>
+    <w:p/>
+    <w:p/>
+    <w:p/>
+    <w:p/>
+    <w:p/>
+    <w:p/>
+    <w:p/>
+    <w:p/>
+    <w:p/>
+    <w:p>
+      <w:r>
+        <w:lastRenderedPageBreak/>
+        <w:t>Resimler:</w:t>
+      </w:r>
+    </w:p>
+    <w:p>
+      <w:r>
+        <w:drawing>
+          <wp:inline distT="0" distB="0" distL="0" distR="0" wp14:anchorId="0C31A32F" wp14:editId="7F7317A0">
+            <wp:extent cx="5760720" cy="2785745"/>
+            <wp:effectExtent l="0" t="0" r="0" b="0"/>
+            <wp:docPr id="418360329" name="Resim 1" descr="metin, ekran görüntüsü, yazılım, bilgisayar simgesi içeren bir resim&#10;&#10;Yapay zeka tarafından oluşturulmuş içerik yanlış olabilir."/>
+            <wp:cNvGraphicFramePr>
+              <a:graphicFrameLocks xmlns:a="http://schemas.openxmlformats.org/drawingml/2006/main" noChangeAspect="1"/>
+            </wp:cNvGraphicFramePr>
+            <a:graphic xmlns:a="http://schemas.openxmlformats.org/drawingml/2006/main">
+              <a:graphicData uri="http://schemas.openxmlformats.org/drawingml/2006/picture">
+                <pic:pic xmlns:pic="http://schemas.openxmlformats.org/drawingml/2006/picture">
+                  <pic:nvPicPr>
+                    <pic:cNvPr id="418360329" name="Resim 1" descr="metin, ekran görüntüsü, yazılım, bilgisayar simgesi içeren bir resim&#10;&#10;Yapay zeka tarafından oluşturulmuş içerik yanlış olabilir."/>
+                    <pic:cNvPicPr/>
+                  </pic:nvPicPr>
+                  <pic:blipFill>
+                    <a:blip r:embed="rId14"/>
+                    <a:stretch>
+                      <a:fillRect/>
+                    </a:stretch>
+                  </pic:blipFill>
+                  <pic:spPr>
+                    <a:xfrm>
+                      <a:off x="0" y="0"/>
+                      <a:ext cx="5760720" cy="2785745"/>
+                    </a:xfrm>
+                    <a:prstGeom prst="rect">
+                      <a:avLst/>
+                    </a:prstGeom>
+                  </pic:spPr>
+                </pic:pic>
+              </a:graphicData>
+            </a:graphic>
+          </wp:inline>
+        </w:drawing>
+      </w:r>
+    </w:p>
+    <w:p>
+      <w:r>
+        <w:drawing>
+          <wp:inline distT="0" distB="0" distL="0" distR="0" wp14:anchorId="3A0456A6" wp14:editId="02BD23E0">
+            <wp:extent cx="5760720" cy="2812415"/>
+            <wp:effectExtent l="0" t="0" r="0" b="6985"/>
+            <wp:docPr id="1806152922" name="Resim 1" descr="metin, ekran görüntüsü, yazılım, bilgisayar simgesi içeren bir resim&#10;&#10;Yapay zeka tarafından oluşturulmuş içerik yanlış olabilir."/>
+            <wp:cNvGraphicFramePr>
+              <a:graphicFrameLocks xmlns:a="http://schemas.openxmlformats.org/drawingml/2006/main" noChangeAspect="1"/>
+            </wp:cNvGraphicFramePr>
+            <a:graphic xmlns:a="http://schemas.openxmlformats.org/drawingml/2006/main">
+              <a:graphicData uri="http://schemas.openxmlformats.org/drawingml/2006/picture">
+                <pic:pic xmlns:pic="http://schemas.openxmlformats.org/drawingml/2006/picture">
+                  <pic:nvPicPr>
+                    <pic:cNvPr id="1806152922" name="Resim 1" descr="metin, ekran görüntüsü, yazılım, bilgisayar simgesi içeren bir resim&#10;&#10;Yapay zeka tarafından oluşturulmuş içerik yanlış olabilir."/>
+                    <pic:cNvPicPr/>
+                  </pic:nvPicPr>
+                  <pic:blipFill>
+                    <a:blip r:embed="rId15"/>
+                    <a:stretch>
+                      <a:fillRect/>
+                    </a:stretch>
+                  </pic:blipFill>
+                  <pic:spPr>
+                    <a:xfrm>
+                      <a:off x="0" y="0"/>
+                      <a:ext cx="5760720" cy="2812415"/>
+                    </a:xfrm>
+                    <a:prstGeom prst="rect">
+                      <a:avLst/>
+                    </a:prstGeom>
+                  </pic:spPr>
+                </pic:pic>
+              </a:graphicData>
+            </a:graphic>
+          </wp:inline>
+        </w:drawing>
+      </w:r>
+    </w:p>
+    <w:p>
+      <w:r>
+        <w:drawing>
+          <wp:inline distT="0" distB="0" distL="0" distR="0" wp14:anchorId="5305267B" wp14:editId="6CD164BD">
+            <wp:extent cx="5324563" cy="2563091"/>
+            <wp:effectExtent l="0" t="0" r="0" b="8890"/>
+            <wp:docPr id="647053696" name="Resim 1" descr="metin, ekran görüntüsü, yazılım, bilgisayar simgesi içeren bir resim&#10;&#10;Yapay zeka tarafından oluşturulmuş içerik yanlış olabilir."/>
+            <wp:cNvGraphicFramePr>
+              <a:graphicFrameLocks xmlns:a="http://schemas.openxmlformats.org/drawingml/2006/main" noChangeAspect="1"/>
+            </wp:cNvGraphicFramePr>
+            <a:graphic xmlns:a="http://schemas.openxmlformats.org/drawingml/2006/main">
+              <a:graphicData uri="http://schemas.openxmlformats.org/drawingml/2006/picture">
+                <pic:pic xmlns:pic="http://schemas.openxmlformats.org/drawingml/2006/picture">
+                  <pic:nvPicPr>
+                    <pic:cNvPr id="647053696" name="Resim 1" descr="metin, ekran görüntüsü, yazılım, bilgisayar simgesi içeren bir resim&#10;&#10;Yapay zeka tarafından oluşturulmuş içerik yanlış olabilir."/>
+                    <pic:cNvPicPr/>
+                  </pic:nvPicPr>
+                  <pic:blipFill>
+                    <a:blip r:embed="rId16"/>
+                    <a:stretch>
+                      <a:fillRect/>
+                    </a:stretch>
+                  </pic:blipFill>
+                  <pic:spPr>
+                    <a:xfrm>
+                      <a:off x="0" y="0"/>
+                      <a:ext cx="5332381" cy="2566854"/>
+                    </a:xfrm>
+                    <a:prstGeom prst="rect">
+                      <a:avLst/>
+                    </a:prstGeom>
+                  </pic:spPr>
+                </pic:pic>
+              </a:graphicData>
+            </a:graphic>
+          </wp:inline>
+        </w:drawing>
+      </w:r>
+    </w:p>
+    <w:p>
+      <w:r>
+        <w:lastRenderedPageBreak/>
+        <w:drawing>
+          <wp:inline distT="0" distB="0" distL="0" distR="0" wp14:anchorId="11EE5326" wp14:editId="28D3DC55">
+            <wp:extent cx="5760720" cy="2797810"/>
+            <wp:effectExtent l="0" t="0" r="0" b="2540"/>
+            <wp:docPr id="1470459157" name="Resim 1" descr="metin, yazılım, bilgisayar simgesi, web sayfası içeren bir resim&#10;&#10;Yapay zeka tarafından oluşturulmuş içerik yanlış olabilir."/>
+            <wp:cNvGraphicFramePr>
+              <a:graphicFrameLocks xmlns:a="http://schemas.openxmlformats.org/drawingml/2006/main" noChangeAspect="1"/>
+            </wp:cNvGraphicFramePr>
+            <a:graphic xmlns:a="http://schemas.openxmlformats.org/drawingml/2006/main">
+              <a:graphicData uri="http://schemas.openxmlformats.org/drawingml/2006/picture">
+                <pic:pic xmlns:pic="http://schemas.openxmlformats.org/drawingml/2006/picture">
+                  <pic:nvPicPr>
+                    <pic:cNvPr id="1470459157" name="Resim 1" descr="metin, yazılım, bilgisayar simgesi, web sayfası içeren bir resim&#10;&#10;Yapay zeka tarafından oluşturulmuş içerik yanlış olabilir."/>
+                    <pic:cNvPicPr/>
+                  </pic:nvPicPr>
+                  <pic:blipFill>
+                    <a:blip r:embed="rId17"/>
+                    <a:stretch>
+                      <a:fillRect/>
+                    </a:stretch>
+                  </pic:blipFill>
+                  <pic:spPr>
+                    <a:xfrm>
+                      <a:off x="0" y="0"/>
+                      <a:ext cx="5760720" cy="2797810"/>
+                    </a:xfrm>
+                    <a:prstGeom prst="rect">
+                      <a:avLst/>
+                    </a:prstGeom>
+                  </pic:spPr>
+                </pic:pic>
+              </a:graphicData>
+            </a:graphic>
+          </wp:inline>
+        </w:drawing>
+      </w:r>
+    </w:p>
+    <w:p>
+      <w:r>
+        <w:drawing>
+          <wp:inline distT="0" distB="0" distL="0" distR="0" wp14:anchorId="7CECBEDA" wp14:editId="2263EA4A">
+            <wp:extent cx="5760720" cy="2797810"/>
+            <wp:effectExtent l="0" t="0" r="0" b="2540"/>
+            <wp:docPr id="1936893008" name="Resim 1" descr="metin, ekran görüntüsü, yazılım, bilgisayar simgesi içeren bir resim&#10;&#10;Yapay zeka tarafından oluşturulmuş içerik yanlış olabilir."/>
+            <wp:cNvGraphicFramePr>
+              <a:graphicFrameLocks xmlns:a="http://schemas.openxmlformats.org/drawingml/2006/main" noChangeAspect="1"/>
+            </wp:cNvGraphicFramePr>
+            <a:graphic xmlns:a="http://schemas.openxmlformats.org/drawingml/2006/main">
+              <a:graphicData uri="http://schemas.openxmlformats.org/drawingml/2006/picture">
+                <pic:pic xmlns:pic="http://schemas.openxmlformats.org/drawingml/2006/picture">
+                  <pic:nvPicPr>
+                    <pic:cNvPr id="1936893008" name="Resim 1" descr="metin, ekran görüntüsü, yazılım, bilgisayar simgesi içeren bir resim&#10;&#10;Yapay zeka tarafından oluşturulmuş içerik yanlış olabilir."/>
+                    <pic:cNvPicPr/>
+                  </pic:nvPicPr>
+                  <pic:blipFill>
+                    <a:blip r:embed="rId18"/>
+                    <a:stretch>
+                      <a:fillRect/>
+                    </a:stretch>
+                  </pic:blipFill>
+                  <pic:spPr>
+                    <a:xfrm>
+                      <a:off x="0" y="0"/>
+                      <a:ext cx="5760720" cy="2797810"/>
+                    </a:xfrm>
+                    <a:prstGeom prst="rect">
+                      <a:avLst/>
+                    </a:prstGeom>
+                  </pic:spPr>
+                </pic:pic>
+              </a:graphicData>
+            </a:graphic>
+          </wp:inline>
+        </w:drawing>
+      </w:r>
+    </w:p>
+    <w:p/>
+    <w:p/>
+    <w:p/>
+    <w:p/>
+    <w:p/>
+    <w:p/>
+    <w:p/>
+    <w:p/>
+    <w:p/>
+    <w:p/>
+    <w:p/>
     <w:sectPr>
       <w:pgSz w:w="11906" w:h="16838"/>
       <w:pgMar w:top="1417" w:right="1417" w:bottom="1417" w:left="1417" w:header="708" w:footer="708" w:gutter="0"/>
@@ -1153,6 +1551,155 @@
       </w:rPr>
     </w:lvl>
   </w:abstractNum>
+  <w:abstractNum w:abstractNumId="3" w15:restartNumberingAfterBreak="0">
+    <w:nsid w:val="6FD346D4"/>
+    <w:multiLevelType w:val="multilevel"/>
+    <w:tmpl w:val="D22A3B84"/>
+    <w:lvl w:ilvl="0">
+      <w:start w:val="1"/>
+      <w:numFmt w:val="bullet"/>
+      <w:lvlText w:val=""/>
+      <w:lvlJc w:val="left"/>
+      <w:pPr>
+        <w:tabs>
+          <w:tab w:val="num" w:pos="720"/>
+        </w:tabs>
+        <w:ind w:left="720" w:hanging="360"/>
+      </w:pPr>
+      <w:rPr>
+        <w:rFonts w:ascii="Symbol" w:hAnsi="Symbol" w:hint="default"/>
+        <w:sz w:val="20"/>
+      </w:rPr>
+    </w:lvl>
+    <w:lvl w:ilvl="1" w:tentative="1">
+      <w:start w:val="1"/>
+      <w:numFmt w:val="bullet"/>
+      <w:lvlText w:val="o"/>
+      <w:lvlJc w:val="left"/>
+      <w:pPr>
+        <w:tabs>
+          <w:tab w:val="num" w:pos="1440"/>
+        </w:tabs>
+        <w:ind w:left="1440" w:hanging="360"/>
+      </w:pPr>
+      <w:rPr>
+        <w:rFonts w:ascii="Courier New" w:hAnsi="Courier New" w:hint="default"/>
+        <w:sz w:val="20"/>
+      </w:rPr>
+    </w:lvl>
+    <w:lvl w:ilvl="2" w:tentative="1">
+      <w:start w:val="1"/>
+      <w:numFmt w:val="bullet"/>
+      <w:lvlText w:val=""/>
+      <w:lvlJc w:val="left"/>
+      <w:pPr>
+        <w:tabs>
+          <w:tab w:val="num" w:pos="2160"/>
+        </w:tabs>
+        <w:ind w:left="2160" w:hanging="360"/>
+      </w:pPr>
+      <w:rPr>
+        <w:rFonts w:ascii="Wingdings" w:hAnsi="Wingdings" w:hint="default"/>
+        <w:sz w:val="20"/>
+      </w:rPr>
+    </w:lvl>
+    <w:lvl w:ilvl="3" w:tentative="1">
+      <w:start w:val="1"/>
+      <w:numFmt w:val="bullet"/>
+      <w:lvlText w:val=""/>
+      <w:lvlJc w:val="left"/>
+      <w:pPr>
+        <w:tabs>
+          <w:tab w:val="num" w:pos="2880"/>
+        </w:tabs>
+        <w:ind w:left="2880" w:hanging="360"/>
+      </w:pPr>
+      <w:rPr>
+        <w:rFonts w:ascii="Wingdings" w:hAnsi="Wingdings" w:hint="default"/>
+        <w:sz w:val="20"/>
+      </w:rPr>
+    </w:lvl>
+    <w:lvl w:ilvl="4" w:tentative="1">
+      <w:start w:val="1"/>
+      <w:numFmt w:val="bullet"/>
+      <w:lvlText w:val=""/>
+      <w:lvlJc w:val="left"/>
+      <w:pPr>
+        <w:tabs>
+          <w:tab w:val="num" w:pos="3600"/>
+        </w:tabs>
+        <w:ind w:left="3600" w:hanging="360"/>
+      </w:pPr>
+      <w:rPr>
+        <w:rFonts w:ascii="Wingdings" w:hAnsi="Wingdings" w:hint="default"/>
+        <w:sz w:val="20"/>
+      </w:rPr>
+    </w:lvl>
+    <w:lvl w:ilvl="5" w:tentative="1">
+      <w:start w:val="1"/>
+      <w:numFmt w:val="bullet"/>
+      <w:lvlText w:val=""/>
+      <w:lvlJc w:val="left"/>
+      <w:pPr>
+        <w:tabs>
+          <w:tab w:val="num" w:pos="4320"/>
+        </w:tabs>
+        <w:ind w:left="4320" w:hanging="360"/>
+      </w:pPr>
+      <w:rPr>
+        <w:rFonts w:ascii="Wingdings" w:hAnsi="Wingdings" w:hint="default"/>
+        <w:sz w:val="20"/>
+      </w:rPr>
+    </w:lvl>
+    <w:lvl w:ilvl="6" w:tentative="1">
+      <w:start w:val="1"/>
+      <w:numFmt w:val="bullet"/>
+      <w:lvlText w:val=""/>
+      <w:lvlJc w:val="left"/>
+      <w:pPr>
+        <w:tabs>
+          <w:tab w:val="num" w:pos="5040"/>
+        </w:tabs>
+        <w:ind w:left="5040" w:hanging="360"/>
+      </w:pPr>
+      <w:rPr>
+        <w:rFonts w:ascii="Wingdings" w:hAnsi="Wingdings" w:hint="default"/>
+        <w:sz w:val="20"/>
+      </w:rPr>
+    </w:lvl>
+    <w:lvl w:ilvl="7" w:tentative="1">
+      <w:start w:val="1"/>
+      <w:numFmt w:val="bullet"/>
+      <w:lvlText w:val=""/>
+      <w:lvlJc w:val="left"/>
+      <w:pPr>
+        <w:tabs>
+          <w:tab w:val="num" w:pos="5760"/>
+        </w:tabs>
+        <w:ind w:left="5760" w:hanging="360"/>
+      </w:pPr>
+      <w:rPr>
+        <w:rFonts w:ascii="Wingdings" w:hAnsi="Wingdings" w:hint="default"/>
+        <w:sz w:val="20"/>
+      </w:rPr>
+    </w:lvl>
+    <w:lvl w:ilvl="8" w:tentative="1">
+      <w:start w:val="1"/>
+      <w:numFmt w:val="bullet"/>
+      <w:lvlText w:val=""/>
+      <w:lvlJc w:val="left"/>
+      <w:pPr>
+        <w:tabs>
+          <w:tab w:val="num" w:pos="6480"/>
+        </w:tabs>
+        <w:ind w:left="6480" w:hanging="360"/>
+      </w:pPr>
+      <w:rPr>
+        <w:rFonts w:ascii="Wingdings" w:hAnsi="Wingdings" w:hint="default"/>
+        <w:sz w:val="20"/>
+      </w:rPr>
+    </w:lvl>
+  </w:abstractNum>
   <w:num w:numId="1" w16cid:durableId="1700429761">
     <w:abstractNumId w:val="0"/>
   </w:num>
@@ -1161,6 +1708,9 @@
   </w:num>
   <w:num w:numId="3" w16cid:durableId="1666203159">
     <w:abstractNumId w:val="1"/>
+  </w:num>
+  <w:num w:numId="4" w16cid:durableId="1626691101">
+    <w:abstractNumId w:val="3"/>
   </w:num>
 </w:numbering>
 </file>

</xml_diff>

<commit_message>
Step 3: Python Sensör Simülatörü Tamamlandı ve Veri Akışı Başlatıldı
</commit_message>
<xml_diff>
--- a/PROJE-2/23291207.docx
+++ b/PROJE-2/23291207.docx
@@ -1128,6 +1128,212 @@
     <w:p/>
     <w:p/>
     <w:p/>
+    <w:p>
+      <w:pPr>
+        <w:rPr>
+          <w:b/>
+          <w:bCs/>
+          <w:lang w:val="en-US"/>
+        </w:rPr>
+      </w:pPr>
+      <w:r>
+        <w:rPr>
+          <w:b/>
+          <w:bCs/>
+          <w:lang w:val="en-US"/>
+        </w:rPr>
+        <w:lastRenderedPageBreak/>
+        <w:t xml:space="preserve">Proje 2: Teknik Günlük - 3. </w:t>
+      </w:r>
+      <w:r>
+        <w:rPr>
+          <w:b/>
+          <w:bCs/>
+          <w:lang w:val="en-US"/>
+        </w:rPr>
+        <w:t>Aşama</w:t>
+      </w:r>
+    </w:p>
+    <w:p>
+      <w:pPr>
+        <w:rPr>
+          <w:lang w:val="en-US"/>
+        </w:rPr>
+      </w:pPr>
+      <w:r>
+        <w:rPr>
+          <w:b/>
+          <w:bCs/>
+          <w:lang w:val="en-US"/>
+        </w:rPr>
+        <w:t>IoT Sensör Simülasyonu ve Veri Üretimi</w:t>
+      </w:r>
+      <w:r>
+        <w:rPr>
+          <w:lang w:val="en-US"/>
+        </w:rPr>
+        <w:t xml:space="preserve"> </w:t>
+      </w:r>
+    </w:p>
+    <w:p>
+      <w:pPr>
+        <w:rPr>
+          <w:lang w:val="en-US"/>
+        </w:rPr>
+      </w:pPr>
+      <w:r>
+        <w:rPr>
+          <w:lang w:val="en-US"/>
+        </w:rPr>
+        <w:t>Gerçek bir IoT donanımı (sensör) bulunmadığı senaryoda, sistemin veri kaynağını oluşturmak amacıyla Python tabanlı bir simülatör geliştirilmiştir. Bu aşamada yapılanlar:</w:t>
+      </w:r>
+    </w:p>
+    <w:p>
+      <w:pPr>
+        <w:numPr>
+          <w:ilvl w:val="0"/>
+          <w:numId w:val="5"/>
+        </w:numPr>
+        <w:rPr>
+          <w:lang w:val="en-US"/>
+        </w:rPr>
+      </w:pPr>
+      <w:r>
+        <w:rPr>
+          <w:b/>
+          <w:bCs/>
+          <w:lang w:val="en-US"/>
+        </w:rPr>
+        <w:t>Veri Yapısı:</w:t>
+      </w:r>
+      <w:r>
+        <w:rPr>
+          <w:lang w:val="en-US"/>
+        </w:rPr>
+        <w:t xml:space="preserve"> Her bir veri paketi; benzersiz sensör kimliği (sensor_id), sıcaklık, hava kirliliği (PM2.5), karbon (CO2) ve hassas zaman damgası (timestamp) bilgilerini içermektedir. </w:t>
+      </w:r>
+    </w:p>
+    <w:p>
+      <w:pPr>
+        <w:numPr>
+          <w:ilvl w:val="0"/>
+          <w:numId w:val="5"/>
+        </w:numPr>
+        <w:rPr>
+          <w:lang w:val="en-US"/>
+        </w:rPr>
+      </w:pPr>
+      <w:r>
+        <w:rPr>
+          <w:b/>
+          <w:bCs/>
+          <w:lang w:val="en-US"/>
+        </w:rPr>
+        <w:t>Boto3 Entegrasyonu:</w:t>
+      </w:r>
+      <w:r>
+        <w:rPr>
+          <w:lang w:val="en-US"/>
+        </w:rPr>
+        <w:t xml:space="preserve"> AWS SDK (Boto3) kullanılarak, üretilen JSON formatındaki veriler anlık olarak buluttaki </w:t>
+      </w:r>
+      <w:r>
+        <w:rPr>
+          <w:b/>
+          <w:bCs/>
+          <w:lang w:val="en-US"/>
+        </w:rPr>
+        <w:t>HavaKalitesiAkisi</w:t>
+      </w:r>
+      <w:r>
+        <w:rPr>
+          <w:lang w:val="en-US"/>
+        </w:rPr>
+        <w:t xml:space="preserve"> (Kinesis) kanalına put_record metodu ile iletilmektedir. </w:t>
+      </w:r>
+    </w:p>
+    <w:p>
+      <w:pPr>
+        <w:numPr>
+          <w:ilvl w:val="0"/>
+          <w:numId w:val="5"/>
+        </w:numPr>
+        <w:rPr>
+          <w:lang w:val="en-US"/>
+        </w:rPr>
+      </w:pPr>
+      <w:r>
+        <w:rPr>
+          <w:b/>
+          <w:bCs/>
+          <w:lang w:val="en-US"/>
+        </w:rPr>
+        <w:t>Gerçek Zamanlı Akış:</w:t>
+      </w:r>
+      <w:r>
+        <w:rPr>
+          <w:lang w:val="en-US"/>
+        </w:rPr>
+        <w:t xml:space="preserve"> Kod, sonsuz bir döngü içerisinde belirli aralıklarla veri üreterek sistemin sürekliliğini ve gerçek zamanlı işleme kapasitesini simüle etmektedir. </w:t>
+      </w:r>
+    </w:p>
+    <w:p/>
+    <w:p>
+      <w:r>
+        <w:t>Resimler:</w:t>
+      </w:r>
+    </w:p>
+    <w:p>
+      <w:r>
+        <w:drawing>
+          <wp:inline distT="0" distB="0" distL="0" distR="0" wp14:anchorId="0C1B6581" wp14:editId="4307096A">
+            <wp:extent cx="5760720" cy="4243070"/>
+            <wp:effectExtent l="0" t="0" r="0" b="5080"/>
+            <wp:docPr id="1022829051" name="Resim 1" descr="metin, ekran görüntüsü, yazılım, multimedya yazılımı içeren bir resim&#10;&#10;Yapay zeka tarafından oluşturulmuş içerik yanlış olabilir."/>
+            <wp:cNvGraphicFramePr>
+              <a:graphicFrameLocks xmlns:a="http://schemas.openxmlformats.org/drawingml/2006/main" noChangeAspect="1"/>
+            </wp:cNvGraphicFramePr>
+            <a:graphic xmlns:a="http://schemas.openxmlformats.org/drawingml/2006/main">
+              <a:graphicData uri="http://schemas.openxmlformats.org/drawingml/2006/picture">
+                <pic:pic xmlns:pic="http://schemas.openxmlformats.org/drawingml/2006/picture">
+                  <pic:nvPicPr>
+                    <pic:cNvPr id="1022829051" name="Resim 1" descr="metin, ekran görüntüsü, yazılım, multimedya yazılımı içeren bir resim&#10;&#10;Yapay zeka tarafından oluşturulmuş içerik yanlış olabilir."/>
+                    <pic:cNvPicPr/>
+                  </pic:nvPicPr>
+                  <pic:blipFill>
+                    <a:blip r:embed="rId19"/>
+                    <a:stretch>
+                      <a:fillRect/>
+                    </a:stretch>
+                  </pic:blipFill>
+                  <pic:spPr>
+                    <a:xfrm>
+                      <a:off x="0" y="0"/>
+                      <a:ext cx="5760720" cy="4243070"/>
+                    </a:xfrm>
+                    <a:prstGeom prst="rect">
+                      <a:avLst/>
+                    </a:prstGeom>
+                  </pic:spPr>
+                </pic:pic>
+              </a:graphicData>
+            </a:graphic>
+          </wp:inline>
+        </w:drawing>
+      </w:r>
+    </w:p>
+    <w:p/>
+    <w:p/>
+    <w:p/>
+    <w:p/>
+    <w:p/>
+    <w:p>
+      <w:r>
+        <w:lastRenderedPageBreak/>
+        <w:t>Resimler:</w:t>
+      </w:r>
+    </w:p>
+    <w:p/>
     <w:sectPr>
       <w:pgSz w:w="11906" w:h="16838"/>
       <w:pgMar w:top="1417" w:right="1417" w:bottom="1417" w:left="1417" w:header="708" w:footer="708" w:gutter="0"/>
@@ -1141,6 +1347,155 @@
 <file path=word/numbering.xml><?xml version="1.0" encoding="utf-8"?>
 <w:numbering xmlns:wpc="http://schemas.microsoft.com/office/word/2010/wordprocessingCanvas" xmlns:cx="http://schemas.microsoft.com/office/drawing/2014/chartex" xmlns:cx1="http://schemas.microsoft.com/office/drawing/2015/9/8/chartex" xmlns:cx2="http://schemas.microsoft.com/office/drawing/2015/10/21/chartex" xmlns:cx3="http://schemas.microsoft.com/office/drawing/2016/5/9/chartex" xmlns:cx4="http://schemas.microsoft.com/office/drawing/2016/5/10/chartex" xmlns:cx5="http://schemas.microsoft.com/office/drawing/2016/5/11/chartex" xmlns:cx6="http://schemas.microsoft.com/office/drawing/2016/5/12/chartex" xmlns:cx7="http://schemas.microsoft.com/office/drawing/2016/5/13/chartex" xmlns:cx8="http://schemas.microsoft.com/office/drawing/2016/5/14/chartex" xmlns:mc="http://schemas.openxmlformats.org/markup-compatibility/2006" xmlns:aink="http://schemas.microsoft.com/office/drawing/2016/ink" xmlns:am3d="http://schemas.microsoft.com/office/drawing/2017/model3d" xmlns:o="urn:schemas-microsoft-com:office:office" xmlns:oel="http://schemas.microsoft.com/office/2019/extlst" xmlns:r="http://schemas.openxmlformats.org/officeDocument/2006/relationships" xmlns:m="http://schemas.openxmlformats.org/officeDocument/2006/math" xmlns:v="urn:schemas-microsoft-com:vml" xmlns:wp14="http://schemas.microsoft.com/office/word/2010/wordprocessingDrawing" xmlns:wp="http://schemas.openxmlformats.org/drawingml/2006/wordprocessingDrawing" xmlns:w10="urn:schemas-microsoft-com:office:word" xmlns:w="http://schemas.openxmlformats.org/wordprocessingml/2006/main" xmlns:w14="http://schemas.microsoft.com/office/word/2010/wordml" xmlns:w15="http://schemas.microsoft.com/office/word/2012/wordml" xmlns:w16cex="http://schemas.microsoft.com/office/word/2018/wordml/cex" xmlns:w16cid="http://schemas.microsoft.com/office/word/2016/wordml/cid" xmlns:w16="http://schemas.microsoft.com/office/word/2018/wordml" xmlns:w16du="http://schemas.microsoft.com/office/word/2023/wordml/word16du" xmlns:w16sdtdh="http://schemas.microsoft.com/office/word/2020/wordml/sdtdatahash" xmlns:w16sdtfl="http://schemas.microsoft.com/office/word/2024/wordml/sdtformatlock" xmlns:w16se="http://schemas.microsoft.com/office/word/2015/wordml/symex" xmlns:wpg="http://schemas.microsoft.com/office/word/2010/wordprocessingGroup" xmlns:wpi="http://schemas.microsoft.com/office/word/2010/wordprocessingInk" xmlns:wne="http://schemas.microsoft.com/office/word/2006/wordml" xmlns:wps="http://schemas.microsoft.com/office/word/2010/wordprocessingShape" mc:Ignorable="w14 w15 w16se w16cid w16 w16cex w16sdtdh w16sdtfl w16du wp14">
   <w:abstractNum w:abstractNumId="0" w15:restartNumberingAfterBreak="0">
+    <w:nsid w:val="1D545E45"/>
+    <w:multiLevelType w:val="multilevel"/>
+    <w:tmpl w:val="A8ECE2D8"/>
+    <w:lvl w:ilvl="0">
+      <w:start w:val="1"/>
+      <w:numFmt w:val="bullet"/>
+      <w:lvlText w:val=""/>
+      <w:lvlJc w:val="left"/>
+      <w:pPr>
+        <w:tabs>
+          <w:tab w:val="num" w:pos="720"/>
+        </w:tabs>
+        <w:ind w:left="720" w:hanging="360"/>
+      </w:pPr>
+      <w:rPr>
+        <w:rFonts w:ascii="Symbol" w:hAnsi="Symbol" w:hint="default"/>
+        <w:sz w:val="20"/>
+      </w:rPr>
+    </w:lvl>
+    <w:lvl w:ilvl="1" w:tentative="1">
+      <w:start w:val="1"/>
+      <w:numFmt w:val="bullet"/>
+      <w:lvlText w:val="o"/>
+      <w:lvlJc w:val="left"/>
+      <w:pPr>
+        <w:tabs>
+          <w:tab w:val="num" w:pos="1440"/>
+        </w:tabs>
+        <w:ind w:left="1440" w:hanging="360"/>
+      </w:pPr>
+      <w:rPr>
+        <w:rFonts w:ascii="Courier New" w:hAnsi="Courier New" w:hint="default"/>
+        <w:sz w:val="20"/>
+      </w:rPr>
+    </w:lvl>
+    <w:lvl w:ilvl="2" w:tentative="1">
+      <w:start w:val="1"/>
+      <w:numFmt w:val="bullet"/>
+      <w:lvlText w:val=""/>
+      <w:lvlJc w:val="left"/>
+      <w:pPr>
+        <w:tabs>
+          <w:tab w:val="num" w:pos="2160"/>
+        </w:tabs>
+        <w:ind w:left="2160" w:hanging="360"/>
+      </w:pPr>
+      <w:rPr>
+        <w:rFonts w:ascii="Wingdings" w:hAnsi="Wingdings" w:hint="default"/>
+        <w:sz w:val="20"/>
+      </w:rPr>
+    </w:lvl>
+    <w:lvl w:ilvl="3" w:tentative="1">
+      <w:start w:val="1"/>
+      <w:numFmt w:val="bullet"/>
+      <w:lvlText w:val=""/>
+      <w:lvlJc w:val="left"/>
+      <w:pPr>
+        <w:tabs>
+          <w:tab w:val="num" w:pos="2880"/>
+        </w:tabs>
+        <w:ind w:left="2880" w:hanging="360"/>
+      </w:pPr>
+      <w:rPr>
+        <w:rFonts w:ascii="Wingdings" w:hAnsi="Wingdings" w:hint="default"/>
+        <w:sz w:val="20"/>
+      </w:rPr>
+    </w:lvl>
+    <w:lvl w:ilvl="4" w:tentative="1">
+      <w:start w:val="1"/>
+      <w:numFmt w:val="bullet"/>
+      <w:lvlText w:val=""/>
+      <w:lvlJc w:val="left"/>
+      <w:pPr>
+        <w:tabs>
+          <w:tab w:val="num" w:pos="3600"/>
+        </w:tabs>
+        <w:ind w:left="3600" w:hanging="360"/>
+      </w:pPr>
+      <w:rPr>
+        <w:rFonts w:ascii="Wingdings" w:hAnsi="Wingdings" w:hint="default"/>
+        <w:sz w:val="20"/>
+      </w:rPr>
+    </w:lvl>
+    <w:lvl w:ilvl="5" w:tentative="1">
+      <w:start w:val="1"/>
+      <w:numFmt w:val="bullet"/>
+      <w:lvlText w:val=""/>
+      <w:lvlJc w:val="left"/>
+      <w:pPr>
+        <w:tabs>
+          <w:tab w:val="num" w:pos="4320"/>
+        </w:tabs>
+        <w:ind w:left="4320" w:hanging="360"/>
+      </w:pPr>
+      <w:rPr>
+        <w:rFonts w:ascii="Wingdings" w:hAnsi="Wingdings" w:hint="default"/>
+        <w:sz w:val="20"/>
+      </w:rPr>
+    </w:lvl>
+    <w:lvl w:ilvl="6" w:tentative="1">
+      <w:start w:val="1"/>
+      <w:numFmt w:val="bullet"/>
+      <w:lvlText w:val=""/>
+      <w:lvlJc w:val="left"/>
+      <w:pPr>
+        <w:tabs>
+          <w:tab w:val="num" w:pos="5040"/>
+        </w:tabs>
+        <w:ind w:left="5040" w:hanging="360"/>
+      </w:pPr>
+      <w:rPr>
+        <w:rFonts w:ascii="Wingdings" w:hAnsi="Wingdings" w:hint="default"/>
+        <w:sz w:val="20"/>
+      </w:rPr>
+    </w:lvl>
+    <w:lvl w:ilvl="7" w:tentative="1">
+      <w:start w:val="1"/>
+      <w:numFmt w:val="bullet"/>
+      <w:lvlText w:val=""/>
+      <w:lvlJc w:val="left"/>
+      <w:pPr>
+        <w:tabs>
+          <w:tab w:val="num" w:pos="5760"/>
+        </w:tabs>
+        <w:ind w:left="5760" w:hanging="360"/>
+      </w:pPr>
+      <w:rPr>
+        <w:rFonts w:ascii="Wingdings" w:hAnsi="Wingdings" w:hint="default"/>
+        <w:sz w:val="20"/>
+      </w:rPr>
+    </w:lvl>
+    <w:lvl w:ilvl="8" w:tentative="1">
+      <w:start w:val="1"/>
+      <w:numFmt w:val="bullet"/>
+      <w:lvlText w:val=""/>
+      <w:lvlJc w:val="left"/>
+      <w:pPr>
+        <w:tabs>
+          <w:tab w:val="num" w:pos="6480"/>
+        </w:tabs>
+        <w:ind w:left="6480" w:hanging="360"/>
+      </w:pPr>
+      <w:rPr>
+        <w:rFonts w:ascii="Wingdings" w:hAnsi="Wingdings" w:hint="default"/>
+        <w:sz w:val="20"/>
+      </w:rPr>
+    </w:lvl>
+  </w:abstractNum>
+  <w:abstractNum w:abstractNumId="1" w15:restartNumberingAfterBreak="0">
     <w:nsid w:val="46FE52E8"/>
     <w:multiLevelType w:val="multilevel"/>
     <w:tmpl w:val="C04486B8"/>
@@ -1289,7 +1644,7 @@
       </w:rPr>
     </w:lvl>
   </w:abstractNum>
-  <w:abstractNum w:abstractNumId="1" w15:restartNumberingAfterBreak="0">
+  <w:abstractNum w:abstractNumId="2" w15:restartNumberingAfterBreak="0">
     <w:nsid w:val="4A9F0AF8"/>
     <w:multiLevelType w:val="multilevel"/>
     <w:tmpl w:val="04A0C2B2"/>
@@ -1402,7 +1757,7 @@
       </w:pPr>
     </w:lvl>
   </w:abstractNum>
-  <w:abstractNum w:abstractNumId="2" w15:restartNumberingAfterBreak="0">
+  <w:abstractNum w:abstractNumId="3" w15:restartNumberingAfterBreak="0">
     <w:nsid w:val="55043113"/>
     <w:multiLevelType w:val="multilevel"/>
     <w:tmpl w:val="E7E25EA0"/>
@@ -1551,7 +1906,7 @@
       </w:rPr>
     </w:lvl>
   </w:abstractNum>
-  <w:abstractNum w:abstractNumId="3" w15:restartNumberingAfterBreak="0">
+  <w:abstractNum w:abstractNumId="4" w15:restartNumberingAfterBreak="0">
     <w:nsid w:val="6FD346D4"/>
     <w:multiLevelType w:val="multilevel"/>
     <w:tmpl w:val="D22A3B84"/>
@@ -1701,16 +2056,19 @@
     </w:lvl>
   </w:abstractNum>
   <w:num w:numId="1" w16cid:durableId="1700429761">
-    <w:abstractNumId w:val="0"/>
+    <w:abstractNumId w:val="1"/>
   </w:num>
   <w:num w:numId="2" w16cid:durableId="1157303928">
+    <w:abstractNumId w:val="3"/>
+  </w:num>
+  <w:num w:numId="3" w16cid:durableId="1666203159">
     <w:abstractNumId w:val="2"/>
   </w:num>
-  <w:num w:numId="3" w16cid:durableId="1666203159">
-    <w:abstractNumId w:val="1"/>
+  <w:num w:numId="4" w16cid:durableId="1626691101">
+    <w:abstractNumId w:val="4"/>
   </w:num>
-  <w:num w:numId="4" w16cid:durableId="1626691101">
-    <w:abstractNumId w:val="3"/>
+  <w:num w:numId="5" w16cid:durableId="340011408">
+    <w:abstractNumId w:val="0"/>
   </w:num>
 </w:numbering>
 </file>

</xml_diff>

<commit_message>
Step 5: Float tipi hatasi giderildi ve veri depolama dogrulandi
</commit_message>
<xml_diff>
--- a/PROJE-2/23291207.docx
+++ b/PROJE-2/23291207.docx
@@ -7346,11 +7346,1159 @@
     <w:p/>
     <w:p/>
     <w:p>
-      <w:r>
+      <w:pPr>
+        <w:rPr>
+          <w:b/>
+          <w:bCs/>
+          <w:lang w:val="en-US"/>
+        </w:rPr>
+      </w:pPr>
+      <w:proofErr w:type="spellStart"/>
+      <w:r>
+        <w:rPr>
+          <w:b/>
+          <w:bCs/>
+          <w:lang w:val="en-US"/>
+        </w:rPr>
         <w:lastRenderedPageBreak/>
+        <w:t>Proje</w:t>
+      </w:r>
+      <w:proofErr w:type="spellEnd"/>
+      <w:r>
+        <w:rPr>
+          <w:b/>
+          <w:bCs/>
+          <w:lang w:val="en-US"/>
+        </w:rPr>
+        <w:t xml:space="preserve"> 2: </w:t>
+      </w:r>
+      <w:r>
+        <w:rPr>
+          <w:b/>
+          <w:bCs/>
+          <w:lang w:val="en-US"/>
+        </w:rPr>
+        <w:t xml:space="preserve">Teknik </w:t>
+      </w:r>
+      <w:proofErr w:type="spellStart"/>
+      <w:r>
+        <w:rPr>
+          <w:b/>
+          <w:bCs/>
+          <w:lang w:val="en-US"/>
+        </w:rPr>
+        <w:t>Günlük</w:t>
+      </w:r>
+      <w:proofErr w:type="spellEnd"/>
+      <w:r>
+        <w:rPr>
+          <w:b/>
+          <w:bCs/>
+          <w:lang w:val="en-US"/>
+        </w:rPr>
+        <w:t xml:space="preserve"> – 5. </w:t>
+      </w:r>
+      <w:proofErr w:type="spellStart"/>
+      <w:r>
+        <w:rPr>
+          <w:b/>
+          <w:bCs/>
+          <w:lang w:val="en-US"/>
+        </w:rPr>
+        <w:t>Aşama</w:t>
+      </w:r>
+      <w:proofErr w:type="spellEnd"/>
+      <w:r>
+        <w:rPr>
+          <w:b/>
+          <w:bCs/>
+          <w:lang w:val="en-US"/>
+        </w:rPr>
+        <w:t xml:space="preserve"> </w:t>
+      </w:r>
+    </w:p>
+    <w:p>
+      <w:pPr>
+        <w:rPr>
+          <w:lang w:val="en-US"/>
+        </w:rPr>
+      </w:pPr>
+      <w:r>
+        <w:rPr>
+          <w:b/>
+          <w:bCs/>
+          <w:lang w:val="en-US"/>
+        </w:rPr>
+        <w:t xml:space="preserve">Veri Tipi </w:t>
+      </w:r>
+      <w:proofErr w:type="spellStart"/>
+      <w:r>
+        <w:rPr>
+          <w:b/>
+          <w:bCs/>
+          <w:lang w:val="en-US"/>
+        </w:rPr>
+        <w:t>Uyumluluğu</w:t>
+      </w:r>
+      <w:proofErr w:type="spellEnd"/>
+      <w:r>
+        <w:rPr>
+          <w:b/>
+          <w:bCs/>
+          <w:lang w:val="en-US"/>
+        </w:rPr>
+        <w:t xml:space="preserve"> </w:t>
+      </w:r>
+      <w:proofErr w:type="spellStart"/>
+      <w:r>
+        <w:rPr>
+          <w:b/>
+          <w:bCs/>
+          <w:lang w:val="en-US"/>
+        </w:rPr>
+        <w:t>ve</w:t>
+      </w:r>
+      <w:proofErr w:type="spellEnd"/>
+      <w:r>
+        <w:rPr>
+          <w:b/>
+          <w:bCs/>
+          <w:lang w:val="en-US"/>
+        </w:rPr>
+        <w:t xml:space="preserve"> </w:t>
+      </w:r>
+      <w:proofErr w:type="spellStart"/>
+      <w:r>
+        <w:rPr>
+          <w:b/>
+          <w:bCs/>
+          <w:lang w:val="en-US"/>
+        </w:rPr>
+        <w:t>Başarılı</w:t>
+      </w:r>
+      <w:proofErr w:type="spellEnd"/>
+      <w:r>
+        <w:rPr>
+          <w:b/>
+          <w:bCs/>
+          <w:lang w:val="en-US"/>
+        </w:rPr>
+        <w:t xml:space="preserve"> </w:t>
+      </w:r>
+      <w:proofErr w:type="spellStart"/>
+      <w:r>
+        <w:rPr>
+          <w:b/>
+          <w:bCs/>
+          <w:lang w:val="en-US"/>
+        </w:rPr>
+        <w:t>Entegrasyon</w:t>
+      </w:r>
+      <w:proofErr w:type="spellEnd"/>
+    </w:p>
+    <w:p>
+      <w:pPr>
+        <w:numPr>
+          <w:ilvl w:val="0"/>
+          <w:numId w:val="8"/>
+        </w:numPr>
+        <w:rPr>
+          <w:lang w:val="en-US"/>
+        </w:rPr>
+      </w:pPr>
+      <w:proofErr w:type="spellStart"/>
+      <w:r>
+        <w:rPr>
+          <w:b/>
+          <w:bCs/>
+          <w:lang w:val="en-US"/>
+        </w:rPr>
+        <w:t>Karşılaşılan</w:t>
+      </w:r>
+      <w:proofErr w:type="spellEnd"/>
+      <w:r>
+        <w:rPr>
+          <w:b/>
+          <w:bCs/>
+          <w:lang w:val="en-US"/>
+        </w:rPr>
+        <w:t xml:space="preserve"> Problem:</w:t>
+      </w:r>
+      <w:r>
+        <w:rPr>
+          <w:lang w:val="en-US"/>
+        </w:rPr>
+        <w:t xml:space="preserve"> Lambda </w:t>
+      </w:r>
+      <w:proofErr w:type="spellStart"/>
+      <w:r>
+        <w:rPr>
+          <w:lang w:val="en-US"/>
+        </w:rPr>
+        <w:t>fonksiyonu</w:t>
+      </w:r>
+      <w:proofErr w:type="spellEnd"/>
+      <w:r>
+        <w:rPr>
+          <w:lang w:val="en-US"/>
+        </w:rPr>
+        <w:t xml:space="preserve"> </w:t>
+      </w:r>
+      <w:proofErr w:type="spellStart"/>
+      <w:r>
+        <w:rPr>
+          <w:lang w:val="en-US"/>
+        </w:rPr>
+        <w:t>Kinesis'ten</w:t>
+      </w:r>
+      <w:proofErr w:type="spellEnd"/>
+      <w:r>
+        <w:rPr>
+          <w:lang w:val="en-US"/>
+        </w:rPr>
+        <w:t xml:space="preserve"> </w:t>
+      </w:r>
+      <w:proofErr w:type="spellStart"/>
+      <w:r>
+        <w:rPr>
+          <w:lang w:val="en-US"/>
+        </w:rPr>
+        <w:t>gelen</w:t>
+      </w:r>
+      <w:proofErr w:type="spellEnd"/>
+      <w:r>
+        <w:rPr>
+          <w:lang w:val="en-US"/>
+        </w:rPr>
+        <w:t xml:space="preserve"> </w:t>
+      </w:r>
+      <w:proofErr w:type="spellStart"/>
+      <w:r>
+        <w:rPr>
+          <w:lang w:val="en-US"/>
+        </w:rPr>
+        <w:t>verileri</w:t>
+      </w:r>
+      <w:proofErr w:type="spellEnd"/>
+      <w:r>
+        <w:rPr>
+          <w:lang w:val="en-US"/>
+        </w:rPr>
+        <w:t xml:space="preserve"> </w:t>
+      </w:r>
+      <w:proofErr w:type="spellStart"/>
+      <w:r>
+        <w:rPr>
+          <w:lang w:val="en-US"/>
+        </w:rPr>
+        <w:t>DynamoDB'ye</w:t>
+      </w:r>
+      <w:proofErr w:type="spellEnd"/>
+      <w:r>
+        <w:rPr>
+          <w:lang w:val="en-US"/>
+        </w:rPr>
+        <w:t xml:space="preserve"> </w:t>
+      </w:r>
+      <w:proofErr w:type="spellStart"/>
+      <w:r>
+        <w:rPr>
+          <w:lang w:val="en-US"/>
+        </w:rPr>
+        <w:t>yazmaya</w:t>
+      </w:r>
+      <w:proofErr w:type="spellEnd"/>
+      <w:r>
+        <w:rPr>
+          <w:lang w:val="en-US"/>
+        </w:rPr>
+        <w:t xml:space="preserve"> </w:t>
+      </w:r>
+      <w:proofErr w:type="spellStart"/>
+      <w:r>
+        <w:rPr>
+          <w:lang w:val="en-US"/>
+        </w:rPr>
+        <w:t>çalışırken</w:t>
+      </w:r>
+      <w:proofErr w:type="spellEnd"/>
+      <w:r>
+        <w:rPr>
+          <w:lang w:val="en-US"/>
+        </w:rPr>
+        <w:t xml:space="preserve"> </w:t>
+      </w:r>
+      <w:proofErr w:type="spellStart"/>
+      <w:r>
+        <w:rPr>
+          <w:lang w:val="en-US"/>
+        </w:rPr>
+        <w:t>TypeError</w:t>
+      </w:r>
+      <w:proofErr w:type="spellEnd"/>
+      <w:r>
+        <w:rPr>
+          <w:lang w:val="en-US"/>
+        </w:rPr>
+        <w:t xml:space="preserve">: Float types are not supported </w:t>
+      </w:r>
+      <w:proofErr w:type="spellStart"/>
+      <w:r>
+        <w:rPr>
+          <w:lang w:val="en-US"/>
+        </w:rPr>
+        <w:t>hatası</w:t>
+      </w:r>
+      <w:proofErr w:type="spellEnd"/>
+      <w:r>
+        <w:rPr>
+          <w:lang w:val="en-US"/>
+        </w:rPr>
+        <w:t xml:space="preserve"> </w:t>
+      </w:r>
+      <w:proofErr w:type="spellStart"/>
+      <w:r>
+        <w:rPr>
+          <w:lang w:val="en-US"/>
+        </w:rPr>
+        <w:t>alınmıştır</w:t>
+      </w:r>
+      <w:proofErr w:type="spellEnd"/>
+      <w:r>
+        <w:rPr>
+          <w:lang w:val="en-US"/>
+        </w:rPr>
+        <w:t>.</w:t>
+      </w:r>
+    </w:p>
+    <w:p>
+      <w:pPr>
+        <w:numPr>
+          <w:ilvl w:val="0"/>
+          <w:numId w:val="8"/>
+        </w:numPr>
+        <w:rPr>
+          <w:lang w:val="en-US"/>
+        </w:rPr>
+      </w:pPr>
+      <w:r>
+        <w:rPr>
+          <w:b/>
+          <w:bCs/>
+          <w:lang w:val="en-US"/>
+        </w:rPr>
+        <w:t>Teknik Analiz:</w:t>
+      </w:r>
+      <w:r>
+        <w:rPr>
+          <w:lang w:val="en-US"/>
+        </w:rPr>
+        <w:t xml:space="preserve"> AWS DynamoDB </w:t>
+      </w:r>
+      <w:proofErr w:type="spellStart"/>
+      <w:r>
+        <w:rPr>
+          <w:lang w:val="en-US"/>
+        </w:rPr>
+        <w:t>servisinin</w:t>
+      </w:r>
+      <w:proofErr w:type="spellEnd"/>
+      <w:r>
+        <w:rPr>
+          <w:lang w:val="en-US"/>
+        </w:rPr>
+        <w:t xml:space="preserve"> </w:t>
+      </w:r>
+      <w:proofErr w:type="spellStart"/>
+      <w:r>
+        <w:rPr>
+          <w:lang w:val="en-US"/>
+        </w:rPr>
+        <w:t>Python'daki</w:t>
+      </w:r>
+      <w:proofErr w:type="spellEnd"/>
+      <w:r>
+        <w:rPr>
+          <w:lang w:val="en-US"/>
+        </w:rPr>
+        <w:t xml:space="preserve"> </w:t>
+      </w:r>
+      <w:proofErr w:type="spellStart"/>
+      <w:r>
+        <w:rPr>
+          <w:lang w:val="en-US"/>
+        </w:rPr>
+        <w:t>standart</w:t>
+      </w:r>
+      <w:proofErr w:type="spellEnd"/>
+      <w:r>
+        <w:rPr>
+          <w:lang w:val="en-US"/>
+        </w:rPr>
+        <w:t xml:space="preserve"> float </w:t>
+      </w:r>
+      <w:proofErr w:type="spellStart"/>
+      <w:r>
+        <w:rPr>
+          <w:lang w:val="en-US"/>
+        </w:rPr>
+        <w:t>veri</w:t>
+      </w:r>
+      <w:proofErr w:type="spellEnd"/>
+      <w:r>
+        <w:rPr>
+          <w:lang w:val="en-US"/>
+        </w:rPr>
+        <w:t xml:space="preserve"> </w:t>
+      </w:r>
+      <w:proofErr w:type="spellStart"/>
+      <w:r>
+        <w:rPr>
+          <w:lang w:val="en-US"/>
+        </w:rPr>
+        <w:t>tipini</w:t>
+      </w:r>
+      <w:proofErr w:type="spellEnd"/>
+      <w:r>
+        <w:rPr>
+          <w:lang w:val="en-US"/>
+        </w:rPr>
+        <w:t xml:space="preserve"> </w:t>
+      </w:r>
+      <w:proofErr w:type="spellStart"/>
+      <w:r>
+        <w:rPr>
+          <w:lang w:val="en-US"/>
+        </w:rPr>
+        <w:t>doğrudan</w:t>
+      </w:r>
+      <w:proofErr w:type="spellEnd"/>
+      <w:r>
+        <w:rPr>
+          <w:lang w:val="en-US"/>
+        </w:rPr>
+        <w:t xml:space="preserve"> </w:t>
+      </w:r>
+      <w:proofErr w:type="spellStart"/>
+      <w:r>
+        <w:rPr>
+          <w:lang w:val="en-US"/>
+        </w:rPr>
+        <w:t>desteklemediği</w:t>
+      </w:r>
+      <w:proofErr w:type="spellEnd"/>
+      <w:r>
+        <w:rPr>
+          <w:lang w:val="en-US"/>
+        </w:rPr>
+        <w:t xml:space="preserve">, </w:t>
+      </w:r>
+      <w:proofErr w:type="spellStart"/>
+      <w:r>
+        <w:rPr>
+          <w:lang w:val="en-US"/>
+        </w:rPr>
+        <w:t>hassas</w:t>
+      </w:r>
+      <w:proofErr w:type="spellEnd"/>
+      <w:r>
+        <w:rPr>
+          <w:lang w:val="en-US"/>
+        </w:rPr>
+        <w:t xml:space="preserve"> </w:t>
+      </w:r>
+      <w:proofErr w:type="spellStart"/>
+      <w:r>
+        <w:rPr>
+          <w:lang w:val="en-US"/>
+        </w:rPr>
+        <w:t>hesaplamalar</w:t>
+      </w:r>
+      <w:proofErr w:type="spellEnd"/>
+      <w:r>
+        <w:rPr>
+          <w:lang w:val="en-US"/>
+        </w:rPr>
+        <w:t xml:space="preserve"> </w:t>
+      </w:r>
+      <w:proofErr w:type="spellStart"/>
+      <w:r>
+        <w:rPr>
+          <w:lang w:val="en-US"/>
+        </w:rPr>
+        <w:t>için</w:t>
+      </w:r>
+      <w:proofErr w:type="spellEnd"/>
+      <w:r>
+        <w:rPr>
+          <w:lang w:val="en-US"/>
+        </w:rPr>
+        <w:t xml:space="preserve"> Decimal </w:t>
+      </w:r>
+      <w:proofErr w:type="spellStart"/>
+      <w:r>
+        <w:rPr>
+          <w:lang w:val="en-US"/>
+        </w:rPr>
+        <w:t>tipini</w:t>
+      </w:r>
+      <w:proofErr w:type="spellEnd"/>
+      <w:r>
+        <w:rPr>
+          <w:lang w:val="en-US"/>
+        </w:rPr>
+        <w:t xml:space="preserve"> </w:t>
+      </w:r>
+      <w:proofErr w:type="spellStart"/>
+      <w:r>
+        <w:rPr>
+          <w:lang w:val="en-US"/>
+        </w:rPr>
+        <w:t>şart</w:t>
+      </w:r>
+      <w:proofErr w:type="spellEnd"/>
+      <w:r>
+        <w:rPr>
+          <w:lang w:val="en-US"/>
+        </w:rPr>
+        <w:t xml:space="preserve"> </w:t>
+      </w:r>
+      <w:proofErr w:type="spellStart"/>
+      <w:r>
+        <w:rPr>
+          <w:lang w:val="en-US"/>
+        </w:rPr>
+        <w:t>koştuğu</w:t>
+      </w:r>
+      <w:proofErr w:type="spellEnd"/>
+      <w:r>
+        <w:rPr>
+          <w:lang w:val="en-US"/>
+        </w:rPr>
+        <w:t xml:space="preserve"> CloudWatch </w:t>
+      </w:r>
+      <w:proofErr w:type="spellStart"/>
+      <w:r>
+        <w:rPr>
+          <w:lang w:val="en-US"/>
+        </w:rPr>
+        <w:t>logları</w:t>
+      </w:r>
+      <w:proofErr w:type="spellEnd"/>
+      <w:r>
+        <w:rPr>
+          <w:lang w:val="en-US"/>
+        </w:rPr>
+        <w:t xml:space="preserve"> </w:t>
+      </w:r>
+      <w:proofErr w:type="spellStart"/>
+      <w:r>
+        <w:rPr>
+          <w:lang w:val="en-US"/>
+        </w:rPr>
+        <w:t>üzerinden</w:t>
+      </w:r>
+      <w:proofErr w:type="spellEnd"/>
+      <w:r>
+        <w:rPr>
+          <w:lang w:val="en-US"/>
+        </w:rPr>
+        <w:t xml:space="preserve"> </w:t>
+      </w:r>
+      <w:proofErr w:type="spellStart"/>
+      <w:r>
+        <w:rPr>
+          <w:lang w:val="en-US"/>
+        </w:rPr>
+        <w:t>tespit</w:t>
+      </w:r>
+      <w:proofErr w:type="spellEnd"/>
+      <w:r>
+        <w:rPr>
+          <w:lang w:val="en-US"/>
+        </w:rPr>
+        <w:t xml:space="preserve"> </w:t>
+      </w:r>
+      <w:proofErr w:type="spellStart"/>
+      <w:r>
+        <w:rPr>
+          <w:lang w:val="en-US"/>
+        </w:rPr>
+        <w:t>edilmiştir</w:t>
+      </w:r>
+      <w:proofErr w:type="spellEnd"/>
+      <w:r>
+        <w:rPr>
+          <w:lang w:val="en-US"/>
+        </w:rPr>
+        <w:t>.</w:t>
+      </w:r>
+    </w:p>
+    <w:p>
+      <w:pPr>
+        <w:numPr>
+          <w:ilvl w:val="0"/>
+          <w:numId w:val="8"/>
+        </w:numPr>
+        <w:rPr>
+          <w:lang w:val="en-US"/>
+        </w:rPr>
+      </w:pPr>
+      <w:proofErr w:type="spellStart"/>
+      <w:r>
+        <w:rPr>
+          <w:b/>
+          <w:bCs/>
+          <w:lang w:val="en-US"/>
+        </w:rPr>
+        <w:t>Çözüm</w:t>
+      </w:r>
+      <w:proofErr w:type="spellEnd"/>
+      <w:r>
+        <w:rPr>
+          <w:b/>
+          <w:bCs/>
+          <w:lang w:val="en-US"/>
+        </w:rPr>
+        <w:t>:</w:t>
+      </w:r>
+      <w:r>
+        <w:rPr>
+          <w:lang w:val="en-US"/>
+        </w:rPr>
+        <w:t xml:space="preserve"> Lambda </w:t>
+      </w:r>
+      <w:proofErr w:type="spellStart"/>
+      <w:r>
+        <w:rPr>
+          <w:lang w:val="en-US"/>
+        </w:rPr>
+        <w:t>fonksiyonuna</w:t>
+      </w:r>
+      <w:proofErr w:type="spellEnd"/>
+      <w:r>
+        <w:rPr>
+          <w:lang w:val="en-US"/>
+        </w:rPr>
+        <w:t xml:space="preserve"> Python decimal </w:t>
+      </w:r>
+      <w:proofErr w:type="spellStart"/>
+      <w:r>
+        <w:rPr>
+          <w:lang w:val="en-US"/>
+        </w:rPr>
+        <w:t>kütüphanesi</w:t>
+      </w:r>
+      <w:proofErr w:type="spellEnd"/>
+      <w:r>
+        <w:rPr>
+          <w:lang w:val="en-US"/>
+        </w:rPr>
+        <w:t xml:space="preserve"> </w:t>
+      </w:r>
+      <w:proofErr w:type="spellStart"/>
+      <w:r>
+        <w:rPr>
+          <w:lang w:val="en-US"/>
+        </w:rPr>
+        <w:t>dahil</w:t>
+      </w:r>
+      <w:proofErr w:type="spellEnd"/>
+      <w:r>
+        <w:rPr>
+          <w:lang w:val="en-US"/>
+        </w:rPr>
+        <w:t xml:space="preserve"> </w:t>
+      </w:r>
+      <w:proofErr w:type="spellStart"/>
+      <w:r>
+        <w:rPr>
+          <w:lang w:val="en-US"/>
+        </w:rPr>
+        <w:t>edilmiş</w:t>
+      </w:r>
+      <w:proofErr w:type="spellEnd"/>
+      <w:r>
+        <w:rPr>
+          <w:lang w:val="en-US"/>
+        </w:rPr>
+        <w:t xml:space="preserve"> </w:t>
+      </w:r>
+      <w:proofErr w:type="spellStart"/>
+      <w:r>
+        <w:rPr>
+          <w:lang w:val="en-US"/>
+        </w:rPr>
+        <w:t>ve</w:t>
+      </w:r>
+      <w:proofErr w:type="spellEnd"/>
+      <w:r>
+        <w:rPr>
+          <w:lang w:val="en-US"/>
+        </w:rPr>
+        <w:t xml:space="preserve"> </w:t>
+      </w:r>
+      <w:proofErr w:type="spellStart"/>
+      <w:proofErr w:type="gramStart"/>
+      <w:r>
+        <w:rPr>
+          <w:lang w:val="en-US"/>
+        </w:rPr>
+        <w:t>json.loads</w:t>
+      </w:r>
+      <w:proofErr w:type="spellEnd"/>
+      <w:proofErr w:type="gramEnd"/>
+      <w:r>
+        <w:rPr>
+          <w:lang w:val="en-US"/>
+        </w:rPr>
+        <w:t xml:space="preserve"> </w:t>
+      </w:r>
+      <w:proofErr w:type="spellStart"/>
+      <w:r>
+        <w:rPr>
+          <w:lang w:val="en-US"/>
+        </w:rPr>
+        <w:t>fonksiyonuna</w:t>
+      </w:r>
+      <w:proofErr w:type="spellEnd"/>
+      <w:r>
+        <w:rPr>
+          <w:lang w:val="en-US"/>
+        </w:rPr>
+        <w:t xml:space="preserve"> </w:t>
+      </w:r>
+      <w:proofErr w:type="spellStart"/>
+      <w:r>
+        <w:rPr>
+          <w:lang w:val="en-US"/>
+        </w:rPr>
+        <w:t>parse_float</w:t>
+      </w:r>
+      <w:proofErr w:type="spellEnd"/>
+      <w:r>
+        <w:rPr>
+          <w:lang w:val="en-US"/>
+        </w:rPr>
+        <w:t xml:space="preserve">=Decimal </w:t>
+      </w:r>
+      <w:proofErr w:type="spellStart"/>
+      <w:r>
+        <w:rPr>
+          <w:lang w:val="en-US"/>
+        </w:rPr>
+        <w:t>parametresi</w:t>
+      </w:r>
+      <w:proofErr w:type="spellEnd"/>
+      <w:r>
+        <w:rPr>
+          <w:lang w:val="en-US"/>
+        </w:rPr>
+        <w:t xml:space="preserve"> </w:t>
+      </w:r>
+      <w:proofErr w:type="spellStart"/>
+      <w:r>
+        <w:rPr>
+          <w:lang w:val="en-US"/>
+        </w:rPr>
+        <w:t>eklenerek</w:t>
+      </w:r>
+      <w:proofErr w:type="spellEnd"/>
+      <w:r>
+        <w:rPr>
+          <w:lang w:val="en-US"/>
+        </w:rPr>
+        <w:t xml:space="preserve"> </w:t>
+      </w:r>
+      <w:proofErr w:type="spellStart"/>
+      <w:r>
+        <w:rPr>
+          <w:lang w:val="en-US"/>
+        </w:rPr>
+        <w:t>veri</w:t>
+      </w:r>
+      <w:proofErr w:type="spellEnd"/>
+      <w:r>
+        <w:rPr>
+          <w:lang w:val="en-US"/>
+        </w:rPr>
+        <w:t xml:space="preserve"> tipi </w:t>
+      </w:r>
+      <w:proofErr w:type="spellStart"/>
+      <w:r>
+        <w:rPr>
+          <w:lang w:val="en-US"/>
+        </w:rPr>
+        <w:t>dönüşümü</w:t>
+      </w:r>
+      <w:proofErr w:type="spellEnd"/>
+      <w:r>
+        <w:rPr>
+          <w:lang w:val="en-US"/>
+        </w:rPr>
+        <w:t xml:space="preserve"> </w:t>
+      </w:r>
+      <w:proofErr w:type="spellStart"/>
+      <w:r>
+        <w:rPr>
+          <w:lang w:val="en-US"/>
+        </w:rPr>
+        <w:t>sağlanmıştır</w:t>
+      </w:r>
+      <w:proofErr w:type="spellEnd"/>
+      <w:r>
+        <w:rPr>
+          <w:lang w:val="en-US"/>
+        </w:rPr>
+        <w:t xml:space="preserve">. * </w:t>
+      </w:r>
+    </w:p>
+    <w:p>
+      <w:pPr>
+        <w:numPr>
+          <w:ilvl w:val="0"/>
+          <w:numId w:val="8"/>
+        </w:numPr>
+        <w:rPr>
+          <w:lang w:val="en-US"/>
+        </w:rPr>
+      </w:pPr>
+      <w:proofErr w:type="spellStart"/>
+      <w:r>
+        <w:rPr>
+          <w:b/>
+          <w:bCs/>
+          <w:lang w:val="en-US"/>
+        </w:rPr>
+        <w:t>Sonuç</w:t>
+      </w:r>
+      <w:proofErr w:type="spellEnd"/>
+      <w:r>
+        <w:rPr>
+          <w:b/>
+          <w:bCs/>
+          <w:lang w:val="en-US"/>
+        </w:rPr>
+        <w:t>:</w:t>
+      </w:r>
+      <w:r>
+        <w:rPr>
+          <w:lang w:val="en-US"/>
+        </w:rPr>
+        <w:t xml:space="preserve"> </w:t>
+      </w:r>
+      <w:proofErr w:type="spellStart"/>
+      <w:r>
+        <w:rPr>
+          <w:lang w:val="en-US"/>
+        </w:rPr>
+        <w:t>Veriler</w:t>
+      </w:r>
+      <w:proofErr w:type="spellEnd"/>
+      <w:r>
+        <w:rPr>
+          <w:lang w:val="en-US"/>
+        </w:rPr>
+        <w:t xml:space="preserve"> </w:t>
+      </w:r>
+      <w:proofErr w:type="spellStart"/>
+      <w:r>
+        <w:rPr>
+          <w:lang w:val="en-US"/>
+        </w:rPr>
+        <w:t>başarılı</w:t>
+      </w:r>
+      <w:proofErr w:type="spellEnd"/>
+      <w:r>
+        <w:rPr>
+          <w:lang w:val="en-US"/>
+        </w:rPr>
+        <w:t xml:space="preserve"> </w:t>
+      </w:r>
+      <w:proofErr w:type="spellStart"/>
+      <w:r>
+        <w:rPr>
+          <w:lang w:val="en-US"/>
+        </w:rPr>
+        <w:t>bir</w:t>
+      </w:r>
+      <w:proofErr w:type="spellEnd"/>
+      <w:r>
+        <w:rPr>
+          <w:lang w:val="en-US"/>
+        </w:rPr>
+        <w:t xml:space="preserve"> </w:t>
+      </w:r>
+      <w:proofErr w:type="spellStart"/>
+      <w:r>
+        <w:rPr>
+          <w:lang w:val="en-US"/>
+        </w:rPr>
+        <w:t>şekilde</w:t>
+      </w:r>
+      <w:proofErr w:type="spellEnd"/>
+      <w:r>
+        <w:rPr>
+          <w:lang w:val="en-US"/>
+        </w:rPr>
+        <w:t xml:space="preserve"> DynamoDB </w:t>
+      </w:r>
+      <w:proofErr w:type="spellStart"/>
+      <w:r>
+        <w:rPr>
+          <w:lang w:val="en-US"/>
+        </w:rPr>
+        <w:t>tablosuna</w:t>
+      </w:r>
+      <w:proofErr w:type="spellEnd"/>
+      <w:r>
+        <w:rPr>
+          <w:lang w:val="en-US"/>
+        </w:rPr>
+        <w:t xml:space="preserve"> "</w:t>
+      </w:r>
+      <w:proofErr w:type="spellStart"/>
+      <w:r>
+        <w:rPr>
+          <w:lang w:val="en-US"/>
+        </w:rPr>
+        <w:t>sensor_id</w:t>
+      </w:r>
+      <w:proofErr w:type="spellEnd"/>
+      <w:r>
+        <w:rPr>
+          <w:lang w:val="en-US"/>
+        </w:rPr>
+        <w:t xml:space="preserve">" </w:t>
+      </w:r>
+      <w:proofErr w:type="spellStart"/>
+      <w:r>
+        <w:rPr>
+          <w:lang w:val="en-US"/>
+        </w:rPr>
+        <w:t>ve</w:t>
+      </w:r>
+      <w:proofErr w:type="spellEnd"/>
+      <w:r>
+        <w:rPr>
+          <w:lang w:val="en-US"/>
+        </w:rPr>
+        <w:t xml:space="preserve"> "timestamp" </w:t>
+      </w:r>
+      <w:proofErr w:type="spellStart"/>
+      <w:r>
+        <w:rPr>
+          <w:lang w:val="en-US"/>
+        </w:rPr>
+        <w:t>anahtarlarıyla</w:t>
+      </w:r>
+      <w:proofErr w:type="spellEnd"/>
+      <w:r>
+        <w:rPr>
+          <w:lang w:val="en-US"/>
+        </w:rPr>
+        <w:t xml:space="preserve"> </w:t>
+      </w:r>
+      <w:proofErr w:type="spellStart"/>
+      <w:r>
+        <w:rPr>
+          <w:lang w:val="en-US"/>
+        </w:rPr>
+        <w:t>kaydedilmeye</w:t>
+      </w:r>
+      <w:proofErr w:type="spellEnd"/>
+      <w:r>
+        <w:rPr>
+          <w:lang w:val="en-US"/>
+        </w:rPr>
+        <w:t xml:space="preserve"> </w:t>
+      </w:r>
+      <w:proofErr w:type="spellStart"/>
+      <w:r>
+        <w:rPr>
+          <w:lang w:val="en-US"/>
+        </w:rPr>
+        <w:t>başlanmıştır</w:t>
+      </w:r>
+      <w:proofErr w:type="spellEnd"/>
+      <w:r>
+        <w:rPr>
+          <w:lang w:val="en-US"/>
+        </w:rPr>
+        <w:t xml:space="preserve">. </w:t>
+      </w:r>
+    </w:p>
+    <w:p/>
+    <w:p>
+      <w:r>
         <w:t>Resimler:</w:t>
       </w:r>
     </w:p>
+    <w:p>
+      <w:r>
+        <w:drawing>
+          <wp:inline distT="0" distB="0" distL="0" distR="0" wp14:anchorId="79679687" wp14:editId="2571307F">
+            <wp:extent cx="5760720" cy="2824480"/>
+            <wp:effectExtent l="0" t="0" r="0" b="0"/>
+            <wp:docPr id="1577918234" name="Resim 1" descr="metin, yazılım, bilgisayar simgesi, web sayfası içeren bir resim&#10;&#10;Yapay zeka tarafından oluşturulmuş içerik yanlış olabilir."/>
+            <wp:cNvGraphicFramePr>
+              <a:graphicFrameLocks xmlns:a="http://schemas.openxmlformats.org/drawingml/2006/main" noChangeAspect="1"/>
+            </wp:cNvGraphicFramePr>
+            <a:graphic xmlns:a="http://schemas.openxmlformats.org/drawingml/2006/main">
+              <a:graphicData uri="http://schemas.openxmlformats.org/drawingml/2006/picture">
+                <pic:pic xmlns:pic="http://schemas.openxmlformats.org/drawingml/2006/picture">
+                  <pic:nvPicPr>
+                    <pic:cNvPr id="1577918234" name="Resim 1" descr="metin, yazılım, bilgisayar simgesi, web sayfası içeren bir resim&#10;&#10;Yapay zeka tarafından oluşturulmuş içerik yanlış olabilir."/>
+                    <pic:cNvPicPr/>
+                  </pic:nvPicPr>
+                  <pic:blipFill>
+                    <a:blip r:embed="rId25"/>
+                    <a:stretch>
+                      <a:fillRect/>
+                    </a:stretch>
+                  </pic:blipFill>
+                  <pic:spPr>
+                    <a:xfrm>
+                      <a:off x="0" y="0"/>
+                      <a:ext cx="5760720" cy="2824480"/>
+                    </a:xfrm>
+                    <a:prstGeom prst="rect">
+                      <a:avLst/>
+                    </a:prstGeom>
+                  </pic:spPr>
+                </pic:pic>
+              </a:graphicData>
+            </a:graphic>
+          </wp:inline>
+        </w:drawing>
+      </w:r>
+    </w:p>
+    <w:p>
+      <w:r>
+        <w:drawing>
+          <wp:inline distT="0" distB="0" distL="0" distR="0" wp14:anchorId="696A24E3" wp14:editId="02A44693">
+            <wp:extent cx="5760720" cy="2575560"/>
+            <wp:effectExtent l="0" t="0" r="0" b="0"/>
+            <wp:docPr id="2073580686" name="Resim 1" descr="metin, yazılım, web sayfası, bilgisayar simgesi içeren bir resim&#10;&#10;Yapay zeka tarafından oluşturulmuş içerik yanlış olabilir."/>
+            <wp:cNvGraphicFramePr>
+              <a:graphicFrameLocks xmlns:a="http://schemas.openxmlformats.org/drawingml/2006/main" noChangeAspect="1"/>
+            </wp:cNvGraphicFramePr>
+            <a:graphic xmlns:a="http://schemas.openxmlformats.org/drawingml/2006/main">
+              <a:graphicData uri="http://schemas.openxmlformats.org/drawingml/2006/picture">
+                <pic:pic xmlns:pic="http://schemas.openxmlformats.org/drawingml/2006/picture">
+                  <pic:nvPicPr>
+                    <pic:cNvPr id="2073580686" name="Resim 1" descr="metin, yazılım, web sayfası, bilgisayar simgesi içeren bir resim&#10;&#10;Yapay zeka tarafından oluşturulmuş içerik yanlış olabilir."/>
+                    <pic:cNvPicPr/>
+                  </pic:nvPicPr>
+                  <pic:blipFill>
+                    <a:blip r:embed="rId26"/>
+                    <a:stretch>
+                      <a:fillRect/>
+                    </a:stretch>
+                  </pic:blipFill>
+                  <pic:spPr>
+                    <a:xfrm>
+                      <a:off x="0" y="0"/>
+                      <a:ext cx="5760720" cy="2575560"/>
+                    </a:xfrm>
+                    <a:prstGeom prst="rect">
+                      <a:avLst/>
+                    </a:prstGeom>
+                  </pic:spPr>
+                </pic:pic>
+              </a:graphicData>
+            </a:graphic>
+          </wp:inline>
+        </w:drawing>
+      </w:r>
+    </w:p>
+    <w:p>
+      <w:r>
+        <w:lastRenderedPageBreak/>
+        <w:drawing>
+          <wp:inline distT="0" distB="0" distL="0" distR="0" wp14:anchorId="42AC00D0" wp14:editId="156D92EC">
+            <wp:extent cx="5760720" cy="3432175"/>
+            <wp:effectExtent l="0" t="0" r="0" b="0"/>
+            <wp:docPr id="842033553" name="Resim 1" descr="metin, ekran görüntüsü, yazılım, bilgisayar simgesi içeren bir resim&#10;&#10;Yapay zeka tarafından oluşturulmuş içerik yanlış olabilir."/>
+            <wp:cNvGraphicFramePr>
+              <a:graphicFrameLocks xmlns:a="http://schemas.openxmlformats.org/drawingml/2006/main" noChangeAspect="1"/>
+            </wp:cNvGraphicFramePr>
+            <a:graphic xmlns:a="http://schemas.openxmlformats.org/drawingml/2006/main">
+              <a:graphicData uri="http://schemas.openxmlformats.org/drawingml/2006/picture">
+                <pic:pic xmlns:pic="http://schemas.openxmlformats.org/drawingml/2006/picture">
+                  <pic:nvPicPr>
+                    <pic:cNvPr id="842033553" name="Resim 1" descr="metin, ekran görüntüsü, yazılım, bilgisayar simgesi içeren bir resim&#10;&#10;Yapay zeka tarafından oluşturulmuş içerik yanlış olabilir."/>
+                    <pic:cNvPicPr/>
+                  </pic:nvPicPr>
+                  <pic:blipFill>
+                    <a:blip r:embed="rId27"/>
+                    <a:stretch>
+                      <a:fillRect/>
+                    </a:stretch>
+                  </pic:blipFill>
+                  <pic:spPr>
+                    <a:xfrm>
+                      <a:off x="0" y="0"/>
+                      <a:ext cx="5760720" cy="3432175"/>
+                    </a:xfrm>
+                    <a:prstGeom prst="rect">
+                      <a:avLst/>
+                    </a:prstGeom>
+                  </pic:spPr>
+                </pic:pic>
+              </a:graphicData>
+            </a:graphic>
+          </wp:inline>
+        </w:drawing>
+      </w:r>
+    </w:p>
+    <w:p>
+      <w:r>
+        <w:drawing>
+          <wp:inline distT="0" distB="0" distL="0" distR="0" wp14:anchorId="7FDF6F86" wp14:editId="21A935B5">
+            <wp:extent cx="5760720" cy="2807970"/>
+            <wp:effectExtent l="0" t="0" r="0" b="0"/>
+            <wp:docPr id="144700205" name="Resim 1" descr="metin, ekran görüntüsü, yazılım, bilgisayar simgesi içeren bir resim&#10;&#10;Yapay zeka tarafından oluşturulmuş içerik yanlış olabilir."/>
+            <wp:cNvGraphicFramePr>
+              <a:graphicFrameLocks xmlns:a="http://schemas.openxmlformats.org/drawingml/2006/main" noChangeAspect="1"/>
+            </wp:cNvGraphicFramePr>
+            <a:graphic xmlns:a="http://schemas.openxmlformats.org/drawingml/2006/main">
+              <a:graphicData uri="http://schemas.openxmlformats.org/drawingml/2006/picture">
+                <pic:pic xmlns:pic="http://schemas.openxmlformats.org/drawingml/2006/picture">
+                  <pic:nvPicPr>
+                    <pic:cNvPr id="144700205" name="Resim 1" descr="metin, ekran görüntüsü, yazılım, bilgisayar simgesi içeren bir resim&#10;&#10;Yapay zeka tarafından oluşturulmuş içerik yanlış olabilir."/>
+                    <pic:cNvPicPr/>
+                  </pic:nvPicPr>
+                  <pic:blipFill>
+                    <a:blip r:embed="rId28"/>
+                    <a:stretch>
+                      <a:fillRect/>
+                    </a:stretch>
+                  </pic:blipFill>
+                  <pic:spPr>
+                    <a:xfrm>
+                      <a:off x="0" y="0"/>
+                      <a:ext cx="5760720" cy="2807970"/>
+                    </a:xfrm>
+                    <a:prstGeom prst="rect">
+                      <a:avLst/>
+                    </a:prstGeom>
+                  </pic:spPr>
+                </pic:pic>
+              </a:graphicData>
+            </a:graphic>
+          </wp:inline>
+        </w:drawing>
+      </w:r>
+    </w:p>
+    <w:p/>
+    <w:p/>
+    <w:p/>
+    <w:p/>
+    <w:p/>
+    <w:p/>
+    <w:p/>
+    <w:p/>
     <w:p/>
     <w:sectPr>
       <w:pgSz w:w="11906" w:h="16838"/>
@@ -7365,9 +8513,9 @@
 <file path=word/numbering.xml><?xml version="1.0" encoding="utf-8"?>
 <w:numbering xmlns:wpc="http://schemas.microsoft.com/office/word/2010/wordprocessingCanvas" xmlns:cx="http://schemas.microsoft.com/office/drawing/2014/chartex" xmlns:cx1="http://schemas.microsoft.com/office/drawing/2015/9/8/chartex" xmlns:cx2="http://schemas.microsoft.com/office/drawing/2015/10/21/chartex" xmlns:cx3="http://schemas.microsoft.com/office/drawing/2016/5/9/chartex" xmlns:cx4="http://schemas.microsoft.com/office/drawing/2016/5/10/chartex" xmlns:cx5="http://schemas.microsoft.com/office/drawing/2016/5/11/chartex" xmlns:cx6="http://schemas.microsoft.com/office/drawing/2016/5/12/chartex" xmlns:cx7="http://schemas.microsoft.com/office/drawing/2016/5/13/chartex" xmlns:cx8="http://schemas.microsoft.com/office/drawing/2016/5/14/chartex" xmlns:mc="http://schemas.openxmlformats.org/markup-compatibility/2006" xmlns:aink="http://schemas.microsoft.com/office/drawing/2016/ink" xmlns:am3d="http://schemas.microsoft.com/office/drawing/2017/model3d" xmlns:o="urn:schemas-microsoft-com:office:office" xmlns:oel="http://schemas.microsoft.com/office/2019/extlst" xmlns:r="http://schemas.openxmlformats.org/officeDocument/2006/relationships" xmlns:m="http://schemas.openxmlformats.org/officeDocument/2006/math" xmlns:v="urn:schemas-microsoft-com:vml" xmlns:wp14="http://schemas.microsoft.com/office/word/2010/wordprocessingDrawing" xmlns:wp="http://schemas.openxmlformats.org/drawingml/2006/wordprocessingDrawing" xmlns:w10="urn:schemas-microsoft-com:office:word" xmlns:w="http://schemas.openxmlformats.org/wordprocessingml/2006/main" xmlns:w14="http://schemas.microsoft.com/office/word/2010/wordml" xmlns:w15="http://schemas.microsoft.com/office/word/2012/wordml" xmlns:w16cex="http://schemas.microsoft.com/office/word/2018/wordml/cex" xmlns:w16cid="http://schemas.microsoft.com/office/word/2016/wordml/cid" xmlns:w16="http://schemas.microsoft.com/office/word/2018/wordml" xmlns:w16du="http://schemas.microsoft.com/office/word/2023/wordml/word16du" xmlns:w16sdtdh="http://schemas.microsoft.com/office/word/2020/wordml/sdtdatahash" xmlns:w16sdtfl="http://schemas.microsoft.com/office/word/2024/wordml/sdtformatlock" xmlns:w16se="http://schemas.microsoft.com/office/word/2015/wordml/symex" xmlns:wpg="http://schemas.microsoft.com/office/word/2010/wordprocessingGroup" xmlns:wpi="http://schemas.microsoft.com/office/word/2010/wordprocessingInk" xmlns:wne="http://schemas.microsoft.com/office/word/2006/wordml" xmlns:wps="http://schemas.microsoft.com/office/word/2010/wordprocessingShape" mc:Ignorable="w14 w15 w16se w16cid w16 w16cex w16sdtdh w16sdtfl w16du wp14">
   <w:abstractNum w:abstractNumId="0" w15:restartNumberingAfterBreak="0">
-    <w:nsid w:val="1D545E45"/>
+    <w:nsid w:val="04027851"/>
     <w:multiLevelType w:val="multilevel"/>
-    <w:tmpl w:val="A8ECE2D8"/>
+    <w:tmpl w:val="F86E4A08"/>
     <w:lvl w:ilvl="0">
       <w:start w:val="1"/>
       <w:numFmt w:val="bullet"/>
@@ -7514,9 +8662,9 @@
     </w:lvl>
   </w:abstractNum>
   <w:abstractNum w:abstractNumId="1" w15:restartNumberingAfterBreak="0">
-    <w:nsid w:val="46FE52E8"/>
+    <w:nsid w:val="1D545E45"/>
     <w:multiLevelType w:val="multilevel"/>
-    <w:tmpl w:val="C04486B8"/>
+    <w:tmpl w:val="A8ECE2D8"/>
     <w:lvl w:ilvl="0">
       <w:start w:val="1"/>
       <w:numFmt w:val="bullet"/>
@@ -7663,9 +8811,9 @@
     </w:lvl>
   </w:abstractNum>
   <w:abstractNum w:abstractNumId="2" w15:restartNumberingAfterBreak="0">
-    <w:nsid w:val="47902DFC"/>
+    <w:nsid w:val="46FE52E8"/>
     <w:multiLevelType w:val="multilevel"/>
-    <w:tmpl w:val="D6C84CFE"/>
+    <w:tmpl w:val="C04486B8"/>
     <w:lvl w:ilvl="0">
       <w:start w:val="1"/>
       <w:numFmt w:val="bullet"/>
@@ -7812,122 +8960,9 @@
     </w:lvl>
   </w:abstractNum>
   <w:abstractNum w:abstractNumId="3" w15:restartNumberingAfterBreak="0">
-    <w:nsid w:val="4A9F0AF8"/>
+    <w:nsid w:val="47902DFC"/>
     <w:multiLevelType w:val="multilevel"/>
-    <w:tmpl w:val="04A0C2B2"/>
-    <w:lvl w:ilvl="0">
-      <w:start w:val="1"/>
-      <w:numFmt w:val="decimal"/>
-      <w:lvlText w:val="%1."/>
-      <w:lvlJc w:val="left"/>
-      <w:pPr>
-        <w:tabs>
-          <w:tab w:val="num" w:pos="720"/>
-        </w:tabs>
-        <w:ind w:left="720" w:hanging="360"/>
-      </w:pPr>
-    </w:lvl>
-    <w:lvl w:ilvl="1" w:tentative="1">
-      <w:start w:val="1"/>
-      <w:numFmt w:val="decimal"/>
-      <w:lvlText w:val="%2."/>
-      <w:lvlJc w:val="left"/>
-      <w:pPr>
-        <w:tabs>
-          <w:tab w:val="num" w:pos="1440"/>
-        </w:tabs>
-        <w:ind w:left="1440" w:hanging="360"/>
-      </w:pPr>
-    </w:lvl>
-    <w:lvl w:ilvl="2" w:tentative="1">
-      <w:start w:val="1"/>
-      <w:numFmt w:val="decimal"/>
-      <w:lvlText w:val="%3."/>
-      <w:lvlJc w:val="left"/>
-      <w:pPr>
-        <w:tabs>
-          <w:tab w:val="num" w:pos="2160"/>
-        </w:tabs>
-        <w:ind w:left="2160" w:hanging="360"/>
-      </w:pPr>
-    </w:lvl>
-    <w:lvl w:ilvl="3" w:tentative="1">
-      <w:start w:val="1"/>
-      <w:numFmt w:val="decimal"/>
-      <w:lvlText w:val="%4."/>
-      <w:lvlJc w:val="left"/>
-      <w:pPr>
-        <w:tabs>
-          <w:tab w:val="num" w:pos="2880"/>
-        </w:tabs>
-        <w:ind w:left="2880" w:hanging="360"/>
-      </w:pPr>
-    </w:lvl>
-    <w:lvl w:ilvl="4" w:tentative="1">
-      <w:start w:val="1"/>
-      <w:numFmt w:val="decimal"/>
-      <w:lvlText w:val="%5."/>
-      <w:lvlJc w:val="left"/>
-      <w:pPr>
-        <w:tabs>
-          <w:tab w:val="num" w:pos="3600"/>
-        </w:tabs>
-        <w:ind w:left="3600" w:hanging="360"/>
-      </w:pPr>
-    </w:lvl>
-    <w:lvl w:ilvl="5" w:tentative="1">
-      <w:start w:val="1"/>
-      <w:numFmt w:val="decimal"/>
-      <w:lvlText w:val="%6."/>
-      <w:lvlJc w:val="left"/>
-      <w:pPr>
-        <w:tabs>
-          <w:tab w:val="num" w:pos="4320"/>
-        </w:tabs>
-        <w:ind w:left="4320" w:hanging="360"/>
-      </w:pPr>
-    </w:lvl>
-    <w:lvl w:ilvl="6" w:tentative="1">
-      <w:start w:val="1"/>
-      <w:numFmt w:val="decimal"/>
-      <w:lvlText w:val="%7."/>
-      <w:lvlJc w:val="left"/>
-      <w:pPr>
-        <w:tabs>
-          <w:tab w:val="num" w:pos="5040"/>
-        </w:tabs>
-        <w:ind w:left="5040" w:hanging="360"/>
-      </w:pPr>
-    </w:lvl>
-    <w:lvl w:ilvl="7" w:tentative="1">
-      <w:start w:val="1"/>
-      <w:numFmt w:val="decimal"/>
-      <w:lvlText w:val="%8."/>
-      <w:lvlJc w:val="left"/>
-      <w:pPr>
-        <w:tabs>
-          <w:tab w:val="num" w:pos="5760"/>
-        </w:tabs>
-        <w:ind w:left="5760" w:hanging="360"/>
-      </w:pPr>
-    </w:lvl>
-    <w:lvl w:ilvl="8" w:tentative="1">
-      <w:start w:val="1"/>
-      <w:numFmt w:val="decimal"/>
-      <w:lvlText w:val="%9."/>
-      <w:lvlJc w:val="left"/>
-      <w:pPr>
-        <w:tabs>
-          <w:tab w:val="num" w:pos="6480"/>
-        </w:tabs>
-        <w:ind w:left="6480" w:hanging="360"/>
-      </w:pPr>
-    </w:lvl>
-  </w:abstractNum>
-  <w:abstractNum w:abstractNumId="4" w15:restartNumberingAfterBreak="0">
-    <w:nsid w:val="55043113"/>
-    <w:multiLevelType w:val="multilevel"/>
-    <w:tmpl w:val="E7E25EA0"/>
+    <w:tmpl w:val="D6C84CFE"/>
     <w:lvl w:ilvl="0">
       <w:start w:val="1"/>
       <w:numFmt w:val="bullet"/>
@@ -8073,10 +9108,123 @@
       </w:rPr>
     </w:lvl>
   </w:abstractNum>
+  <w:abstractNum w:abstractNumId="4" w15:restartNumberingAfterBreak="0">
+    <w:nsid w:val="4A9F0AF8"/>
+    <w:multiLevelType w:val="multilevel"/>
+    <w:tmpl w:val="04A0C2B2"/>
+    <w:lvl w:ilvl="0">
+      <w:start w:val="1"/>
+      <w:numFmt w:val="decimal"/>
+      <w:lvlText w:val="%1."/>
+      <w:lvlJc w:val="left"/>
+      <w:pPr>
+        <w:tabs>
+          <w:tab w:val="num" w:pos="720"/>
+        </w:tabs>
+        <w:ind w:left="720" w:hanging="360"/>
+      </w:pPr>
+    </w:lvl>
+    <w:lvl w:ilvl="1" w:tentative="1">
+      <w:start w:val="1"/>
+      <w:numFmt w:val="decimal"/>
+      <w:lvlText w:val="%2."/>
+      <w:lvlJc w:val="left"/>
+      <w:pPr>
+        <w:tabs>
+          <w:tab w:val="num" w:pos="1440"/>
+        </w:tabs>
+        <w:ind w:left="1440" w:hanging="360"/>
+      </w:pPr>
+    </w:lvl>
+    <w:lvl w:ilvl="2" w:tentative="1">
+      <w:start w:val="1"/>
+      <w:numFmt w:val="decimal"/>
+      <w:lvlText w:val="%3."/>
+      <w:lvlJc w:val="left"/>
+      <w:pPr>
+        <w:tabs>
+          <w:tab w:val="num" w:pos="2160"/>
+        </w:tabs>
+        <w:ind w:left="2160" w:hanging="360"/>
+      </w:pPr>
+    </w:lvl>
+    <w:lvl w:ilvl="3" w:tentative="1">
+      <w:start w:val="1"/>
+      <w:numFmt w:val="decimal"/>
+      <w:lvlText w:val="%4."/>
+      <w:lvlJc w:val="left"/>
+      <w:pPr>
+        <w:tabs>
+          <w:tab w:val="num" w:pos="2880"/>
+        </w:tabs>
+        <w:ind w:left="2880" w:hanging="360"/>
+      </w:pPr>
+    </w:lvl>
+    <w:lvl w:ilvl="4" w:tentative="1">
+      <w:start w:val="1"/>
+      <w:numFmt w:val="decimal"/>
+      <w:lvlText w:val="%5."/>
+      <w:lvlJc w:val="left"/>
+      <w:pPr>
+        <w:tabs>
+          <w:tab w:val="num" w:pos="3600"/>
+        </w:tabs>
+        <w:ind w:left="3600" w:hanging="360"/>
+      </w:pPr>
+    </w:lvl>
+    <w:lvl w:ilvl="5" w:tentative="1">
+      <w:start w:val="1"/>
+      <w:numFmt w:val="decimal"/>
+      <w:lvlText w:val="%6."/>
+      <w:lvlJc w:val="left"/>
+      <w:pPr>
+        <w:tabs>
+          <w:tab w:val="num" w:pos="4320"/>
+        </w:tabs>
+        <w:ind w:left="4320" w:hanging="360"/>
+      </w:pPr>
+    </w:lvl>
+    <w:lvl w:ilvl="6" w:tentative="1">
+      <w:start w:val="1"/>
+      <w:numFmt w:val="decimal"/>
+      <w:lvlText w:val="%7."/>
+      <w:lvlJc w:val="left"/>
+      <w:pPr>
+        <w:tabs>
+          <w:tab w:val="num" w:pos="5040"/>
+        </w:tabs>
+        <w:ind w:left="5040" w:hanging="360"/>
+      </w:pPr>
+    </w:lvl>
+    <w:lvl w:ilvl="7" w:tentative="1">
+      <w:start w:val="1"/>
+      <w:numFmt w:val="decimal"/>
+      <w:lvlText w:val="%8."/>
+      <w:lvlJc w:val="left"/>
+      <w:pPr>
+        <w:tabs>
+          <w:tab w:val="num" w:pos="5760"/>
+        </w:tabs>
+        <w:ind w:left="5760" w:hanging="360"/>
+      </w:pPr>
+    </w:lvl>
+    <w:lvl w:ilvl="8" w:tentative="1">
+      <w:start w:val="1"/>
+      <w:numFmt w:val="decimal"/>
+      <w:lvlText w:val="%9."/>
+      <w:lvlJc w:val="left"/>
+      <w:pPr>
+        <w:tabs>
+          <w:tab w:val="num" w:pos="6480"/>
+        </w:tabs>
+        <w:ind w:left="6480" w:hanging="360"/>
+      </w:pPr>
+    </w:lvl>
+  </w:abstractNum>
   <w:abstractNum w:abstractNumId="5" w15:restartNumberingAfterBreak="0">
-    <w:nsid w:val="6FD346D4"/>
+    <w:nsid w:val="55043113"/>
     <w:multiLevelType w:val="multilevel"/>
-    <w:tmpl w:val="D22A3B84"/>
+    <w:tmpl w:val="E7E25EA0"/>
     <w:lvl w:ilvl="0">
       <w:start w:val="1"/>
       <w:numFmt w:val="bullet"/>
@@ -8222,23 +9370,327 @@
       </w:rPr>
     </w:lvl>
   </w:abstractNum>
+  <w:abstractNum w:abstractNumId="6" w15:restartNumberingAfterBreak="0">
+    <w:nsid w:val="6FD346D4"/>
+    <w:multiLevelType w:val="multilevel"/>
+    <w:tmpl w:val="D22A3B84"/>
+    <w:lvl w:ilvl="0">
+      <w:start w:val="1"/>
+      <w:numFmt w:val="bullet"/>
+      <w:lvlText w:val=""/>
+      <w:lvlJc w:val="left"/>
+      <w:pPr>
+        <w:tabs>
+          <w:tab w:val="num" w:pos="720"/>
+        </w:tabs>
+        <w:ind w:left="720" w:hanging="360"/>
+      </w:pPr>
+      <w:rPr>
+        <w:rFonts w:ascii="Symbol" w:hAnsi="Symbol" w:hint="default"/>
+        <w:sz w:val="20"/>
+      </w:rPr>
+    </w:lvl>
+    <w:lvl w:ilvl="1" w:tentative="1">
+      <w:start w:val="1"/>
+      <w:numFmt w:val="bullet"/>
+      <w:lvlText w:val="o"/>
+      <w:lvlJc w:val="left"/>
+      <w:pPr>
+        <w:tabs>
+          <w:tab w:val="num" w:pos="1440"/>
+        </w:tabs>
+        <w:ind w:left="1440" w:hanging="360"/>
+      </w:pPr>
+      <w:rPr>
+        <w:rFonts w:ascii="Courier New" w:hAnsi="Courier New" w:hint="default"/>
+        <w:sz w:val="20"/>
+      </w:rPr>
+    </w:lvl>
+    <w:lvl w:ilvl="2" w:tentative="1">
+      <w:start w:val="1"/>
+      <w:numFmt w:val="bullet"/>
+      <w:lvlText w:val=""/>
+      <w:lvlJc w:val="left"/>
+      <w:pPr>
+        <w:tabs>
+          <w:tab w:val="num" w:pos="2160"/>
+        </w:tabs>
+        <w:ind w:left="2160" w:hanging="360"/>
+      </w:pPr>
+      <w:rPr>
+        <w:rFonts w:ascii="Wingdings" w:hAnsi="Wingdings" w:hint="default"/>
+        <w:sz w:val="20"/>
+      </w:rPr>
+    </w:lvl>
+    <w:lvl w:ilvl="3" w:tentative="1">
+      <w:start w:val="1"/>
+      <w:numFmt w:val="bullet"/>
+      <w:lvlText w:val=""/>
+      <w:lvlJc w:val="left"/>
+      <w:pPr>
+        <w:tabs>
+          <w:tab w:val="num" w:pos="2880"/>
+        </w:tabs>
+        <w:ind w:left="2880" w:hanging="360"/>
+      </w:pPr>
+      <w:rPr>
+        <w:rFonts w:ascii="Wingdings" w:hAnsi="Wingdings" w:hint="default"/>
+        <w:sz w:val="20"/>
+      </w:rPr>
+    </w:lvl>
+    <w:lvl w:ilvl="4" w:tentative="1">
+      <w:start w:val="1"/>
+      <w:numFmt w:val="bullet"/>
+      <w:lvlText w:val=""/>
+      <w:lvlJc w:val="left"/>
+      <w:pPr>
+        <w:tabs>
+          <w:tab w:val="num" w:pos="3600"/>
+        </w:tabs>
+        <w:ind w:left="3600" w:hanging="360"/>
+      </w:pPr>
+      <w:rPr>
+        <w:rFonts w:ascii="Wingdings" w:hAnsi="Wingdings" w:hint="default"/>
+        <w:sz w:val="20"/>
+      </w:rPr>
+    </w:lvl>
+    <w:lvl w:ilvl="5" w:tentative="1">
+      <w:start w:val="1"/>
+      <w:numFmt w:val="bullet"/>
+      <w:lvlText w:val=""/>
+      <w:lvlJc w:val="left"/>
+      <w:pPr>
+        <w:tabs>
+          <w:tab w:val="num" w:pos="4320"/>
+        </w:tabs>
+        <w:ind w:left="4320" w:hanging="360"/>
+      </w:pPr>
+      <w:rPr>
+        <w:rFonts w:ascii="Wingdings" w:hAnsi="Wingdings" w:hint="default"/>
+        <w:sz w:val="20"/>
+      </w:rPr>
+    </w:lvl>
+    <w:lvl w:ilvl="6" w:tentative="1">
+      <w:start w:val="1"/>
+      <w:numFmt w:val="bullet"/>
+      <w:lvlText w:val=""/>
+      <w:lvlJc w:val="left"/>
+      <w:pPr>
+        <w:tabs>
+          <w:tab w:val="num" w:pos="5040"/>
+        </w:tabs>
+        <w:ind w:left="5040" w:hanging="360"/>
+      </w:pPr>
+      <w:rPr>
+        <w:rFonts w:ascii="Wingdings" w:hAnsi="Wingdings" w:hint="default"/>
+        <w:sz w:val="20"/>
+      </w:rPr>
+    </w:lvl>
+    <w:lvl w:ilvl="7" w:tentative="1">
+      <w:start w:val="1"/>
+      <w:numFmt w:val="bullet"/>
+      <w:lvlText w:val=""/>
+      <w:lvlJc w:val="left"/>
+      <w:pPr>
+        <w:tabs>
+          <w:tab w:val="num" w:pos="5760"/>
+        </w:tabs>
+        <w:ind w:left="5760" w:hanging="360"/>
+      </w:pPr>
+      <w:rPr>
+        <w:rFonts w:ascii="Wingdings" w:hAnsi="Wingdings" w:hint="default"/>
+        <w:sz w:val="20"/>
+      </w:rPr>
+    </w:lvl>
+    <w:lvl w:ilvl="8" w:tentative="1">
+      <w:start w:val="1"/>
+      <w:numFmt w:val="bullet"/>
+      <w:lvlText w:val=""/>
+      <w:lvlJc w:val="left"/>
+      <w:pPr>
+        <w:tabs>
+          <w:tab w:val="num" w:pos="6480"/>
+        </w:tabs>
+        <w:ind w:left="6480" w:hanging="360"/>
+      </w:pPr>
+      <w:rPr>
+        <w:rFonts w:ascii="Wingdings" w:hAnsi="Wingdings" w:hint="default"/>
+        <w:sz w:val="20"/>
+      </w:rPr>
+    </w:lvl>
+  </w:abstractNum>
+  <w:abstractNum w:abstractNumId="7" w15:restartNumberingAfterBreak="0">
+    <w:nsid w:val="73C116A6"/>
+    <w:multiLevelType w:val="multilevel"/>
+    <w:tmpl w:val="23DCF378"/>
+    <w:lvl w:ilvl="0">
+      <w:start w:val="1"/>
+      <w:numFmt w:val="bullet"/>
+      <w:lvlText w:val=""/>
+      <w:lvlJc w:val="left"/>
+      <w:pPr>
+        <w:tabs>
+          <w:tab w:val="num" w:pos="720"/>
+        </w:tabs>
+        <w:ind w:left="720" w:hanging="360"/>
+      </w:pPr>
+      <w:rPr>
+        <w:rFonts w:ascii="Symbol" w:hAnsi="Symbol" w:hint="default"/>
+        <w:sz w:val="20"/>
+      </w:rPr>
+    </w:lvl>
+    <w:lvl w:ilvl="1" w:tentative="1">
+      <w:start w:val="1"/>
+      <w:numFmt w:val="bullet"/>
+      <w:lvlText w:val="o"/>
+      <w:lvlJc w:val="left"/>
+      <w:pPr>
+        <w:tabs>
+          <w:tab w:val="num" w:pos="1440"/>
+        </w:tabs>
+        <w:ind w:left="1440" w:hanging="360"/>
+      </w:pPr>
+      <w:rPr>
+        <w:rFonts w:ascii="Courier New" w:hAnsi="Courier New" w:hint="default"/>
+        <w:sz w:val="20"/>
+      </w:rPr>
+    </w:lvl>
+    <w:lvl w:ilvl="2" w:tentative="1">
+      <w:start w:val="1"/>
+      <w:numFmt w:val="bullet"/>
+      <w:lvlText w:val=""/>
+      <w:lvlJc w:val="left"/>
+      <w:pPr>
+        <w:tabs>
+          <w:tab w:val="num" w:pos="2160"/>
+        </w:tabs>
+        <w:ind w:left="2160" w:hanging="360"/>
+      </w:pPr>
+      <w:rPr>
+        <w:rFonts w:ascii="Wingdings" w:hAnsi="Wingdings" w:hint="default"/>
+        <w:sz w:val="20"/>
+      </w:rPr>
+    </w:lvl>
+    <w:lvl w:ilvl="3" w:tentative="1">
+      <w:start w:val="1"/>
+      <w:numFmt w:val="bullet"/>
+      <w:lvlText w:val=""/>
+      <w:lvlJc w:val="left"/>
+      <w:pPr>
+        <w:tabs>
+          <w:tab w:val="num" w:pos="2880"/>
+        </w:tabs>
+        <w:ind w:left="2880" w:hanging="360"/>
+      </w:pPr>
+      <w:rPr>
+        <w:rFonts w:ascii="Wingdings" w:hAnsi="Wingdings" w:hint="default"/>
+        <w:sz w:val="20"/>
+      </w:rPr>
+    </w:lvl>
+    <w:lvl w:ilvl="4" w:tentative="1">
+      <w:start w:val="1"/>
+      <w:numFmt w:val="bullet"/>
+      <w:lvlText w:val=""/>
+      <w:lvlJc w:val="left"/>
+      <w:pPr>
+        <w:tabs>
+          <w:tab w:val="num" w:pos="3600"/>
+        </w:tabs>
+        <w:ind w:left="3600" w:hanging="360"/>
+      </w:pPr>
+      <w:rPr>
+        <w:rFonts w:ascii="Wingdings" w:hAnsi="Wingdings" w:hint="default"/>
+        <w:sz w:val="20"/>
+      </w:rPr>
+    </w:lvl>
+    <w:lvl w:ilvl="5" w:tentative="1">
+      <w:start w:val="1"/>
+      <w:numFmt w:val="bullet"/>
+      <w:lvlText w:val=""/>
+      <w:lvlJc w:val="left"/>
+      <w:pPr>
+        <w:tabs>
+          <w:tab w:val="num" w:pos="4320"/>
+        </w:tabs>
+        <w:ind w:left="4320" w:hanging="360"/>
+      </w:pPr>
+      <w:rPr>
+        <w:rFonts w:ascii="Wingdings" w:hAnsi="Wingdings" w:hint="default"/>
+        <w:sz w:val="20"/>
+      </w:rPr>
+    </w:lvl>
+    <w:lvl w:ilvl="6" w:tentative="1">
+      <w:start w:val="1"/>
+      <w:numFmt w:val="bullet"/>
+      <w:lvlText w:val=""/>
+      <w:lvlJc w:val="left"/>
+      <w:pPr>
+        <w:tabs>
+          <w:tab w:val="num" w:pos="5040"/>
+        </w:tabs>
+        <w:ind w:left="5040" w:hanging="360"/>
+      </w:pPr>
+      <w:rPr>
+        <w:rFonts w:ascii="Wingdings" w:hAnsi="Wingdings" w:hint="default"/>
+        <w:sz w:val="20"/>
+      </w:rPr>
+    </w:lvl>
+    <w:lvl w:ilvl="7" w:tentative="1">
+      <w:start w:val="1"/>
+      <w:numFmt w:val="bullet"/>
+      <w:lvlText w:val=""/>
+      <w:lvlJc w:val="left"/>
+      <w:pPr>
+        <w:tabs>
+          <w:tab w:val="num" w:pos="5760"/>
+        </w:tabs>
+        <w:ind w:left="5760" w:hanging="360"/>
+      </w:pPr>
+      <w:rPr>
+        <w:rFonts w:ascii="Wingdings" w:hAnsi="Wingdings" w:hint="default"/>
+        <w:sz w:val="20"/>
+      </w:rPr>
+    </w:lvl>
+    <w:lvl w:ilvl="8" w:tentative="1">
+      <w:start w:val="1"/>
+      <w:numFmt w:val="bullet"/>
+      <w:lvlText w:val=""/>
+      <w:lvlJc w:val="left"/>
+      <w:pPr>
+        <w:tabs>
+          <w:tab w:val="num" w:pos="6480"/>
+        </w:tabs>
+        <w:ind w:left="6480" w:hanging="360"/>
+      </w:pPr>
+      <w:rPr>
+        <w:rFonts w:ascii="Wingdings" w:hAnsi="Wingdings" w:hint="default"/>
+        <w:sz w:val="20"/>
+      </w:rPr>
+    </w:lvl>
+  </w:abstractNum>
   <w:num w:numId="1" w16cid:durableId="1700429761">
+    <w:abstractNumId w:val="2"/>
+  </w:num>
+  <w:num w:numId="2" w16cid:durableId="1157303928">
+    <w:abstractNumId w:val="5"/>
+  </w:num>
+  <w:num w:numId="3" w16cid:durableId="1666203159">
+    <w:abstractNumId w:val="4"/>
+  </w:num>
+  <w:num w:numId="4" w16cid:durableId="1626691101">
+    <w:abstractNumId w:val="6"/>
+  </w:num>
+  <w:num w:numId="5" w16cid:durableId="340011408">
     <w:abstractNumId w:val="1"/>
   </w:num>
-  <w:num w:numId="2" w16cid:durableId="1157303928">
-    <w:abstractNumId w:val="4"/>
-  </w:num>
-  <w:num w:numId="3" w16cid:durableId="1666203159">
+  <w:num w:numId="6" w16cid:durableId="460075601">
     <w:abstractNumId w:val="3"/>
   </w:num>
-  <w:num w:numId="4" w16cid:durableId="1626691101">
-    <w:abstractNumId w:val="5"/>
+  <w:num w:numId="7" w16cid:durableId="24214223">
+    <w:abstractNumId w:val="7"/>
   </w:num>
-  <w:num w:numId="5" w16cid:durableId="340011408">
+  <w:num w:numId="8" w16cid:durableId="1204321318">
     <w:abstractNumId w:val="0"/>
-  </w:num>
-  <w:num w:numId="6" w16cid:durableId="460075601">
-    <w:abstractNumId w:val="2"/>
   </w:num>
 </w:numbering>
 </file>

</xml_diff>

<commit_message>
rapora sonuç kısmı eklendi
</commit_message>
<xml_diff>
--- a/PROJE-2/23291207.docx
+++ b/PROJE-2/23291207.docx
@@ -80,8 +80,13 @@
       </w:hyperlink>
     </w:p>
     <w:p>
-      <w:r>
-        <w:t xml:space="preserve">proje dosyalarının </w:t>
+      <w:proofErr w:type="gramStart"/>
+      <w:r>
+        <w:t>proje</w:t>
+      </w:r>
+      <w:proofErr w:type="gramEnd"/>
+      <w:r>
+        <w:t xml:space="preserve"> dosyalarının </w:t>
       </w:r>
       <w:proofErr w:type="spellStart"/>
       <w:r>
@@ -311,6 +316,7 @@
         <w:t xml:space="preserve"> </w:t>
       </w:r>
       <w:proofErr w:type="spellStart"/>
+      <w:proofErr w:type="gramStart"/>
       <w:r>
         <w:rPr>
           <w:lang w:val="en-US"/>
@@ -322,7 +328,14 @@
         <w:rPr>
           <w:lang w:val="en-US"/>
         </w:rPr>
-        <w:t xml:space="preserve"> , </w:t>
+        <w:t xml:space="preserve"> ,</w:t>
+      </w:r>
+      <w:proofErr w:type="gramEnd"/>
+      <w:r>
+        <w:rPr>
+          <w:lang w:val="en-US"/>
+        </w:rPr>
+        <w:t xml:space="preserve"> </w:t>
       </w:r>
       <w:proofErr w:type="spellStart"/>
       <w:r>
@@ -6479,6 +6492,7 @@
         </w:rPr>
         <w:t xml:space="preserve"> </w:t>
       </w:r>
+      <w:proofErr w:type="gramStart"/>
       <w:r>
         <w:rPr>
           <w:b/>
@@ -6487,6 +6501,7 @@
         </w:rPr>
         <w:t>4.Aşama</w:t>
       </w:r>
+      <w:proofErr w:type="gramEnd"/>
     </w:p>
     <w:p>
       <w:pPr>
@@ -8052,6 +8067,7 @@
         <w:t xml:space="preserve"> </w:t>
       </w:r>
       <w:proofErr w:type="spellStart"/>
+      <w:proofErr w:type="gramStart"/>
       <w:r>
         <w:rPr>
           <w:lang w:val="en-US"/>
@@ -8059,6 +8075,7 @@
         <w:t>json.loads</w:t>
       </w:r>
       <w:proofErr w:type="spellEnd"/>
+      <w:proofErr w:type="gramEnd"/>
       <w:r>
         <w:rPr>
           <w:lang w:val="en-US"/>
@@ -8510,6 +8527,1968 @@
     <w:p/>
     <w:p/>
     <w:p/>
+    <w:p>
+      <w:pPr>
+        <w:rPr>
+          <w:lang w:val="en-US"/>
+        </w:rPr>
+      </w:pPr>
+      <w:proofErr w:type="spellStart"/>
+      <w:r>
+        <w:rPr>
+          <w:b/>
+          <w:bCs/>
+          <w:lang w:val="en-US"/>
+        </w:rPr>
+        <w:lastRenderedPageBreak/>
+        <w:t>Sonuç</w:t>
+      </w:r>
+      <w:proofErr w:type="spellEnd"/>
+      <w:r>
+        <w:rPr>
+          <w:b/>
+          <w:bCs/>
+          <w:lang w:val="en-US"/>
+        </w:rPr>
+        <w:t xml:space="preserve"> </w:t>
+      </w:r>
+      <w:proofErr w:type="spellStart"/>
+      <w:r>
+        <w:rPr>
+          <w:b/>
+          <w:bCs/>
+          <w:lang w:val="en-US"/>
+        </w:rPr>
+        <w:t>ve</w:t>
+      </w:r>
+      <w:proofErr w:type="spellEnd"/>
+      <w:r>
+        <w:rPr>
+          <w:b/>
+          <w:bCs/>
+          <w:lang w:val="en-US"/>
+        </w:rPr>
+        <w:t xml:space="preserve"> </w:t>
+      </w:r>
+      <w:proofErr w:type="spellStart"/>
+      <w:r>
+        <w:rPr>
+          <w:b/>
+          <w:bCs/>
+          <w:lang w:val="en-US"/>
+        </w:rPr>
+        <w:t>Değerlendirme</w:t>
+      </w:r>
+      <w:proofErr w:type="spellEnd"/>
+    </w:p>
+    <w:p>
+      <w:pPr>
+        <w:rPr>
+          <w:lang w:val="en-US"/>
+        </w:rPr>
+      </w:pPr>
+      <w:r>
+        <w:rPr>
+          <w:lang w:val="en-US"/>
+        </w:rPr>
+        <w:t xml:space="preserve">Bu </w:t>
+      </w:r>
+      <w:proofErr w:type="spellStart"/>
+      <w:r>
+        <w:rPr>
+          <w:lang w:val="en-US"/>
+        </w:rPr>
+        <w:t>proje</w:t>
+      </w:r>
+      <w:proofErr w:type="spellEnd"/>
+      <w:r>
+        <w:rPr>
+          <w:lang w:val="en-US"/>
+        </w:rPr>
+        <w:t xml:space="preserve"> </w:t>
+      </w:r>
+      <w:proofErr w:type="spellStart"/>
+      <w:r>
+        <w:rPr>
+          <w:lang w:val="en-US"/>
+        </w:rPr>
+        <w:t>kapsamında</w:t>
+      </w:r>
+      <w:proofErr w:type="spellEnd"/>
+      <w:r>
+        <w:rPr>
+          <w:lang w:val="en-US"/>
+        </w:rPr>
+        <w:t>, "</w:t>
+      </w:r>
+      <w:proofErr w:type="spellStart"/>
+      <w:r>
+        <w:rPr>
+          <w:lang w:val="en-US"/>
+        </w:rPr>
+        <w:t>Gerçek</w:t>
+      </w:r>
+      <w:proofErr w:type="spellEnd"/>
+      <w:r>
+        <w:rPr>
+          <w:lang w:val="en-US"/>
+        </w:rPr>
+        <w:t xml:space="preserve"> </w:t>
+      </w:r>
+      <w:proofErr w:type="spellStart"/>
+      <w:r>
+        <w:rPr>
+          <w:lang w:val="en-US"/>
+        </w:rPr>
+        <w:t>Zamanlı</w:t>
+      </w:r>
+      <w:proofErr w:type="spellEnd"/>
+      <w:r>
+        <w:rPr>
+          <w:lang w:val="en-US"/>
+        </w:rPr>
+        <w:t xml:space="preserve"> Veri </w:t>
+      </w:r>
+      <w:proofErr w:type="spellStart"/>
+      <w:r>
+        <w:rPr>
+          <w:lang w:val="en-US"/>
+        </w:rPr>
+        <w:t>Akışı</w:t>
+      </w:r>
+      <w:proofErr w:type="spellEnd"/>
+      <w:r>
+        <w:rPr>
+          <w:lang w:val="en-US"/>
+        </w:rPr>
+        <w:t xml:space="preserve"> </w:t>
+      </w:r>
+      <w:proofErr w:type="spellStart"/>
+      <w:r>
+        <w:rPr>
+          <w:lang w:val="en-US"/>
+        </w:rPr>
+        <w:t>ve</w:t>
+      </w:r>
+      <w:proofErr w:type="spellEnd"/>
+      <w:r>
+        <w:rPr>
+          <w:lang w:val="en-US"/>
+        </w:rPr>
+        <w:t xml:space="preserve"> </w:t>
+      </w:r>
+      <w:proofErr w:type="spellStart"/>
+      <w:r>
+        <w:rPr>
+          <w:lang w:val="en-US"/>
+        </w:rPr>
+        <w:t>İşleme</w:t>
+      </w:r>
+      <w:proofErr w:type="spellEnd"/>
+      <w:r>
+        <w:rPr>
+          <w:lang w:val="en-US"/>
+        </w:rPr>
+        <w:t xml:space="preserve">" </w:t>
+      </w:r>
+      <w:proofErr w:type="spellStart"/>
+      <w:r>
+        <w:rPr>
+          <w:lang w:val="en-US"/>
+        </w:rPr>
+        <w:t>hedefleri</w:t>
+      </w:r>
+      <w:proofErr w:type="spellEnd"/>
+      <w:r>
+        <w:rPr>
+          <w:lang w:val="en-US"/>
+        </w:rPr>
+        <w:t xml:space="preserve"> </w:t>
+      </w:r>
+      <w:proofErr w:type="spellStart"/>
+      <w:r>
+        <w:rPr>
+          <w:lang w:val="en-US"/>
+        </w:rPr>
+        <w:t>doğrultusunda</w:t>
+      </w:r>
+      <w:proofErr w:type="spellEnd"/>
+      <w:r>
+        <w:rPr>
+          <w:lang w:val="en-US"/>
+        </w:rPr>
+        <w:t xml:space="preserve">, </w:t>
+      </w:r>
+      <w:proofErr w:type="spellStart"/>
+      <w:r>
+        <w:rPr>
+          <w:lang w:val="en-US"/>
+        </w:rPr>
+        <w:t>yerel</w:t>
+      </w:r>
+      <w:proofErr w:type="spellEnd"/>
+      <w:r>
+        <w:rPr>
+          <w:lang w:val="en-US"/>
+        </w:rPr>
+        <w:t xml:space="preserve"> </w:t>
+      </w:r>
+      <w:proofErr w:type="spellStart"/>
+      <w:r>
+        <w:rPr>
+          <w:lang w:val="en-US"/>
+        </w:rPr>
+        <w:t>bir</w:t>
+      </w:r>
+      <w:proofErr w:type="spellEnd"/>
+      <w:r>
+        <w:rPr>
+          <w:lang w:val="en-US"/>
+        </w:rPr>
+        <w:t xml:space="preserve"> </w:t>
+      </w:r>
+      <w:proofErr w:type="spellStart"/>
+      <w:r>
+        <w:rPr>
+          <w:lang w:val="en-US"/>
+        </w:rPr>
+        <w:t>simülatörden</w:t>
+      </w:r>
+      <w:proofErr w:type="spellEnd"/>
+      <w:r>
+        <w:rPr>
+          <w:lang w:val="en-US"/>
+        </w:rPr>
+        <w:t xml:space="preserve"> AWS </w:t>
+      </w:r>
+      <w:proofErr w:type="spellStart"/>
+      <w:r>
+        <w:rPr>
+          <w:lang w:val="en-US"/>
+        </w:rPr>
+        <w:t>bulut</w:t>
+      </w:r>
+      <w:proofErr w:type="spellEnd"/>
+      <w:r>
+        <w:rPr>
+          <w:lang w:val="en-US"/>
+        </w:rPr>
+        <w:t xml:space="preserve"> </w:t>
+      </w:r>
+      <w:proofErr w:type="spellStart"/>
+      <w:r>
+        <w:rPr>
+          <w:lang w:val="en-US"/>
+        </w:rPr>
+        <w:t>platformuna</w:t>
+      </w:r>
+      <w:proofErr w:type="spellEnd"/>
+      <w:r>
+        <w:rPr>
+          <w:lang w:val="en-US"/>
+        </w:rPr>
+        <w:t xml:space="preserve"> </w:t>
+      </w:r>
+      <w:proofErr w:type="spellStart"/>
+      <w:r>
+        <w:rPr>
+          <w:lang w:val="en-US"/>
+        </w:rPr>
+        <w:t>uzanan</w:t>
+      </w:r>
+      <w:proofErr w:type="spellEnd"/>
+      <w:r>
+        <w:rPr>
+          <w:lang w:val="en-US"/>
+        </w:rPr>
+        <w:t xml:space="preserve"> </w:t>
+      </w:r>
+      <w:proofErr w:type="spellStart"/>
+      <w:r>
+        <w:rPr>
+          <w:lang w:val="en-US"/>
+        </w:rPr>
+        <w:t>uçtan</w:t>
+      </w:r>
+      <w:proofErr w:type="spellEnd"/>
+      <w:r>
+        <w:rPr>
+          <w:lang w:val="en-US"/>
+        </w:rPr>
+        <w:t xml:space="preserve"> </w:t>
+      </w:r>
+      <w:proofErr w:type="spellStart"/>
+      <w:r>
+        <w:rPr>
+          <w:lang w:val="en-US"/>
+        </w:rPr>
+        <w:t>uca</w:t>
+      </w:r>
+      <w:proofErr w:type="spellEnd"/>
+      <w:r>
+        <w:rPr>
+          <w:lang w:val="en-US"/>
+        </w:rPr>
+        <w:t xml:space="preserve"> </w:t>
+      </w:r>
+      <w:proofErr w:type="spellStart"/>
+      <w:r>
+        <w:rPr>
+          <w:lang w:val="en-US"/>
+        </w:rPr>
+        <w:t>bir</w:t>
+      </w:r>
+      <w:proofErr w:type="spellEnd"/>
+      <w:r>
+        <w:rPr>
+          <w:lang w:val="en-US"/>
+        </w:rPr>
+        <w:t xml:space="preserve"> IoT </w:t>
+      </w:r>
+      <w:proofErr w:type="spellStart"/>
+      <w:r>
+        <w:rPr>
+          <w:lang w:val="en-US"/>
+        </w:rPr>
+        <w:t>veri</w:t>
+      </w:r>
+      <w:proofErr w:type="spellEnd"/>
+      <w:r>
+        <w:rPr>
+          <w:lang w:val="en-US"/>
+        </w:rPr>
+        <w:t xml:space="preserve"> </w:t>
+      </w:r>
+      <w:proofErr w:type="spellStart"/>
+      <w:r>
+        <w:rPr>
+          <w:lang w:val="en-US"/>
+        </w:rPr>
+        <w:t>boru</w:t>
+      </w:r>
+      <w:proofErr w:type="spellEnd"/>
+      <w:r>
+        <w:rPr>
+          <w:lang w:val="en-US"/>
+        </w:rPr>
+        <w:t xml:space="preserve"> </w:t>
+      </w:r>
+      <w:proofErr w:type="spellStart"/>
+      <w:r>
+        <w:rPr>
+          <w:lang w:val="en-US"/>
+        </w:rPr>
+        <w:t>hattı</w:t>
+      </w:r>
+      <w:proofErr w:type="spellEnd"/>
+      <w:r>
+        <w:rPr>
+          <w:lang w:val="en-US"/>
+        </w:rPr>
+        <w:t xml:space="preserve"> (data pipeline) </w:t>
+      </w:r>
+      <w:proofErr w:type="spellStart"/>
+      <w:r>
+        <w:rPr>
+          <w:lang w:val="en-US"/>
+        </w:rPr>
+        <w:t>başarıyla</w:t>
+      </w:r>
+      <w:proofErr w:type="spellEnd"/>
+      <w:r>
+        <w:rPr>
+          <w:lang w:val="en-US"/>
+        </w:rPr>
+        <w:t xml:space="preserve"> </w:t>
+      </w:r>
+      <w:proofErr w:type="spellStart"/>
+      <w:r>
+        <w:rPr>
+          <w:lang w:val="en-US"/>
+        </w:rPr>
+        <w:t>inşa</w:t>
+      </w:r>
+      <w:proofErr w:type="spellEnd"/>
+      <w:r>
+        <w:rPr>
+          <w:lang w:val="en-US"/>
+        </w:rPr>
+        <w:t xml:space="preserve"> </w:t>
+      </w:r>
+      <w:proofErr w:type="spellStart"/>
+      <w:r>
+        <w:rPr>
+          <w:lang w:val="en-US"/>
+        </w:rPr>
+        <w:t>edilmiştir</w:t>
+      </w:r>
+      <w:proofErr w:type="spellEnd"/>
+      <w:r>
+        <w:rPr>
+          <w:lang w:val="en-US"/>
+        </w:rPr>
+        <w:t xml:space="preserve">. </w:t>
+      </w:r>
+      <w:proofErr w:type="spellStart"/>
+      <w:r>
+        <w:rPr>
+          <w:lang w:val="en-US"/>
+        </w:rPr>
+        <w:t>Çalışma</w:t>
+      </w:r>
+      <w:proofErr w:type="spellEnd"/>
+      <w:r>
+        <w:rPr>
+          <w:lang w:val="en-US"/>
+        </w:rPr>
+        <w:t xml:space="preserve"> </w:t>
+      </w:r>
+      <w:proofErr w:type="spellStart"/>
+      <w:r>
+        <w:rPr>
+          <w:lang w:val="en-US"/>
+        </w:rPr>
+        <w:t>süresince</w:t>
+      </w:r>
+      <w:proofErr w:type="spellEnd"/>
+      <w:r>
+        <w:rPr>
+          <w:lang w:val="en-US"/>
+        </w:rPr>
+        <w:t xml:space="preserve"> </w:t>
+      </w:r>
+      <w:proofErr w:type="spellStart"/>
+      <w:r>
+        <w:rPr>
+          <w:lang w:val="en-US"/>
+        </w:rPr>
+        <w:t>aşağıdaki</w:t>
+      </w:r>
+      <w:proofErr w:type="spellEnd"/>
+      <w:r>
+        <w:rPr>
+          <w:lang w:val="en-US"/>
+        </w:rPr>
+        <w:t xml:space="preserve"> </w:t>
+      </w:r>
+      <w:proofErr w:type="spellStart"/>
+      <w:r>
+        <w:rPr>
+          <w:lang w:val="en-US"/>
+        </w:rPr>
+        <w:t>temel</w:t>
+      </w:r>
+      <w:proofErr w:type="spellEnd"/>
+      <w:r>
+        <w:rPr>
+          <w:lang w:val="en-US"/>
+        </w:rPr>
+        <w:t xml:space="preserve"> </w:t>
+      </w:r>
+      <w:proofErr w:type="spellStart"/>
+      <w:r>
+        <w:rPr>
+          <w:lang w:val="en-US"/>
+        </w:rPr>
+        <w:t>kazanımlar</w:t>
+      </w:r>
+      <w:proofErr w:type="spellEnd"/>
+      <w:r>
+        <w:rPr>
+          <w:lang w:val="en-US"/>
+        </w:rPr>
+        <w:t xml:space="preserve"> </w:t>
+      </w:r>
+      <w:proofErr w:type="spellStart"/>
+      <w:r>
+        <w:rPr>
+          <w:lang w:val="en-US"/>
+        </w:rPr>
+        <w:t>ve</w:t>
+      </w:r>
+      <w:proofErr w:type="spellEnd"/>
+      <w:r>
+        <w:rPr>
+          <w:lang w:val="en-US"/>
+        </w:rPr>
+        <w:t xml:space="preserve"> </w:t>
+      </w:r>
+      <w:proofErr w:type="spellStart"/>
+      <w:r>
+        <w:rPr>
+          <w:lang w:val="en-US"/>
+        </w:rPr>
+        <w:t>teknik</w:t>
+      </w:r>
+      <w:proofErr w:type="spellEnd"/>
+      <w:r>
+        <w:rPr>
+          <w:lang w:val="en-US"/>
+        </w:rPr>
+        <w:t xml:space="preserve"> </w:t>
+      </w:r>
+      <w:proofErr w:type="spellStart"/>
+      <w:r>
+        <w:rPr>
+          <w:lang w:val="en-US"/>
+        </w:rPr>
+        <w:t>yetkinlikler</w:t>
+      </w:r>
+      <w:proofErr w:type="spellEnd"/>
+      <w:r>
+        <w:rPr>
+          <w:lang w:val="en-US"/>
+        </w:rPr>
+        <w:t xml:space="preserve"> </w:t>
+      </w:r>
+      <w:proofErr w:type="spellStart"/>
+      <w:r>
+        <w:rPr>
+          <w:lang w:val="en-US"/>
+        </w:rPr>
+        <w:t>elde</w:t>
+      </w:r>
+      <w:proofErr w:type="spellEnd"/>
+      <w:r>
+        <w:rPr>
+          <w:lang w:val="en-US"/>
+        </w:rPr>
+        <w:t xml:space="preserve"> </w:t>
+      </w:r>
+      <w:proofErr w:type="spellStart"/>
+      <w:r>
+        <w:rPr>
+          <w:lang w:val="en-US"/>
+        </w:rPr>
+        <w:t>edilmiştir</w:t>
+      </w:r>
+      <w:proofErr w:type="spellEnd"/>
+      <w:r>
+        <w:rPr>
+          <w:lang w:val="en-US"/>
+        </w:rPr>
+        <w:t>:</w:t>
+      </w:r>
+    </w:p>
+    <w:p>
+      <w:pPr>
+        <w:numPr>
+          <w:ilvl w:val="0"/>
+          <w:numId w:val="9"/>
+        </w:numPr>
+        <w:rPr>
+          <w:lang w:val="en-US"/>
+        </w:rPr>
+      </w:pPr>
+      <w:proofErr w:type="spellStart"/>
+      <w:r>
+        <w:rPr>
+          <w:b/>
+          <w:bCs/>
+          <w:lang w:val="en-US"/>
+        </w:rPr>
+        <w:t>Gerçek</w:t>
+      </w:r>
+      <w:proofErr w:type="spellEnd"/>
+      <w:r>
+        <w:rPr>
+          <w:b/>
+          <w:bCs/>
+          <w:lang w:val="en-US"/>
+        </w:rPr>
+        <w:t xml:space="preserve"> </w:t>
+      </w:r>
+      <w:proofErr w:type="spellStart"/>
+      <w:r>
+        <w:rPr>
+          <w:b/>
+          <w:bCs/>
+          <w:lang w:val="en-US"/>
+        </w:rPr>
+        <w:t>Zamanlı</w:t>
+      </w:r>
+      <w:proofErr w:type="spellEnd"/>
+      <w:r>
+        <w:rPr>
+          <w:b/>
+          <w:bCs/>
+          <w:lang w:val="en-US"/>
+        </w:rPr>
+        <w:t xml:space="preserve"> Veri </w:t>
+      </w:r>
+      <w:proofErr w:type="spellStart"/>
+      <w:r>
+        <w:rPr>
+          <w:b/>
+          <w:bCs/>
+          <w:lang w:val="en-US"/>
+        </w:rPr>
+        <w:t>Yönetimi</w:t>
+      </w:r>
+      <w:proofErr w:type="spellEnd"/>
+      <w:r>
+        <w:rPr>
+          <w:b/>
+          <w:bCs/>
+          <w:lang w:val="en-US"/>
+        </w:rPr>
+        <w:t>:</w:t>
+      </w:r>
+      <w:r>
+        <w:rPr>
+          <w:lang w:val="en-US"/>
+        </w:rPr>
+        <w:t xml:space="preserve"> </w:t>
+      </w:r>
+      <w:proofErr w:type="spellStart"/>
+      <w:r>
+        <w:rPr>
+          <w:lang w:val="en-US"/>
+        </w:rPr>
+        <w:t>Verilerin</w:t>
+      </w:r>
+      <w:proofErr w:type="spellEnd"/>
+      <w:r>
+        <w:rPr>
+          <w:lang w:val="en-US"/>
+        </w:rPr>
+        <w:t xml:space="preserve"> </w:t>
+      </w:r>
+      <w:proofErr w:type="spellStart"/>
+      <w:r>
+        <w:rPr>
+          <w:lang w:val="en-US"/>
+        </w:rPr>
+        <w:t>saniyeler</w:t>
+      </w:r>
+      <w:proofErr w:type="spellEnd"/>
+      <w:r>
+        <w:rPr>
+          <w:lang w:val="en-US"/>
+        </w:rPr>
+        <w:t xml:space="preserve"> </w:t>
+      </w:r>
+      <w:proofErr w:type="spellStart"/>
+      <w:r>
+        <w:rPr>
+          <w:lang w:val="en-US"/>
+        </w:rPr>
+        <w:t>içerisinde</w:t>
+      </w:r>
+      <w:proofErr w:type="spellEnd"/>
+      <w:r>
+        <w:rPr>
+          <w:lang w:val="en-US"/>
+        </w:rPr>
+        <w:t xml:space="preserve"> </w:t>
+      </w:r>
+      <w:proofErr w:type="spellStart"/>
+      <w:r>
+        <w:rPr>
+          <w:lang w:val="en-US"/>
+        </w:rPr>
+        <w:t>kaynaktan</w:t>
+      </w:r>
+      <w:proofErr w:type="spellEnd"/>
+      <w:r>
+        <w:rPr>
+          <w:lang w:val="en-US"/>
+        </w:rPr>
+        <w:t xml:space="preserve"> (</w:t>
+      </w:r>
+      <w:proofErr w:type="spellStart"/>
+      <w:r>
+        <w:rPr>
+          <w:lang w:val="en-US"/>
+        </w:rPr>
+        <w:t>simülatör</w:t>
+      </w:r>
+      <w:proofErr w:type="spellEnd"/>
+      <w:r>
+        <w:rPr>
+          <w:lang w:val="en-US"/>
+        </w:rPr>
+        <w:t xml:space="preserve">) </w:t>
+      </w:r>
+      <w:proofErr w:type="spellStart"/>
+      <w:r>
+        <w:rPr>
+          <w:lang w:val="en-US"/>
+        </w:rPr>
+        <w:t>hedefe</w:t>
+      </w:r>
+      <w:proofErr w:type="spellEnd"/>
+      <w:r>
+        <w:rPr>
+          <w:lang w:val="en-US"/>
+        </w:rPr>
+        <w:t xml:space="preserve"> (</w:t>
+      </w:r>
+      <w:proofErr w:type="spellStart"/>
+      <w:r>
+        <w:rPr>
+          <w:lang w:val="en-US"/>
+        </w:rPr>
+        <w:t>veritabanı</w:t>
+      </w:r>
+      <w:proofErr w:type="spellEnd"/>
+      <w:r>
+        <w:rPr>
+          <w:lang w:val="en-US"/>
+        </w:rPr>
+        <w:t xml:space="preserve">) </w:t>
+      </w:r>
+      <w:proofErr w:type="spellStart"/>
+      <w:r>
+        <w:rPr>
+          <w:lang w:val="en-US"/>
+        </w:rPr>
+        <w:t>ulaşması</w:t>
+      </w:r>
+      <w:proofErr w:type="spellEnd"/>
+      <w:r>
+        <w:rPr>
+          <w:lang w:val="en-US"/>
+        </w:rPr>
+        <w:t xml:space="preserve"> </w:t>
+      </w:r>
+      <w:proofErr w:type="spellStart"/>
+      <w:r>
+        <w:rPr>
+          <w:lang w:val="en-US"/>
+        </w:rPr>
+        <w:t>sağlanarak</w:t>
+      </w:r>
+      <w:proofErr w:type="spellEnd"/>
+      <w:r>
+        <w:rPr>
+          <w:lang w:val="en-US"/>
+        </w:rPr>
+        <w:t xml:space="preserve">, </w:t>
+      </w:r>
+      <w:proofErr w:type="spellStart"/>
+      <w:r>
+        <w:rPr>
+          <w:lang w:val="en-US"/>
+        </w:rPr>
+        <w:t>gecikmesiz</w:t>
+      </w:r>
+      <w:proofErr w:type="spellEnd"/>
+      <w:r>
+        <w:rPr>
+          <w:lang w:val="en-US"/>
+        </w:rPr>
+        <w:t xml:space="preserve"> </w:t>
+      </w:r>
+      <w:proofErr w:type="spellStart"/>
+      <w:r>
+        <w:rPr>
+          <w:lang w:val="en-US"/>
+        </w:rPr>
+        <w:t>veri</w:t>
+      </w:r>
+      <w:proofErr w:type="spellEnd"/>
+      <w:r>
+        <w:rPr>
+          <w:lang w:val="en-US"/>
+        </w:rPr>
+        <w:t xml:space="preserve"> </w:t>
+      </w:r>
+      <w:proofErr w:type="spellStart"/>
+      <w:r>
+        <w:rPr>
+          <w:lang w:val="en-US"/>
+        </w:rPr>
+        <w:t>akışı</w:t>
+      </w:r>
+      <w:proofErr w:type="spellEnd"/>
+      <w:r>
+        <w:rPr>
+          <w:lang w:val="en-US"/>
+        </w:rPr>
+        <w:t xml:space="preserve"> </w:t>
+      </w:r>
+      <w:proofErr w:type="spellStart"/>
+      <w:r>
+        <w:rPr>
+          <w:lang w:val="en-US"/>
+        </w:rPr>
+        <w:t>yönetimi</w:t>
+      </w:r>
+      <w:proofErr w:type="spellEnd"/>
+      <w:r>
+        <w:rPr>
+          <w:lang w:val="en-US"/>
+        </w:rPr>
+        <w:t xml:space="preserve"> </w:t>
+      </w:r>
+      <w:proofErr w:type="spellStart"/>
+      <w:r>
+        <w:rPr>
+          <w:lang w:val="en-US"/>
+        </w:rPr>
+        <w:t>tecrübe</w:t>
+      </w:r>
+      <w:proofErr w:type="spellEnd"/>
+      <w:r>
+        <w:rPr>
+          <w:lang w:val="en-US"/>
+        </w:rPr>
+        <w:t xml:space="preserve"> </w:t>
+      </w:r>
+      <w:proofErr w:type="spellStart"/>
+      <w:r>
+        <w:rPr>
+          <w:lang w:val="en-US"/>
+        </w:rPr>
+        <w:t>edilmiştir</w:t>
+      </w:r>
+      <w:proofErr w:type="spellEnd"/>
+      <w:r>
+        <w:rPr>
+          <w:lang w:val="en-US"/>
+        </w:rPr>
+        <w:t>.</w:t>
+      </w:r>
+    </w:p>
+    <w:p>
+      <w:pPr>
+        <w:numPr>
+          <w:ilvl w:val="0"/>
+          <w:numId w:val="9"/>
+        </w:numPr>
+        <w:rPr>
+          <w:lang w:val="en-US"/>
+        </w:rPr>
+      </w:pPr>
+      <w:r>
+        <w:rPr>
+          <w:b/>
+          <w:bCs/>
+          <w:lang w:val="en-US"/>
+        </w:rPr>
+        <w:t>Serverless Mimari:</w:t>
+      </w:r>
+      <w:r>
+        <w:rPr>
+          <w:lang w:val="en-US"/>
+        </w:rPr>
+        <w:t xml:space="preserve"> AWS Lambda </w:t>
+      </w:r>
+      <w:proofErr w:type="spellStart"/>
+      <w:r>
+        <w:rPr>
+          <w:lang w:val="en-US"/>
+        </w:rPr>
+        <w:t>kullanımı</w:t>
+      </w:r>
+      <w:proofErr w:type="spellEnd"/>
+      <w:r>
+        <w:rPr>
+          <w:lang w:val="en-US"/>
+        </w:rPr>
+        <w:t xml:space="preserve"> </w:t>
+      </w:r>
+      <w:proofErr w:type="spellStart"/>
+      <w:r>
+        <w:rPr>
+          <w:lang w:val="en-US"/>
+        </w:rPr>
+        <w:t>ile</w:t>
+      </w:r>
+      <w:proofErr w:type="spellEnd"/>
+      <w:r>
+        <w:rPr>
+          <w:lang w:val="en-US"/>
+        </w:rPr>
+        <w:t xml:space="preserve"> </w:t>
+      </w:r>
+      <w:proofErr w:type="spellStart"/>
+      <w:r>
+        <w:rPr>
+          <w:lang w:val="en-US"/>
+        </w:rPr>
+        <w:t>sunucu</w:t>
+      </w:r>
+      <w:proofErr w:type="spellEnd"/>
+      <w:r>
+        <w:rPr>
+          <w:lang w:val="en-US"/>
+        </w:rPr>
+        <w:t xml:space="preserve"> </w:t>
+      </w:r>
+      <w:proofErr w:type="spellStart"/>
+      <w:r>
+        <w:rPr>
+          <w:lang w:val="en-US"/>
+        </w:rPr>
+        <w:t>yönetimi</w:t>
+      </w:r>
+      <w:proofErr w:type="spellEnd"/>
+      <w:r>
+        <w:rPr>
+          <w:lang w:val="en-US"/>
+        </w:rPr>
+        <w:t xml:space="preserve"> </w:t>
+      </w:r>
+      <w:proofErr w:type="spellStart"/>
+      <w:r>
+        <w:rPr>
+          <w:lang w:val="en-US"/>
+        </w:rPr>
+        <w:t>gerektirmeyen</w:t>
+      </w:r>
+      <w:proofErr w:type="spellEnd"/>
+      <w:r>
+        <w:rPr>
+          <w:lang w:val="en-US"/>
+        </w:rPr>
+        <w:t xml:space="preserve">, </w:t>
+      </w:r>
+      <w:proofErr w:type="spellStart"/>
+      <w:r>
+        <w:rPr>
+          <w:lang w:val="en-US"/>
+        </w:rPr>
+        <w:t>olay</w:t>
+      </w:r>
+      <w:proofErr w:type="spellEnd"/>
+      <w:r>
+        <w:rPr>
+          <w:lang w:val="en-US"/>
+        </w:rPr>
+        <w:t xml:space="preserve"> </w:t>
+      </w:r>
+      <w:proofErr w:type="spellStart"/>
+      <w:r>
+        <w:rPr>
+          <w:lang w:val="en-US"/>
+        </w:rPr>
+        <w:t>güdümlü</w:t>
+      </w:r>
+      <w:proofErr w:type="spellEnd"/>
+      <w:r>
+        <w:rPr>
+          <w:lang w:val="en-US"/>
+        </w:rPr>
+        <w:t xml:space="preserve"> (event-driven) </w:t>
+      </w:r>
+      <w:proofErr w:type="spellStart"/>
+      <w:r>
+        <w:rPr>
+          <w:lang w:val="en-US"/>
+        </w:rPr>
+        <w:t>sistemlerin</w:t>
+      </w:r>
+      <w:proofErr w:type="spellEnd"/>
+      <w:r>
+        <w:rPr>
+          <w:lang w:val="en-US"/>
+        </w:rPr>
+        <w:t xml:space="preserve"> </w:t>
+      </w:r>
+      <w:proofErr w:type="spellStart"/>
+      <w:r>
+        <w:rPr>
+          <w:lang w:val="en-US"/>
+        </w:rPr>
+        <w:t>avantajları</w:t>
+      </w:r>
+      <w:proofErr w:type="spellEnd"/>
+      <w:r>
+        <w:rPr>
+          <w:lang w:val="en-US"/>
+        </w:rPr>
+        <w:t xml:space="preserve"> </w:t>
+      </w:r>
+      <w:proofErr w:type="spellStart"/>
+      <w:r>
+        <w:rPr>
+          <w:lang w:val="en-US"/>
+        </w:rPr>
+        <w:t>ve</w:t>
+      </w:r>
+      <w:proofErr w:type="spellEnd"/>
+      <w:r>
+        <w:rPr>
+          <w:lang w:val="en-US"/>
+        </w:rPr>
+        <w:t xml:space="preserve"> </w:t>
+      </w:r>
+      <w:proofErr w:type="spellStart"/>
+      <w:r>
+        <w:rPr>
+          <w:lang w:val="en-US"/>
+        </w:rPr>
+        <w:t>maliyet</w:t>
+      </w:r>
+      <w:proofErr w:type="spellEnd"/>
+      <w:r>
+        <w:rPr>
+          <w:lang w:val="en-US"/>
+        </w:rPr>
+        <w:t xml:space="preserve"> </w:t>
+      </w:r>
+      <w:proofErr w:type="spellStart"/>
+      <w:r>
+        <w:rPr>
+          <w:lang w:val="en-US"/>
+        </w:rPr>
+        <w:t>etkinliği</w:t>
+      </w:r>
+      <w:proofErr w:type="spellEnd"/>
+      <w:r>
+        <w:rPr>
+          <w:lang w:val="en-US"/>
+        </w:rPr>
+        <w:t xml:space="preserve"> </w:t>
+      </w:r>
+      <w:proofErr w:type="spellStart"/>
+      <w:r>
+        <w:rPr>
+          <w:lang w:val="en-US"/>
+        </w:rPr>
+        <w:t>gözlemlenmiştir</w:t>
+      </w:r>
+      <w:proofErr w:type="spellEnd"/>
+      <w:r>
+        <w:rPr>
+          <w:lang w:val="en-US"/>
+        </w:rPr>
+        <w:t>.</w:t>
+      </w:r>
+    </w:p>
+    <w:p>
+      <w:pPr>
+        <w:numPr>
+          <w:ilvl w:val="0"/>
+          <w:numId w:val="9"/>
+        </w:numPr>
+        <w:rPr>
+          <w:lang w:val="en-US"/>
+        </w:rPr>
+      </w:pPr>
+      <w:r>
+        <w:rPr>
+          <w:b/>
+          <w:bCs/>
+          <w:lang w:val="en-US"/>
+        </w:rPr>
+        <w:t xml:space="preserve">NoSQL </w:t>
+      </w:r>
+      <w:proofErr w:type="spellStart"/>
+      <w:r>
+        <w:rPr>
+          <w:b/>
+          <w:bCs/>
+          <w:lang w:val="en-US"/>
+        </w:rPr>
+        <w:t>Veritabanı</w:t>
+      </w:r>
+      <w:proofErr w:type="spellEnd"/>
+      <w:r>
+        <w:rPr>
+          <w:b/>
+          <w:bCs/>
+          <w:lang w:val="en-US"/>
+        </w:rPr>
+        <w:t xml:space="preserve"> </w:t>
+      </w:r>
+      <w:proofErr w:type="spellStart"/>
+      <w:r>
+        <w:rPr>
+          <w:b/>
+          <w:bCs/>
+          <w:lang w:val="en-US"/>
+        </w:rPr>
+        <w:t>Yaklaşımı</w:t>
+      </w:r>
+      <w:proofErr w:type="spellEnd"/>
+      <w:r>
+        <w:rPr>
+          <w:b/>
+          <w:bCs/>
+          <w:lang w:val="en-US"/>
+        </w:rPr>
+        <w:t>:</w:t>
+      </w:r>
+      <w:r>
+        <w:rPr>
+          <w:lang w:val="en-US"/>
+        </w:rPr>
+        <w:t xml:space="preserve"> Yüksek </w:t>
+      </w:r>
+      <w:proofErr w:type="spellStart"/>
+      <w:r>
+        <w:rPr>
+          <w:lang w:val="en-US"/>
+        </w:rPr>
+        <w:t>hızda</w:t>
+      </w:r>
+      <w:proofErr w:type="spellEnd"/>
+      <w:r>
+        <w:rPr>
+          <w:lang w:val="en-US"/>
+        </w:rPr>
+        <w:t xml:space="preserve"> </w:t>
+      </w:r>
+      <w:proofErr w:type="spellStart"/>
+      <w:r>
+        <w:rPr>
+          <w:lang w:val="en-US"/>
+        </w:rPr>
+        <w:t>veri</w:t>
+      </w:r>
+      <w:proofErr w:type="spellEnd"/>
+      <w:r>
+        <w:rPr>
+          <w:lang w:val="en-US"/>
+        </w:rPr>
+        <w:t xml:space="preserve"> </w:t>
+      </w:r>
+      <w:proofErr w:type="spellStart"/>
+      <w:r>
+        <w:rPr>
+          <w:lang w:val="en-US"/>
+        </w:rPr>
+        <w:t>girişi</w:t>
+      </w:r>
+      <w:proofErr w:type="spellEnd"/>
+      <w:r>
+        <w:rPr>
+          <w:lang w:val="en-US"/>
+        </w:rPr>
+        <w:t xml:space="preserve"> </w:t>
+      </w:r>
+      <w:proofErr w:type="spellStart"/>
+      <w:r>
+        <w:rPr>
+          <w:lang w:val="en-US"/>
+        </w:rPr>
+        <w:t>için</w:t>
+      </w:r>
+      <w:proofErr w:type="spellEnd"/>
+      <w:r>
+        <w:rPr>
+          <w:lang w:val="en-US"/>
+        </w:rPr>
+        <w:t xml:space="preserve"> </w:t>
+      </w:r>
+      <w:proofErr w:type="spellStart"/>
+      <w:r>
+        <w:rPr>
+          <w:lang w:val="en-US"/>
+        </w:rPr>
+        <w:t>DynamoDB'nin</w:t>
+      </w:r>
+      <w:proofErr w:type="spellEnd"/>
+      <w:r>
+        <w:rPr>
+          <w:lang w:val="en-US"/>
+        </w:rPr>
+        <w:t xml:space="preserve"> </w:t>
+      </w:r>
+      <w:proofErr w:type="spellStart"/>
+      <w:r>
+        <w:rPr>
+          <w:lang w:val="en-US"/>
+        </w:rPr>
+        <w:t>sunduğu</w:t>
+      </w:r>
+      <w:proofErr w:type="spellEnd"/>
+      <w:r>
+        <w:rPr>
+          <w:lang w:val="en-US"/>
+        </w:rPr>
+        <w:t xml:space="preserve"> </w:t>
+      </w:r>
+      <w:proofErr w:type="spellStart"/>
+      <w:r>
+        <w:rPr>
+          <w:lang w:val="en-US"/>
+        </w:rPr>
+        <w:t>esnek</w:t>
+      </w:r>
+      <w:proofErr w:type="spellEnd"/>
+      <w:r>
+        <w:rPr>
+          <w:lang w:val="en-US"/>
+        </w:rPr>
+        <w:t xml:space="preserve"> </w:t>
+      </w:r>
+      <w:proofErr w:type="spellStart"/>
+      <w:r>
+        <w:rPr>
+          <w:lang w:val="en-US"/>
+        </w:rPr>
+        <w:t>şema</w:t>
+      </w:r>
+      <w:proofErr w:type="spellEnd"/>
+      <w:r>
+        <w:rPr>
+          <w:lang w:val="en-US"/>
+        </w:rPr>
+        <w:t xml:space="preserve"> </w:t>
+      </w:r>
+      <w:proofErr w:type="spellStart"/>
+      <w:r>
+        <w:rPr>
+          <w:lang w:val="en-US"/>
+        </w:rPr>
+        <w:t>yapısı</w:t>
+      </w:r>
+      <w:proofErr w:type="spellEnd"/>
+      <w:r>
+        <w:rPr>
+          <w:lang w:val="en-US"/>
+        </w:rPr>
+        <w:t xml:space="preserve"> </w:t>
+      </w:r>
+      <w:proofErr w:type="spellStart"/>
+      <w:r>
+        <w:rPr>
+          <w:lang w:val="en-US"/>
+        </w:rPr>
+        <w:t>ve</w:t>
+      </w:r>
+      <w:proofErr w:type="spellEnd"/>
+      <w:r>
+        <w:rPr>
+          <w:lang w:val="en-US"/>
+        </w:rPr>
+        <w:t xml:space="preserve"> </w:t>
+      </w:r>
+      <w:proofErr w:type="spellStart"/>
+      <w:r>
+        <w:rPr>
+          <w:lang w:val="en-US"/>
+        </w:rPr>
+        <w:t>ölçeklenebilirlik</w:t>
+      </w:r>
+      <w:proofErr w:type="spellEnd"/>
+      <w:r>
+        <w:rPr>
+          <w:lang w:val="en-US"/>
+        </w:rPr>
+        <w:t xml:space="preserve"> </w:t>
+      </w:r>
+      <w:proofErr w:type="spellStart"/>
+      <w:r>
+        <w:rPr>
+          <w:lang w:val="en-US"/>
+        </w:rPr>
+        <w:t>özellikleri</w:t>
+      </w:r>
+      <w:proofErr w:type="spellEnd"/>
+      <w:r>
+        <w:rPr>
+          <w:lang w:val="en-US"/>
+        </w:rPr>
+        <w:t xml:space="preserve"> </w:t>
+      </w:r>
+      <w:proofErr w:type="spellStart"/>
+      <w:r>
+        <w:rPr>
+          <w:lang w:val="en-US"/>
+        </w:rPr>
+        <w:t>kavranmıştır</w:t>
+      </w:r>
+      <w:proofErr w:type="spellEnd"/>
+      <w:r>
+        <w:rPr>
+          <w:lang w:val="en-US"/>
+        </w:rPr>
+        <w:t>.</w:t>
+      </w:r>
+    </w:p>
+    <w:p>
+      <w:pPr>
+        <w:numPr>
+          <w:ilvl w:val="0"/>
+          <w:numId w:val="9"/>
+        </w:numPr>
+        <w:rPr>
+          <w:lang w:val="en-US"/>
+        </w:rPr>
+      </w:pPr>
+      <w:r>
+        <w:rPr>
+          <w:b/>
+          <w:bCs/>
+          <w:lang w:val="en-US"/>
+        </w:rPr>
+        <w:t xml:space="preserve">Hata </w:t>
+      </w:r>
+      <w:proofErr w:type="spellStart"/>
+      <w:r>
+        <w:rPr>
+          <w:b/>
+          <w:bCs/>
+          <w:lang w:val="en-US"/>
+        </w:rPr>
+        <w:t>Ayıklama</w:t>
+      </w:r>
+      <w:proofErr w:type="spellEnd"/>
+      <w:r>
+        <w:rPr>
+          <w:b/>
+          <w:bCs/>
+          <w:lang w:val="en-US"/>
+        </w:rPr>
+        <w:t xml:space="preserve"> </w:t>
+      </w:r>
+      <w:proofErr w:type="spellStart"/>
+      <w:r>
+        <w:rPr>
+          <w:b/>
+          <w:bCs/>
+          <w:lang w:val="en-US"/>
+        </w:rPr>
+        <w:t>ve</w:t>
+      </w:r>
+      <w:proofErr w:type="spellEnd"/>
+      <w:r>
+        <w:rPr>
+          <w:b/>
+          <w:bCs/>
+          <w:lang w:val="en-US"/>
+        </w:rPr>
+        <w:t xml:space="preserve"> </w:t>
+      </w:r>
+      <w:proofErr w:type="spellStart"/>
+      <w:r>
+        <w:rPr>
+          <w:b/>
+          <w:bCs/>
+          <w:lang w:val="en-US"/>
+        </w:rPr>
+        <w:t>Optimizasyon</w:t>
+      </w:r>
+      <w:proofErr w:type="spellEnd"/>
+      <w:r>
+        <w:rPr>
+          <w:b/>
+          <w:bCs/>
+          <w:lang w:val="en-US"/>
+        </w:rPr>
+        <w:t>:</w:t>
+      </w:r>
+      <w:r>
+        <w:rPr>
+          <w:lang w:val="en-US"/>
+        </w:rPr>
+        <w:t xml:space="preserve"> </w:t>
+      </w:r>
+      <w:proofErr w:type="spellStart"/>
+      <w:r>
+        <w:rPr>
+          <w:lang w:val="en-US"/>
+        </w:rPr>
+        <w:t>Proje</w:t>
+      </w:r>
+      <w:proofErr w:type="spellEnd"/>
+      <w:r>
+        <w:rPr>
+          <w:lang w:val="en-US"/>
+        </w:rPr>
+        <w:t xml:space="preserve"> </w:t>
+      </w:r>
+      <w:proofErr w:type="spellStart"/>
+      <w:r>
+        <w:rPr>
+          <w:lang w:val="en-US"/>
+        </w:rPr>
+        <w:t>sırasında</w:t>
+      </w:r>
+      <w:proofErr w:type="spellEnd"/>
+      <w:r>
+        <w:rPr>
+          <w:lang w:val="en-US"/>
+        </w:rPr>
+        <w:t xml:space="preserve"> </w:t>
+      </w:r>
+      <w:proofErr w:type="spellStart"/>
+      <w:r>
+        <w:rPr>
+          <w:lang w:val="en-US"/>
+        </w:rPr>
+        <w:t>karşılaşılan</w:t>
+      </w:r>
+      <w:proofErr w:type="spellEnd"/>
+      <w:r>
+        <w:rPr>
+          <w:lang w:val="en-US"/>
+        </w:rPr>
+        <w:t xml:space="preserve"> IAM </w:t>
+      </w:r>
+      <w:proofErr w:type="spellStart"/>
+      <w:r>
+        <w:rPr>
+          <w:lang w:val="en-US"/>
+        </w:rPr>
+        <w:t>izin</w:t>
+      </w:r>
+      <w:proofErr w:type="spellEnd"/>
+      <w:r>
+        <w:rPr>
+          <w:lang w:val="en-US"/>
+        </w:rPr>
+        <w:t xml:space="preserve"> </w:t>
+      </w:r>
+      <w:proofErr w:type="spellStart"/>
+      <w:r>
+        <w:rPr>
+          <w:lang w:val="en-US"/>
+        </w:rPr>
+        <w:t>yönetimi</w:t>
+      </w:r>
+      <w:proofErr w:type="spellEnd"/>
+      <w:r>
+        <w:rPr>
+          <w:lang w:val="en-US"/>
+        </w:rPr>
+        <w:t xml:space="preserve"> (</w:t>
+      </w:r>
+      <w:proofErr w:type="spellStart"/>
+      <w:r>
+        <w:rPr>
+          <w:lang w:val="en-US"/>
+        </w:rPr>
+        <w:t>AccessDenied</w:t>
+      </w:r>
+      <w:proofErr w:type="spellEnd"/>
+      <w:r>
+        <w:rPr>
+          <w:lang w:val="en-US"/>
+        </w:rPr>
+        <w:t xml:space="preserve">) </w:t>
+      </w:r>
+      <w:proofErr w:type="spellStart"/>
+      <w:r>
+        <w:rPr>
+          <w:lang w:val="en-US"/>
+        </w:rPr>
+        <w:t>ve</w:t>
+      </w:r>
+      <w:proofErr w:type="spellEnd"/>
+      <w:r>
+        <w:rPr>
+          <w:lang w:val="en-US"/>
+        </w:rPr>
+        <w:t xml:space="preserve"> </w:t>
+      </w:r>
+      <w:proofErr w:type="spellStart"/>
+      <w:r>
+        <w:rPr>
+          <w:lang w:val="en-US"/>
+        </w:rPr>
+        <w:t>veri</w:t>
+      </w:r>
+      <w:proofErr w:type="spellEnd"/>
+      <w:r>
+        <w:rPr>
+          <w:lang w:val="en-US"/>
+        </w:rPr>
+        <w:t xml:space="preserve"> tipi </w:t>
+      </w:r>
+      <w:proofErr w:type="spellStart"/>
+      <w:r>
+        <w:rPr>
+          <w:lang w:val="en-US"/>
+        </w:rPr>
+        <w:t>uyumluluğu</w:t>
+      </w:r>
+      <w:proofErr w:type="spellEnd"/>
+      <w:r>
+        <w:rPr>
+          <w:lang w:val="en-US"/>
+        </w:rPr>
+        <w:t xml:space="preserve"> (Decimal vs Float) </w:t>
+      </w:r>
+      <w:proofErr w:type="spellStart"/>
+      <w:r>
+        <w:rPr>
+          <w:lang w:val="en-US"/>
+        </w:rPr>
+        <w:t>gibi</w:t>
+      </w:r>
+      <w:proofErr w:type="spellEnd"/>
+      <w:r>
+        <w:rPr>
+          <w:lang w:val="en-US"/>
+        </w:rPr>
+        <w:t xml:space="preserve"> </w:t>
+      </w:r>
+      <w:proofErr w:type="spellStart"/>
+      <w:r>
+        <w:rPr>
+          <w:lang w:val="en-US"/>
+        </w:rPr>
+        <w:t>problemler</w:t>
+      </w:r>
+      <w:proofErr w:type="spellEnd"/>
+      <w:r>
+        <w:rPr>
+          <w:lang w:val="en-US"/>
+        </w:rPr>
+        <w:t xml:space="preserve">, AWS CloudWatch </w:t>
+      </w:r>
+      <w:proofErr w:type="spellStart"/>
+      <w:r>
+        <w:rPr>
+          <w:lang w:val="en-US"/>
+        </w:rPr>
+        <w:t>logları</w:t>
+      </w:r>
+      <w:proofErr w:type="spellEnd"/>
+      <w:r>
+        <w:rPr>
+          <w:lang w:val="en-US"/>
+        </w:rPr>
+        <w:t xml:space="preserve"> </w:t>
+      </w:r>
+      <w:proofErr w:type="spellStart"/>
+      <w:r>
+        <w:rPr>
+          <w:lang w:val="en-US"/>
+        </w:rPr>
+        <w:t>analiz</w:t>
+      </w:r>
+      <w:proofErr w:type="spellEnd"/>
+      <w:r>
+        <w:rPr>
+          <w:lang w:val="en-US"/>
+        </w:rPr>
+        <w:t xml:space="preserve"> </w:t>
+      </w:r>
+      <w:proofErr w:type="spellStart"/>
+      <w:r>
+        <w:rPr>
+          <w:lang w:val="en-US"/>
+        </w:rPr>
+        <w:t>edilerek</w:t>
+      </w:r>
+      <w:proofErr w:type="spellEnd"/>
+      <w:r>
+        <w:rPr>
+          <w:lang w:val="en-US"/>
+        </w:rPr>
+        <w:t xml:space="preserve"> </w:t>
+      </w:r>
+      <w:proofErr w:type="spellStart"/>
+      <w:r>
+        <w:rPr>
+          <w:lang w:val="en-US"/>
+        </w:rPr>
+        <w:t>çözülmüş</w:t>
+      </w:r>
+      <w:proofErr w:type="spellEnd"/>
+      <w:r>
+        <w:rPr>
+          <w:lang w:val="en-US"/>
+        </w:rPr>
+        <w:t xml:space="preserve">; </w:t>
+      </w:r>
+      <w:proofErr w:type="spellStart"/>
+      <w:r>
+        <w:rPr>
+          <w:lang w:val="en-US"/>
+        </w:rPr>
+        <w:t>bulut</w:t>
+      </w:r>
+      <w:proofErr w:type="spellEnd"/>
+      <w:r>
+        <w:rPr>
+          <w:lang w:val="en-US"/>
+        </w:rPr>
+        <w:t xml:space="preserve"> </w:t>
+      </w:r>
+      <w:proofErr w:type="spellStart"/>
+      <w:r>
+        <w:rPr>
+          <w:lang w:val="en-US"/>
+        </w:rPr>
+        <w:t>tabanlı</w:t>
+      </w:r>
+      <w:proofErr w:type="spellEnd"/>
+      <w:r>
+        <w:rPr>
+          <w:lang w:val="en-US"/>
+        </w:rPr>
+        <w:t xml:space="preserve"> </w:t>
+      </w:r>
+      <w:proofErr w:type="spellStart"/>
+      <w:r>
+        <w:rPr>
+          <w:lang w:val="en-US"/>
+        </w:rPr>
+        <w:t>sistemlerde</w:t>
+      </w:r>
+      <w:proofErr w:type="spellEnd"/>
+      <w:r>
+        <w:rPr>
+          <w:lang w:val="en-US"/>
+        </w:rPr>
+        <w:t xml:space="preserve"> debugging </w:t>
+      </w:r>
+      <w:proofErr w:type="spellStart"/>
+      <w:r>
+        <w:rPr>
+          <w:lang w:val="en-US"/>
+        </w:rPr>
+        <w:t>yeteneği</w:t>
+      </w:r>
+      <w:proofErr w:type="spellEnd"/>
+      <w:r>
+        <w:rPr>
+          <w:lang w:val="en-US"/>
+        </w:rPr>
+        <w:t xml:space="preserve"> </w:t>
+      </w:r>
+      <w:proofErr w:type="spellStart"/>
+      <w:r>
+        <w:rPr>
+          <w:lang w:val="en-US"/>
+        </w:rPr>
+        <w:t>geliştirilmiştir</w:t>
+      </w:r>
+      <w:proofErr w:type="spellEnd"/>
+      <w:r>
+        <w:rPr>
+          <w:lang w:val="en-US"/>
+        </w:rPr>
+        <w:t>.</w:t>
+      </w:r>
+    </w:p>
+    <w:p>
+      <w:pPr>
+        <w:rPr>
+          <w:lang w:val="en-US"/>
+        </w:rPr>
+      </w:pPr>
+      <w:proofErr w:type="spellStart"/>
+      <w:r>
+        <w:rPr>
+          <w:lang w:val="en-US"/>
+        </w:rPr>
+        <w:t>Özetle</w:t>
+      </w:r>
+      <w:proofErr w:type="spellEnd"/>
+      <w:r>
+        <w:rPr>
+          <w:lang w:val="en-US"/>
+        </w:rPr>
+        <w:t xml:space="preserve"> </w:t>
+      </w:r>
+      <w:proofErr w:type="spellStart"/>
+      <w:r>
+        <w:rPr>
+          <w:lang w:val="en-US"/>
+        </w:rPr>
+        <w:t>bu</w:t>
+      </w:r>
+      <w:proofErr w:type="spellEnd"/>
+      <w:r>
+        <w:rPr>
+          <w:lang w:val="en-US"/>
+        </w:rPr>
+        <w:t xml:space="preserve"> </w:t>
+      </w:r>
+      <w:proofErr w:type="spellStart"/>
+      <w:r>
+        <w:rPr>
+          <w:lang w:val="en-US"/>
+        </w:rPr>
+        <w:t>çalışma</w:t>
+      </w:r>
+      <w:proofErr w:type="spellEnd"/>
+      <w:r>
+        <w:rPr>
+          <w:lang w:val="en-US"/>
+        </w:rPr>
+        <w:t xml:space="preserve">, modern </w:t>
+      </w:r>
+      <w:proofErr w:type="spellStart"/>
+      <w:r>
+        <w:rPr>
+          <w:lang w:val="en-US"/>
+        </w:rPr>
+        <w:t>bir</w:t>
+      </w:r>
+      <w:proofErr w:type="spellEnd"/>
+      <w:r>
+        <w:rPr>
+          <w:lang w:val="en-US"/>
+        </w:rPr>
+        <w:t xml:space="preserve"> "Akıllı </w:t>
+      </w:r>
+      <w:proofErr w:type="spellStart"/>
+      <w:r>
+        <w:rPr>
+          <w:lang w:val="en-US"/>
+        </w:rPr>
+        <w:t>Şehir</w:t>
+      </w:r>
+      <w:proofErr w:type="spellEnd"/>
+      <w:r>
+        <w:rPr>
+          <w:lang w:val="en-US"/>
+        </w:rPr>
+        <w:t xml:space="preserve">" </w:t>
+      </w:r>
+      <w:proofErr w:type="spellStart"/>
+      <w:r>
+        <w:rPr>
+          <w:lang w:val="en-US"/>
+        </w:rPr>
+        <w:t>uygulamasının</w:t>
+      </w:r>
+      <w:proofErr w:type="spellEnd"/>
+      <w:r>
+        <w:rPr>
+          <w:lang w:val="en-US"/>
+        </w:rPr>
+        <w:t xml:space="preserve"> </w:t>
+      </w:r>
+      <w:proofErr w:type="spellStart"/>
+      <w:r>
+        <w:rPr>
+          <w:lang w:val="en-US"/>
+        </w:rPr>
+        <w:t>temel</w:t>
+      </w:r>
+      <w:proofErr w:type="spellEnd"/>
+      <w:r>
+        <w:rPr>
+          <w:lang w:val="en-US"/>
+        </w:rPr>
+        <w:t xml:space="preserve"> </w:t>
+      </w:r>
+      <w:proofErr w:type="spellStart"/>
+      <w:r>
+        <w:rPr>
+          <w:lang w:val="en-US"/>
+        </w:rPr>
+        <w:t>mimarisini</w:t>
+      </w:r>
+      <w:proofErr w:type="spellEnd"/>
+      <w:r>
+        <w:rPr>
+          <w:lang w:val="en-US"/>
+        </w:rPr>
+        <w:t xml:space="preserve"> </w:t>
+      </w:r>
+      <w:proofErr w:type="spellStart"/>
+      <w:r>
+        <w:rPr>
+          <w:lang w:val="en-US"/>
+        </w:rPr>
+        <w:t>simüle</w:t>
+      </w:r>
+      <w:proofErr w:type="spellEnd"/>
+      <w:r>
+        <w:rPr>
+          <w:lang w:val="en-US"/>
+        </w:rPr>
+        <w:t xml:space="preserve"> </w:t>
+      </w:r>
+      <w:proofErr w:type="spellStart"/>
+      <w:r>
+        <w:rPr>
+          <w:lang w:val="en-US"/>
+        </w:rPr>
+        <w:t>ederek</w:t>
+      </w:r>
+      <w:proofErr w:type="spellEnd"/>
+      <w:r>
+        <w:rPr>
+          <w:lang w:val="en-US"/>
+        </w:rPr>
+        <w:t xml:space="preserve">; </w:t>
+      </w:r>
+      <w:proofErr w:type="spellStart"/>
+      <w:r>
+        <w:rPr>
+          <w:lang w:val="en-US"/>
+        </w:rPr>
+        <w:t>verinin</w:t>
+      </w:r>
+      <w:proofErr w:type="spellEnd"/>
+      <w:r>
+        <w:rPr>
+          <w:lang w:val="en-US"/>
+        </w:rPr>
+        <w:t xml:space="preserve"> </w:t>
+      </w:r>
+      <w:proofErr w:type="spellStart"/>
+      <w:r>
+        <w:rPr>
+          <w:lang w:val="en-US"/>
+        </w:rPr>
+        <w:t>toplanması</w:t>
+      </w:r>
+      <w:proofErr w:type="spellEnd"/>
+      <w:r>
+        <w:rPr>
+          <w:lang w:val="en-US"/>
+        </w:rPr>
+        <w:t xml:space="preserve">, </w:t>
+      </w:r>
+      <w:proofErr w:type="spellStart"/>
+      <w:r>
+        <w:rPr>
+          <w:lang w:val="en-US"/>
+        </w:rPr>
+        <w:t>anlık</w:t>
+      </w:r>
+      <w:proofErr w:type="spellEnd"/>
+      <w:r>
+        <w:rPr>
+          <w:lang w:val="en-US"/>
+        </w:rPr>
+        <w:t xml:space="preserve"> </w:t>
+      </w:r>
+      <w:proofErr w:type="spellStart"/>
+      <w:r>
+        <w:rPr>
+          <w:lang w:val="en-US"/>
+        </w:rPr>
+        <w:t>analizi</w:t>
+      </w:r>
+      <w:proofErr w:type="spellEnd"/>
+      <w:r>
+        <w:rPr>
+          <w:lang w:val="en-US"/>
+        </w:rPr>
+        <w:t xml:space="preserve"> </w:t>
+      </w:r>
+      <w:proofErr w:type="spellStart"/>
+      <w:r>
+        <w:rPr>
+          <w:lang w:val="en-US"/>
+        </w:rPr>
+        <w:t>ve</w:t>
+      </w:r>
+      <w:proofErr w:type="spellEnd"/>
+      <w:r>
+        <w:rPr>
+          <w:lang w:val="en-US"/>
+        </w:rPr>
+        <w:t xml:space="preserve"> </w:t>
+      </w:r>
+      <w:proofErr w:type="spellStart"/>
+      <w:r>
+        <w:rPr>
+          <w:lang w:val="en-US"/>
+        </w:rPr>
+        <w:t>bulutta</w:t>
+      </w:r>
+      <w:proofErr w:type="spellEnd"/>
+      <w:r>
+        <w:rPr>
+          <w:lang w:val="en-US"/>
+        </w:rPr>
+        <w:t xml:space="preserve"> </w:t>
+      </w:r>
+      <w:proofErr w:type="spellStart"/>
+      <w:r>
+        <w:rPr>
+          <w:lang w:val="en-US"/>
+        </w:rPr>
+        <w:t>güvenli</w:t>
+      </w:r>
+      <w:proofErr w:type="spellEnd"/>
+      <w:r>
+        <w:rPr>
+          <w:lang w:val="en-US"/>
+        </w:rPr>
+        <w:t xml:space="preserve"> </w:t>
+      </w:r>
+      <w:proofErr w:type="spellStart"/>
+      <w:r>
+        <w:rPr>
+          <w:lang w:val="en-US"/>
+        </w:rPr>
+        <w:t>şekilde</w:t>
+      </w:r>
+      <w:proofErr w:type="spellEnd"/>
+      <w:r>
+        <w:rPr>
+          <w:lang w:val="en-US"/>
+        </w:rPr>
+        <w:t xml:space="preserve"> </w:t>
+      </w:r>
+      <w:proofErr w:type="spellStart"/>
+      <w:r>
+        <w:rPr>
+          <w:lang w:val="en-US"/>
+        </w:rPr>
+        <w:t>depolanması</w:t>
+      </w:r>
+      <w:proofErr w:type="spellEnd"/>
+      <w:r>
+        <w:rPr>
+          <w:lang w:val="en-US"/>
+        </w:rPr>
+        <w:t xml:space="preserve"> </w:t>
+      </w:r>
+      <w:proofErr w:type="spellStart"/>
+      <w:r>
+        <w:rPr>
+          <w:lang w:val="en-US"/>
+        </w:rPr>
+        <w:t>süreçlerini</w:t>
+      </w:r>
+      <w:proofErr w:type="spellEnd"/>
+      <w:r>
+        <w:rPr>
+          <w:lang w:val="en-US"/>
+        </w:rPr>
+        <w:t xml:space="preserve"> </w:t>
+      </w:r>
+      <w:proofErr w:type="spellStart"/>
+      <w:r>
+        <w:rPr>
+          <w:lang w:val="en-US"/>
+        </w:rPr>
+        <w:t>başarıyla</w:t>
+      </w:r>
+      <w:proofErr w:type="spellEnd"/>
+      <w:r>
+        <w:rPr>
+          <w:lang w:val="en-US"/>
+        </w:rPr>
+        <w:t xml:space="preserve"> </w:t>
+      </w:r>
+      <w:proofErr w:type="spellStart"/>
+      <w:r>
+        <w:rPr>
+          <w:lang w:val="en-US"/>
+        </w:rPr>
+        <w:t>yerine</w:t>
+      </w:r>
+      <w:proofErr w:type="spellEnd"/>
+      <w:r>
+        <w:rPr>
+          <w:lang w:val="en-US"/>
+        </w:rPr>
+        <w:t xml:space="preserve"> </w:t>
+      </w:r>
+      <w:proofErr w:type="spellStart"/>
+      <w:r>
+        <w:rPr>
+          <w:lang w:val="en-US"/>
+        </w:rPr>
+        <w:t>getirmiştir</w:t>
+      </w:r>
+      <w:proofErr w:type="spellEnd"/>
+      <w:r>
+        <w:rPr>
+          <w:lang w:val="en-US"/>
+        </w:rPr>
+        <w:t>.</w:t>
+      </w:r>
+    </w:p>
     <w:p/>
     <w:sectPr>
       <w:pgSz w:w="11906" w:h="16838"/>
@@ -8673,6 +10652,155 @@
     </w:lvl>
   </w:abstractNum>
   <w:abstractNum w:abstractNumId="1" w15:restartNumberingAfterBreak="0">
+    <w:nsid w:val="1A8A6943"/>
+    <w:multiLevelType w:val="multilevel"/>
+    <w:tmpl w:val="F424CF28"/>
+    <w:lvl w:ilvl="0">
+      <w:start w:val="1"/>
+      <w:numFmt w:val="bullet"/>
+      <w:lvlText w:val=""/>
+      <w:lvlJc w:val="left"/>
+      <w:pPr>
+        <w:tabs>
+          <w:tab w:val="num" w:pos="720"/>
+        </w:tabs>
+        <w:ind w:left="720" w:hanging="360"/>
+      </w:pPr>
+      <w:rPr>
+        <w:rFonts w:ascii="Symbol" w:hAnsi="Symbol" w:hint="default"/>
+        <w:sz w:val="20"/>
+      </w:rPr>
+    </w:lvl>
+    <w:lvl w:ilvl="1" w:tentative="1">
+      <w:start w:val="1"/>
+      <w:numFmt w:val="bullet"/>
+      <w:lvlText w:val="o"/>
+      <w:lvlJc w:val="left"/>
+      <w:pPr>
+        <w:tabs>
+          <w:tab w:val="num" w:pos="1440"/>
+        </w:tabs>
+        <w:ind w:left="1440" w:hanging="360"/>
+      </w:pPr>
+      <w:rPr>
+        <w:rFonts w:ascii="Courier New" w:hAnsi="Courier New" w:hint="default"/>
+        <w:sz w:val="20"/>
+      </w:rPr>
+    </w:lvl>
+    <w:lvl w:ilvl="2" w:tentative="1">
+      <w:start w:val="1"/>
+      <w:numFmt w:val="bullet"/>
+      <w:lvlText w:val=""/>
+      <w:lvlJc w:val="left"/>
+      <w:pPr>
+        <w:tabs>
+          <w:tab w:val="num" w:pos="2160"/>
+        </w:tabs>
+        <w:ind w:left="2160" w:hanging="360"/>
+      </w:pPr>
+      <w:rPr>
+        <w:rFonts w:ascii="Wingdings" w:hAnsi="Wingdings" w:hint="default"/>
+        <w:sz w:val="20"/>
+      </w:rPr>
+    </w:lvl>
+    <w:lvl w:ilvl="3" w:tentative="1">
+      <w:start w:val="1"/>
+      <w:numFmt w:val="bullet"/>
+      <w:lvlText w:val=""/>
+      <w:lvlJc w:val="left"/>
+      <w:pPr>
+        <w:tabs>
+          <w:tab w:val="num" w:pos="2880"/>
+        </w:tabs>
+        <w:ind w:left="2880" w:hanging="360"/>
+      </w:pPr>
+      <w:rPr>
+        <w:rFonts w:ascii="Wingdings" w:hAnsi="Wingdings" w:hint="default"/>
+        <w:sz w:val="20"/>
+      </w:rPr>
+    </w:lvl>
+    <w:lvl w:ilvl="4" w:tentative="1">
+      <w:start w:val="1"/>
+      <w:numFmt w:val="bullet"/>
+      <w:lvlText w:val=""/>
+      <w:lvlJc w:val="left"/>
+      <w:pPr>
+        <w:tabs>
+          <w:tab w:val="num" w:pos="3600"/>
+        </w:tabs>
+        <w:ind w:left="3600" w:hanging="360"/>
+      </w:pPr>
+      <w:rPr>
+        <w:rFonts w:ascii="Wingdings" w:hAnsi="Wingdings" w:hint="default"/>
+        <w:sz w:val="20"/>
+      </w:rPr>
+    </w:lvl>
+    <w:lvl w:ilvl="5" w:tentative="1">
+      <w:start w:val="1"/>
+      <w:numFmt w:val="bullet"/>
+      <w:lvlText w:val=""/>
+      <w:lvlJc w:val="left"/>
+      <w:pPr>
+        <w:tabs>
+          <w:tab w:val="num" w:pos="4320"/>
+        </w:tabs>
+        <w:ind w:left="4320" w:hanging="360"/>
+      </w:pPr>
+      <w:rPr>
+        <w:rFonts w:ascii="Wingdings" w:hAnsi="Wingdings" w:hint="default"/>
+        <w:sz w:val="20"/>
+      </w:rPr>
+    </w:lvl>
+    <w:lvl w:ilvl="6" w:tentative="1">
+      <w:start w:val="1"/>
+      <w:numFmt w:val="bullet"/>
+      <w:lvlText w:val=""/>
+      <w:lvlJc w:val="left"/>
+      <w:pPr>
+        <w:tabs>
+          <w:tab w:val="num" w:pos="5040"/>
+        </w:tabs>
+        <w:ind w:left="5040" w:hanging="360"/>
+      </w:pPr>
+      <w:rPr>
+        <w:rFonts w:ascii="Wingdings" w:hAnsi="Wingdings" w:hint="default"/>
+        <w:sz w:val="20"/>
+      </w:rPr>
+    </w:lvl>
+    <w:lvl w:ilvl="7" w:tentative="1">
+      <w:start w:val="1"/>
+      <w:numFmt w:val="bullet"/>
+      <w:lvlText w:val=""/>
+      <w:lvlJc w:val="left"/>
+      <w:pPr>
+        <w:tabs>
+          <w:tab w:val="num" w:pos="5760"/>
+        </w:tabs>
+        <w:ind w:left="5760" w:hanging="360"/>
+      </w:pPr>
+      <w:rPr>
+        <w:rFonts w:ascii="Wingdings" w:hAnsi="Wingdings" w:hint="default"/>
+        <w:sz w:val="20"/>
+      </w:rPr>
+    </w:lvl>
+    <w:lvl w:ilvl="8" w:tentative="1">
+      <w:start w:val="1"/>
+      <w:numFmt w:val="bullet"/>
+      <w:lvlText w:val=""/>
+      <w:lvlJc w:val="left"/>
+      <w:pPr>
+        <w:tabs>
+          <w:tab w:val="num" w:pos="6480"/>
+        </w:tabs>
+        <w:ind w:left="6480" w:hanging="360"/>
+      </w:pPr>
+      <w:rPr>
+        <w:rFonts w:ascii="Wingdings" w:hAnsi="Wingdings" w:hint="default"/>
+        <w:sz w:val="20"/>
+      </w:rPr>
+    </w:lvl>
+  </w:abstractNum>
+  <w:abstractNum w:abstractNumId="2" w15:restartNumberingAfterBreak="0">
     <w:nsid w:val="1D545E45"/>
     <w:multiLevelType w:val="multilevel"/>
     <w:tmpl w:val="A8ECE2D8"/>
@@ -8821,7 +10949,7 @@
       </w:rPr>
     </w:lvl>
   </w:abstractNum>
-  <w:abstractNum w:abstractNumId="2" w15:restartNumberingAfterBreak="0">
+  <w:abstractNum w:abstractNumId="3" w15:restartNumberingAfterBreak="0">
     <w:nsid w:val="46FE52E8"/>
     <w:multiLevelType w:val="multilevel"/>
     <w:tmpl w:val="C04486B8"/>
@@ -8970,7 +11098,7 @@
       </w:rPr>
     </w:lvl>
   </w:abstractNum>
-  <w:abstractNum w:abstractNumId="3" w15:restartNumberingAfterBreak="0">
+  <w:abstractNum w:abstractNumId="4" w15:restartNumberingAfterBreak="0">
     <w:nsid w:val="47902DFC"/>
     <w:multiLevelType w:val="multilevel"/>
     <w:tmpl w:val="D6C84CFE"/>
@@ -9119,7 +11247,7 @@
       </w:rPr>
     </w:lvl>
   </w:abstractNum>
-  <w:abstractNum w:abstractNumId="4" w15:restartNumberingAfterBreak="0">
+  <w:abstractNum w:abstractNumId="5" w15:restartNumberingAfterBreak="0">
     <w:nsid w:val="4A9F0AF8"/>
     <w:multiLevelType w:val="multilevel"/>
     <w:tmpl w:val="04A0C2B2"/>
@@ -9232,7 +11360,7 @@
       </w:pPr>
     </w:lvl>
   </w:abstractNum>
-  <w:abstractNum w:abstractNumId="5" w15:restartNumberingAfterBreak="0">
+  <w:abstractNum w:abstractNumId="6" w15:restartNumberingAfterBreak="0">
     <w:nsid w:val="55043113"/>
     <w:multiLevelType w:val="multilevel"/>
     <w:tmpl w:val="E7E25EA0"/>
@@ -9381,7 +11509,7 @@
       </w:rPr>
     </w:lvl>
   </w:abstractNum>
-  <w:abstractNum w:abstractNumId="6" w15:restartNumberingAfterBreak="0">
+  <w:abstractNum w:abstractNumId="7" w15:restartNumberingAfterBreak="0">
     <w:nsid w:val="6FD346D4"/>
     <w:multiLevelType w:val="multilevel"/>
     <w:tmpl w:val="D22A3B84"/>
@@ -9530,7 +11658,7 @@
       </w:rPr>
     </w:lvl>
   </w:abstractNum>
-  <w:abstractNum w:abstractNumId="7" w15:restartNumberingAfterBreak="0">
+  <w:abstractNum w:abstractNumId="8" w15:restartNumberingAfterBreak="0">
     <w:nsid w:val="73C116A6"/>
     <w:multiLevelType w:val="multilevel"/>
     <w:tmpl w:val="23DCF378"/>
@@ -9680,28 +11808,31 @@
     </w:lvl>
   </w:abstractNum>
   <w:num w:numId="1" w16cid:durableId="1700429761">
+    <w:abstractNumId w:val="3"/>
+  </w:num>
+  <w:num w:numId="2" w16cid:durableId="1157303928">
+    <w:abstractNumId w:val="6"/>
+  </w:num>
+  <w:num w:numId="3" w16cid:durableId="1666203159">
+    <w:abstractNumId w:val="5"/>
+  </w:num>
+  <w:num w:numId="4" w16cid:durableId="1626691101">
+    <w:abstractNumId w:val="7"/>
+  </w:num>
+  <w:num w:numId="5" w16cid:durableId="340011408">
     <w:abstractNumId w:val="2"/>
   </w:num>
-  <w:num w:numId="2" w16cid:durableId="1157303928">
-    <w:abstractNumId w:val="5"/>
-  </w:num>
-  <w:num w:numId="3" w16cid:durableId="1666203159">
+  <w:num w:numId="6" w16cid:durableId="460075601">
     <w:abstractNumId w:val="4"/>
   </w:num>
-  <w:num w:numId="4" w16cid:durableId="1626691101">
-    <w:abstractNumId w:val="6"/>
-  </w:num>
-  <w:num w:numId="5" w16cid:durableId="340011408">
-    <w:abstractNumId w:val="1"/>
-  </w:num>
-  <w:num w:numId="6" w16cid:durableId="460075601">
-    <w:abstractNumId w:val="3"/>
-  </w:num>
   <w:num w:numId="7" w16cid:durableId="24214223">
-    <w:abstractNumId w:val="7"/>
+    <w:abstractNumId w:val="8"/>
   </w:num>
   <w:num w:numId="8" w16cid:durableId="1204321318">
     <w:abstractNumId w:val="0"/>
+  </w:num>
+  <w:num w:numId="9" w16cid:durableId="1995598837">
+    <w:abstractNumId w:val="1"/>
   </w:num>
 </w:numbering>
 </file>

</xml_diff>